<commit_message>
Match the form to the existing 'Become a Partner' report in Mwan Events
- Form asks for first and last name separately and sends fields named like the
  report columns: first_name, last_name, email, company_name, mobile_number,
  designation, plus organisation_type, interests, activity, website, message
- Temporary Cloudflare worker accepts the new names
- API document (Word/PDF/Markdown) rewritten around feeding that report, with
  the extra columns it needs

Co-Authored-By: Claude Opus 5.5 <noreply@anthropic.com>
Claude-Session: https://claude.ai/code/session_01JKzPv4mpS97vuJFLXRBcgv
</commit_message>
<xml_diff>
--- a/docs/ActivateMe-Partner-Form-API.docx
+++ b/docs/ActivateMe-Partner-Form-API.docx
@@ -19,6 +19,42 @@
           <w:color w:val="5D5866"/>
         </w:rPr>
         <w:t xml:space="preserve">What the form sends, what to check, and what to reply. Prepared by Aseel (Marketing).</w:t>
+      </w:r>
+    </w:p>
+    <w:p>
+      <w:pPr>
+        <w:shd w:fill="FFF4EC" w:color="auto" w:val="clear"/>
+        <w:spacing w:after="160"/>
+      </w:pPr>
+      <w:r>
+        <w:rPr>
+          <w:b/>
+          <w:bCs/>
+        </w:rPr>
+        <w:t xml:space="preserve">Good news:</w:t>
+      </w:r>
+      <w:r>
+        <w:t xml:space="preserve"> Reporting → </w:t>
+      </w:r>
+      <w:r>
+        <w:rPr>
+          <w:b/>
+          <w:bCs/>
+        </w:rPr>
+        <w:t xml:space="preserve">Become a Partner</w:t>
+      </w:r>
+      <w:r>
+        <w:t xml:space="preserve"> already has First Name, Last Name, Email, Company Name, Mobile Number, Designation and Created date. The form now uses the same fields, so it could feed that report directly. It just needs a few </w:t>
+      </w:r>
+      <w:r>
+        <w:rPr>
+          <w:b/>
+          <w:bCs/>
+        </w:rPr>
+        <w:t xml:space="preserve">new columns</w:t>
+      </w:r>
+      <w:r>
+        <w:t xml:space="preserve"> for the extra questions (marked below).</w:t>
       </w:r>
     </w:p>
     <w:p>
@@ -58,8 +94,8 @@
       <w:r>
         <w:rPr>
           <w:rFonts w:ascii="Consolas" w:cs="Consolas" w:eastAsia="Consolas" w:hAnsi="Consolas"/>
-          <w:sz w:val="19"/>
-          <w:szCs w:val="19"/>
+          <w:sz w:val="18"/>
+          <w:szCs w:val="18"/>
         </w:rPr>
         <w:t xml:space="preserve">POST</w:t>
       </w:r>
@@ -69,8 +105,8 @@
       <w:r>
         <w:rPr>
           <w:rFonts w:ascii="Consolas" w:cs="Consolas" w:eastAsia="Consolas" w:hAnsi="Consolas"/>
-          <w:sz w:val="19"/>
-          <w:szCs w:val="19"/>
+          <w:sz w:val="18"/>
+          <w:szCs w:val="18"/>
         </w:rPr>
         <w:t xml:space="preserve">Content-Type: application/json</w:t>
       </w:r>
@@ -88,13 +124,23 @@
         <w:spacing w:after="60"/>
       </w:pPr>
       <w:r>
-        <w:t xml:space="preserve">Your API checks it, saves it under ActivateMe® Fest, and replies </w:t>
-      </w:r>
-      <w:r>
-        <w:rPr>
-          <w:rFonts w:ascii="Consolas" w:cs="Consolas" w:eastAsia="Consolas" w:hAnsi="Consolas"/>
-          <w:sz w:val="19"/>
-          <w:szCs w:val="19"/>
+        <w:t xml:space="preserve">Your API checks it, saves it in the </w:t>
+      </w:r>
+      <w:r>
+        <w:rPr>
+          <w:b/>
+          <w:bCs/>
+        </w:rPr>
+        <w:t xml:space="preserve">Become a Partner</w:t>
+      </w:r>
+      <w:r>
+        <w:t xml:space="preserve"> report for ActivateMe® Fest, and replies </w:t>
+      </w:r>
+      <w:r>
+        <w:rPr>
+          <w:rFonts w:ascii="Consolas" w:cs="Consolas" w:eastAsia="Consolas" w:hAnsi="Consolas"/>
+          <w:sz w:val="18"/>
+          <w:szCs w:val="18"/>
         </w:rPr>
         <w:t xml:space="preserve">ok</w:t>
       </w:r>
@@ -104,8 +150,8 @@
       <w:r>
         <w:rPr>
           <w:rFonts w:ascii="Consolas" w:cs="Consolas" w:eastAsia="Consolas" w:hAnsi="Consolas"/>
-          <w:sz w:val="19"/>
-          <w:szCs w:val="19"/>
+          <w:sz w:val="18"/>
+          <w:szCs w:val="18"/>
         </w:rPr>
         <w:t xml:space="preserve">not ok + message</w:t>
       </w:r>
@@ -118,13 +164,13 @@
         <w:spacing w:after="100"/>
       </w:pPr>
       <w:r>
-        <w:t xml:space="preserve">The endpoint address is up to you, e.g. </w:t>
-      </w:r>
-      <w:r>
-        <w:rPr>
-          <w:rFonts w:ascii="Consolas" w:cs="Consolas" w:eastAsia="Consolas" w:hAnsi="Consolas"/>
-          <w:sz w:val="19"/>
-          <w:szCs w:val="19"/>
+        <w:t xml:space="preserve">If an API already feeds the Become a Partner report, the form can use that one. Otherwise the address is up to you, e.g. </w:t>
+      </w:r>
+      <w:r>
+        <w:rPr>
+          <w:rFonts w:ascii="Consolas" w:cs="Consolas" w:eastAsia="Consolas" w:hAnsi="Consolas"/>
+          <w:sz w:val="18"/>
+          <w:szCs w:val="18"/>
         </w:rPr>
         <w:t xml:space="preserve">https://events.mwancloud.com/api/partner-applications</w:t>
       </w:r>
@@ -151,8 +197,8 @@
       <w:r>
         <w:rPr>
           <w:rFonts w:ascii="Consolas" w:cs="Consolas" w:eastAsia="Consolas" w:hAnsi="Consolas"/>
-          <w:sz w:val="19"/>
-          <w:szCs w:val="19"/>
+          <w:sz w:val="18"/>
+          <w:szCs w:val="18"/>
         </w:rPr>
         <w:t xml:space="preserve">Origin</w:t>
       </w:r>
@@ -172,8 +218,8 @@
       <w:r>
         <w:rPr>
           <w:rFonts w:ascii="Consolas" w:cs="Consolas" w:eastAsia="Consolas" w:hAnsi="Consolas"/>
-          <w:sz w:val="19"/>
-          <w:szCs w:val="19"/>
+          <w:sz w:val="18"/>
+          <w:szCs w:val="18"/>
         </w:rPr>
         <w:t xml:space="preserve">https://www.activatemefest.com</w:t>
       </w:r>
@@ -190,8 +236,8 @@
       <w:r>
         <w:rPr>
           <w:rFonts w:ascii="Consolas" w:cs="Consolas" w:eastAsia="Consolas" w:hAnsi="Consolas"/>
-          <w:sz w:val="19"/>
-          <w:szCs w:val="19"/>
+          <w:sz w:val="18"/>
+          <w:szCs w:val="18"/>
         </w:rPr>
         <w:t xml:space="preserve">https://activatemefest.com</w:t>
       </w:r>
@@ -208,8 +254,8 @@
       <w:r>
         <w:rPr>
           <w:rFonts w:ascii="Consolas" w:cs="Consolas" w:eastAsia="Consolas" w:hAnsi="Consolas"/>
-          <w:sz w:val="19"/>
-          <w:szCs w:val="19"/>
+          <w:sz w:val="18"/>
+          <w:szCs w:val="18"/>
         </w:rPr>
         <w:t xml:space="preserve">https://activateme.dev.mwancloud.com</w:t>
       </w:r>
@@ -227,8 +273,8 @@
       <w:r>
         <w:rPr>
           <w:rFonts w:ascii="Consolas" w:cs="Consolas" w:eastAsia="Consolas" w:hAnsi="Consolas"/>
-          <w:sz w:val="19"/>
-          <w:szCs w:val="19"/>
+          <w:sz w:val="18"/>
+          <w:szCs w:val="18"/>
         </w:rPr>
         <w:t xml:space="preserve">403</w:t>
       </w:r>
@@ -238,8 +284,8 @@
       <w:r>
         <w:rPr>
           <w:rFonts w:ascii="Consolas" w:cs="Consolas" w:eastAsia="Consolas" w:hAnsi="Consolas"/>
-          <w:sz w:val="19"/>
-          <w:szCs w:val="19"/>
+          <w:sz w:val="18"/>
+          <w:szCs w:val="18"/>
         </w:rPr>
         <w:t xml:space="preserve">OPTIONS</w:t>
       </w:r>
@@ -249,8 +295,8 @@
       <w:r>
         <w:rPr>
           <w:rFonts w:ascii="Consolas" w:cs="Consolas" w:eastAsia="Consolas" w:hAnsi="Consolas"/>
-          <w:sz w:val="19"/>
-          <w:szCs w:val="19"/>
+          <w:sz w:val="18"/>
+          <w:szCs w:val="18"/>
         </w:rPr>
         <w:t xml:space="preserve">Access-Control-Allow-Origin: &lt;origin&gt;</w:t>
       </w:r>
@@ -260,8 +306,8 @@
       <w:r>
         <w:rPr>
           <w:rFonts w:ascii="Consolas" w:cs="Consolas" w:eastAsia="Consolas" w:hAnsi="Consolas"/>
-          <w:sz w:val="19"/>
-          <w:szCs w:val="19"/>
+          <w:sz w:val="18"/>
+          <w:szCs w:val="18"/>
         </w:rPr>
         <w:t xml:space="preserve">Access-Control-Allow-Methods: POST, OPTIONS</w:t>
       </w:r>
@@ -271,8 +317,8 @@
       <w:r>
         <w:rPr>
           <w:rFonts w:ascii="Consolas" w:cs="Consolas" w:eastAsia="Consolas" w:hAnsi="Consolas"/>
-          <w:sz w:val="19"/>
-          <w:szCs w:val="19"/>
+          <w:sz w:val="18"/>
+          <w:szCs w:val="18"/>
         </w:rPr>
         <w:t xml:space="preserve">Access-Control-Allow-Headers: Content-Type</w:t>
       </w:r>
@@ -282,8 +328,8 @@
       <w:r>
         <w:rPr>
           <w:rFonts w:ascii="Consolas" w:cs="Consolas" w:eastAsia="Consolas" w:hAnsi="Consolas"/>
-          <w:sz w:val="19"/>
-          <w:szCs w:val="19"/>
+          <w:sz w:val="18"/>
+          <w:szCs w:val="18"/>
         </w:rPr>
         <w:t xml:space="preserve">Access-Control-Allow-Origin</w:t>
       </w:r>
@@ -293,8 +339,8 @@
       <w:r>
         <w:rPr>
           <w:rFonts w:ascii="Consolas" w:cs="Consolas" w:eastAsia="Consolas" w:hAnsi="Consolas"/>
-          <w:sz w:val="19"/>
-          <w:szCs w:val="19"/>
+          <w:sz w:val="18"/>
+          <w:szCs w:val="18"/>
         </w:rPr>
         <w:t xml:space="preserve">POST</w:t>
       </w:r>
@@ -332,10 +378,10 @@
         </w:tblBorders>
       </w:tblPr>
       <w:tblGrid>
-        <w:gridCol w:w="1450"/>
+        <w:gridCol w:w="2350"/>
         <w:gridCol w:w="1050"/>
-        <w:gridCol w:w="4038"/>
-        <w:gridCol w:w="3100"/>
+        <w:gridCol w:w="3838"/>
+        <w:gridCol w:w="2400"/>
       </w:tblGrid>
       <w:tr>
         <w:trPr>
@@ -343,7 +389,7 @@
         </w:trPr>
         <w:tc>
           <w:tcPr>
-            <w:tcW w:type="dxa" w:w="1450"/>
+            <w:tcW w:type="dxa" w:w="2350"/>
             <w:tcBorders>
               <w:top w:val="single" w:color="DCD7E3" w:sz="4"/>
               <w:left w:val="single" w:color="DCD7E3" w:sz="4"/>
@@ -352,10 +398,10 @@
             </w:tcBorders>
             <w:shd w:fill="6F2FA0" w:color="auto" w:val="clear"/>
             <w:tcMar>
-              <w:top w:type="dxa" w:w="60"/>
-              <w:left w:type="dxa" w:w="100"/>
-              <w:bottom w:type="dxa" w:w="60"/>
-              <w:right w:type="dxa" w:w="100"/>
+              <w:top w:type="dxa" w:w="35"/>
+              <w:left w:type="dxa" w:w="90"/>
+              <w:bottom w:type="dxa" w:w="35"/>
+              <w:right w:type="dxa" w:w="90"/>
             </w:tcMar>
           </w:tcPr>
           <w:p>
@@ -382,10 +428,10 @@
             </w:tcBorders>
             <w:shd w:fill="6F2FA0" w:color="auto" w:val="clear"/>
             <w:tcMar>
-              <w:top w:type="dxa" w:w="60"/>
-              <w:left w:type="dxa" w:w="100"/>
-              <w:bottom w:type="dxa" w:w="60"/>
-              <w:right w:type="dxa" w:w="100"/>
+              <w:top w:type="dxa" w:w="35"/>
+              <w:left w:type="dxa" w:w="90"/>
+              <w:bottom w:type="dxa" w:w="35"/>
+              <w:right w:type="dxa" w:w="90"/>
             </w:tcMar>
           </w:tcPr>
           <w:p>
@@ -403,7 +449,7 @@
         </w:tc>
         <w:tc>
           <w:tcPr>
-            <w:tcW w:type="dxa" w:w="4038"/>
+            <w:tcW w:type="dxa" w:w="3838"/>
             <w:tcBorders>
               <w:top w:val="single" w:color="DCD7E3" w:sz="4"/>
               <w:left w:val="single" w:color="DCD7E3" w:sz="4"/>
@@ -412,10 +458,10 @@
             </w:tcBorders>
             <w:shd w:fill="6F2FA0" w:color="auto" w:val="clear"/>
             <w:tcMar>
-              <w:top w:type="dxa" w:w="60"/>
-              <w:left w:type="dxa" w:w="100"/>
-              <w:bottom w:type="dxa" w:w="60"/>
-              <w:right w:type="dxa" w:w="100"/>
+              <w:top w:type="dxa" w:w="35"/>
+              <w:left w:type="dxa" w:w="90"/>
+              <w:bottom w:type="dxa" w:w="35"/>
+              <w:right w:type="dxa" w:w="90"/>
             </w:tcMar>
           </w:tcPr>
           <w:p>
@@ -433,7 +479,7 @@
         </w:tc>
         <w:tc>
           <w:tcPr>
-            <w:tcW w:type="dxa" w:w="3100"/>
+            <w:tcW w:type="dxa" w:w="2400"/>
             <w:tcBorders>
               <w:top w:val="single" w:color="DCD7E3" w:sz="4"/>
               <w:left w:val="single" w:color="DCD7E3" w:sz="4"/>
@@ -442,10 +488,10 @@
             </w:tcBorders>
             <w:shd w:fill="6F2FA0" w:color="auto" w:val="clear"/>
             <w:tcMar>
-              <w:top w:type="dxa" w:w="60"/>
-              <w:left w:type="dxa" w:w="100"/>
-              <w:bottom w:type="dxa" w:w="60"/>
-              <w:right w:type="dxa" w:w="100"/>
+              <w:top w:type="dxa" w:w="35"/>
+              <w:left w:type="dxa" w:w="90"/>
+              <w:bottom w:type="dxa" w:w="35"/>
+              <w:right w:type="dxa" w:w="90"/>
             </w:tcMar>
           </w:tcPr>
           <w:p>
@@ -457,7 +503,7 @@
                 <w:sz w:val="19"/>
                 <w:szCs w:val="19"/>
               </w:rPr>
-              <w:t xml:space="preserve">Example</w:t>
+              <w:t xml:space="preserve">Report column</w:t>
             </w:r>
           </w:p>
         </w:tc>
@@ -465,26 +511,26 @@
       <w:tr>
         <w:tc>
           <w:tcPr>
-            <w:tcW w:type="dxa" w:w="1450"/>
-            <w:tcBorders>
-              <w:top w:val="single" w:color="DCD7E3" w:sz="4"/>
-              <w:left w:val="single" w:color="DCD7E3" w:sz="4"/>
-              <w:bottom w:val="single" w:color="DCD7E3" w:sz="4"/>
-              <w:right w:val="single" w:color="DCD7E3" w:sz="4"/>
-            </w:tcBorders>
-            <w:tcMar>
-              <w:top w:type="dxa" w:w="60"/>
-              <w:left w:type="dxa" w:w="100"/>
-              <w:bottom w:type="dxa" w:w="60"/>
-              <w:right w:type="dxa" w:w="100"/>
+            <w:tcW w:type="dxa" w:w="2350"/>
+            <w:tcBorders>
+              <w:top w:val="single" w:color="DCD7E3" w:sz="4"/>
+              <w:left w:val="single" w:color="DCD7E3" w:sz="4"/>
+              <w:bottom w:val="single" w:color="DCD7E3" w:sz="4"/>
+              <w:right w:val="single" w:color="DCD7E3" w:sz="4"/>
+            </w:tcBorders>
+            <w:tcMar>
+              <w:top w:type="dxa" w:w="35"/>
+              <w:left w:type="dxa" w:w="90"/>
+              <w:bottom w:type="dxa" w:w="35"/>
+              <w:right w:type="dxa" w:w="90"/>
             </w:tcMar>
           </w:tcPr>
           <w:p>
             <w:r>
               <w:rPr>
                 <w:rFonts w:ascii="Consolas" w:cs="Consolas" w:eastAsia="Consolas" w:hAnsi="Consolas"/>
-                <w:sz w:val="19"/>
-                <w:szCs w:val="19"/>
+                <w:sz w:val="18"/>
+                <w:szCs w:val="18"/>
               </w:rPr>
               <w:t xml:space="preserve">event</w:t>
             </w:r>
@@ -500,10 +546,10 @@
               <w:right w:val="single" w:color="DCD7E3" w:sz="4"/>
             </w:tcBorders>
             <w:tcMar>
-              <w:top w:type="dxa" w:w="60"/>
-              <w:left w:type="dxa" w:w="100"/>
-              <w:bottom w:type="dxa" w:w="60"/>
-              <w:right w:type="dxa" w:w="100"/>
+              <w:top w:type="dxa" w:w="35"/>
+              <w:left w:type="dxa" w:w="90"/>
+              <w:bottom w:type="dxa" w:w="35"/>
+              <w:right w:type="dxa" w:w="90"/>
             </w:tcMar>
           </w:tcPr>
           <w:p>
@@ -514,18 +560,18 @@
         </w:tc>
         <w:tc>
           <w:tcPr>
-            <w:tcW w:type="dxa" w:w="4038"/>
-            <w:tcBorders>
-              <w:top w:val="single" w:color="DCD7E3" w:sz="4"/>
-              <w:left w:val="single" w:color="DCD7E3" w:sz="4"/>
-              <w:bottom w:val="single" w:color="DCD7E3" w:sz="4"/>
-              <w:right w:val="single" w:color="DCD7E3" w:sz="4"/>
-            </w:tcBorders>
-            <w:tcMar>
-              <w:top w:type="dxa" w:w="60"/>
-              <w:left w:type="dxa" w:w="100"/>
-              <w:bottom w:type="dxa" w:w="60"/>
-              <w:right w:type="dxa" w:w="100"/>
+            <w:tcW w:type="dxa" w:w="3838"/>
+            <w:tcBorders>
+              <w:top w:val="single" w:color="DCD7E3" w:sz="4"/>
+              <w:left w:val="single" w:color="DCD7E3" w:sz="4"/>
+              <w:bottom w:val="single" w:color="DCD7E3" w:sz="4"/>
+              <w:right w:val="single" w:color="DCD7E3" w:sz="4"/>
+            </w:tcBorders>
+            <w:tcMar>
+              <w:top w:type="dxa" w:w="35"/>
+              <w:left w:type="dxa" w:w="90"/>
+              <w:bottom w:type="dxa" w:w="35"/>
+              <w:right w:type="dxa" w:w="90"/>
             </w:tcMar>
           </w:tcPr>
           <w:p>
@@ -535,8 +581,8 @@
             <w:r>
               <w:rPr>
                 <w:rFonts w:ascii="Consolas" w:cs="Consolas" w:eastAsia="Consolas" w:hAnsi="Consolas"/>
-                <w:sz w:val="19"/>
-                <w:szCs w:val="19"/>
+                <w:sz w:val="18"/>
+                <w:szCs w:val="18"/>
               </w:rPr>
               <w:t xml:space="preserve">activate-me-festival</w:t>
             </w:r>
@@ -547,23 +593,23 @@
         </w:tc>
         <w:tc>
           <w:tcPr>
-            <w:tcW w:type="dxa" w:w="3100"/>
-            <w:tcBorders>
-              <w:top w:val="single" w:color="DCD7E3" w:sz="4"/>
-              <w:left w:val="single" w:color="DCD7E3" w:sz="4"/>
-              <w:bottom w:val="single" w:color="DCD7E3" w:sz="4"/>
-              <w:right w:val="single" w:color="DCD7E3" w:sz="4"/>
-            </w:tcBorders>
-            <w:tcMar>
-              <w:top w:type="dxa" w:w="60"/>
-              <w:left w:type="dxa" w:w="100"/>
-              <w:bottom w:type="dxa" w:w="60"/>
-              <w:right w:type="dxa" w:w="100"/>
-            </w:tcMar>
-          </w:tcPr>
-          <w:p>
-            <w:r>
-              <w:t xml:space="preserve">activate-me-festival</w:t>
+            <w:tcW w:type="dxa" w:w="2400"/>
+            <w:tcBorders>
+              <w:top w:val="single" w:color="DCD7E3" w:sz="4"/>
+              <w:left w:val="single" w:color="DCD7E3" w:sz="4"/>
+              <w:bottom w:val="single" w:color="DCD7E3" w:sz="4"/>
+              <w:right w:val="single" w:color="DCD7E3" w:sz="4"/>
+            </w:tcBorders>
+            <w:tcMar>
+              <w:top w:type="dxa" w:w="35"/>
+              <w:left w:type="dxa" w:w="90"/>
+              <w:bottom w:type="dxa" w:w="35"/>
+              <w:right w:type="dxa" w:w="90"/>
+            </w:tcMar>
+          </w:tcPr>
+          <w:p>
+            <w:r>
+              <w:t xml:space="preserve">(which event)</w:t>
             </w:r>
           </w:p>
         </w:tc>
@@ -571,28 +617,28 @@
       <w:tr>
         <w:tc>
           <w:tcPr>
-            <w:tcW w:type="dxa" w:w="1450"/>
-            <w:tcBorders>
-              <w:top w:val="single" w:color="DCD7E3" w:sz="4"/>
-              <w:left w:val="single" w:color="DCD7E3" w:sz="4"/>
-              <w:bottom w:val="single" w:color="DCD7E3" w:sz="4"/>
-              <w:right w:val="single" w:color="DCD7E3" w:sz="4"/>
-            </w:tcBorders>
-            <w:tcMar>
-              <w:top w:type="dxa" w:w="60"/>
-              <w:left w:type="dxa" w:w="100"/>
-              <w:bottom w:type="dxa" w:w="60"/>
-              <w:right w:type="dxa" w:w="100"/>
+            <w:tcW w:type="dxa" w:w="2350"/>
+            <w:tcBorders>
+              <w:top w:val="single" w:color="DCD7E3" w:sz="4"/>
+              <w:left w:val="single" w:color="DCD7E3" w:sz="4"/>
+              <w:bottom w:val="single" w:color="DCD7E3" w:sz="4"/>
+              <w:right w:val="single" w:color="DCD7E3" w:sz="4"/>
+            </w:tcBorders>
+            <w:tcMar>
+              <w:top w:type="dxa" w:w="35"/>
+              <w:left w:type="dxa" w:w="90"/>
+              <w:bottom w:type="dxa" w:w="35"/>
+              <w:right w:type="dxa" w:w="90"/>
             </w:tcMar>
           </w:tcPr>
           <w:p>
             <w:r>
               <w:rPr>
                 <w:rFonts w:ascii="Consolas" w:cs="Consolas" w:eastAsia="Consolas" w:hAnsi="Consolas"/>
-                <w:sz w:val="19"/>
-                <w:szCs w:val="19"/>
+                <w:sz w:val="18"/>
+                <w:szCs w:val="18"/>
               </w:rPr>
-              <w:t xml:space="preserve">org</w:t>
+              <w:t xml:space="preserve">first_name</w:t>
             </w:r>
           </w:p>
         </w:tc>
@@ -606,10 +652,10 @@
               <w:right w:val="single" w:color="DCD7E3" w:sz="4"/>
             </w:tcBorders>
             <w:tcMar>
-              <w:top w:type="dxa" w:w="60"/>
-              <w:left w:type="dxa" w:w="100"/>
-              <w:bottom w:type="dxa" w:w="60"/>
-              <w:right w:type="dxa" w:w="100"/>
+              <w:top w:type="dxa" w:w="35"/>
+              <w:left w:type="dxa" w:w="90"/>
+              <w:bottom w:type="dxa" w:w="35"/>
+              <w:right w:type="dxa" w:w="90"/>
             </w:tcMar>
           </w:tcPr>
           <w:p>
@@ -620,45 +666,45 @@
         </w:tc>
         <w:tc>
           <w:tcPr>
-            <w:tcW w:type="dxa" w:w="4038"/>
-            <w:tcBorders>
-              <w:top w:val="single" w:color="DCD7E3" w:sz="4"/>
-              <w:left w:val="single" w:color="DCD7E3" w:sz="4"/>
-              <w:bottom w:val="single" w:color="DCD7E3" w:sz="4"/>
-              <w:right w:val="single" w:color="DCD7E3" w:sz="4"/>
-            </w:tcBorders>
-            <w:tcMar>
-              <w:top w:type="dxa" w:w="60"/>
-              <w:left w:type="dxa" w:w="100"/>
-              <w:bottom w:type="dxa" w:w="60"/>
-              <w:right w:type="dxa" w:w="100"/>
-            </w:tcMar>
-          </w:tcPr>
-          <w:p>
-            <w:r>
-              <w:t xml:space="preserve">Organisation name, up to 150 characters</w:t>
-            </w:r>
-          </w:p>
-        </w:tc>
-        <w:tc>
-          <w:tcPr>
-            <w:tcW w:type="dxa" w:w="3100"/>
-            <w:tcBorders>
-              <w:top w:val="single" w:color="DCD7E3" w:sz="4"/>
-              <w:left w:val="single" w:color="DCD7E3" w:sz="4"/>
-              <w:bottom w:val="single" w:color="DCD7E3" w:sz="4"/>
-              <w:right w:val="single" w:color="DCD7E3" w:sz="4"/>
-            </w:tcBorders>
-            <w:tcMar>
-              <w:top w:type="dxa" w:w="60"/>
-              <w:left w:type="dxa" w:w="100"/>
-              <w:bottom w:type="dxa" w:w="60"/>
-              <w:right w:type="dxa" w:w="100"/>
-            </w:tcMar>
-          </w:tcPr>
-          <w:p>
-            <w:r>
-              <w:t xml:space="preserve">Little Kickers Dubai</w:t>
+            <w:tcW w:type="dxa" w:w="3838"/>
+            <w:tcBorders>
+              <w:top w:val="single" w:color="DCD7E3" w:sz="4"/>
+              <w:left w:val="single" w:color="DCD7E3" w:sz="4"/>
+              <w:bottom w:val="single" w:color="DCD7E3" w:sz="4"/>
+              <w:right w:val="single" w:color="DCD7E3" w:sz="4"/>
+            </w:tcBorders>
+            <w:tcMar>
+              <w:top w:type="dxa" w:w="35"/>
+              <w:left w:type="dxa" w:w="90"/>
+              <w:bottom w:type="dxa" w:w="35"/>
+              <w:right w:type="dxa" w:w="90"/>
+            </w:tcMar>
+          </w:tcPr>
+          <w:p>
+            <w:r>
+              <w:t xml:space="preserve">Up to 60 characters</w:t>
+            </w:r>
+          </w:p>
+        </w:tc>
+        <w:tc>
+          <w:tcPr>
+            <w:tcW w:type="dxa" w:w="2400"/>
+            <w:tcBorders>
+              <w:top w:val="single" w:color="DCD7E3" w:sz="4"/>
+              <w:left w:val="single" w:color="DCD7E3" w:sz="4"/>
+              <w:bottom w:val="single" w:color="DCD7E3" w:sz="4"/>
+              <w:right w:val="single" w:color="DCD7E3" w:sz="4"/>
+            </w:tcBorders>
+            <w:tcMar>
+              <w:top w:type="dxa" w:w="35"/>
+              <w:left w:type="dxa" w:w="90"/>
+              <w:bottom w:type="dxa" w:w="35"/>
+              <w:right w:type="dxa" w:w="90"/>
+            </w:tcMar>
+          </w:tcPr>
+          <w:p>
+            <w:r>
+              <w:t xml:space="preserve">First Name</w:t>
             </w:r>
           </w:p>
         </w:tc>
@@ -666,28 +712,28 @@
       <w:tr>
         <w:tc>
           <w:tcPr>
-            <w:tcW w:type="dxa" w:w="1450"/>
-            <w:tcBorders>
-              <w:top w:val="single" w:color="DCD7E3" w:sz="4"/>
-              <w:left w:val="single" w:color="DCD7E3" w:sz="4"/>
-              <w:bottom w:val="single" w:color="DCD7E3" w:sz="4"/>
-              <w:right w:val="single" w:color="DCD7E3" w:sz="4"/>
-            </w:tcBorders>
-            <w:tcMar>
-              <w:top w:type="dxa" w:w="60"/>
-              <w:left w:type="dxa" w:w="100"/>
-              <w:bottom w:type="dxa" w:w="60"/>
-              <w:right w:type="dxa" w:w="100"/>
+            <w:tcW w:type="dxa" w:w="2350"/>
+            <w:tcBorders>
+              <w:top w:val="single" w:color="DCD7E3" w:sz="4"/>
+              <w:left w:val="single" w:color="DCD7E3" w:sz="4"/>
+              <w:bottom w:val="single" w:color="DCD7E3" w:sz="4"/>
+              <w:right w:val="single" w:color="DCD7E3" w:sz="4"/>
+            </w:tcBorders>
+            <w:tcMar>
+              <w:top w:type="dxa" w:w="35"/>
+              <w:left w:type="dxa" w:w="90"/>
+              <w:bottom w:type="dxa" w:w="35"/>
+              <w:right w:type="dxa" w:w="90"/>
             </w:tcMar>
           </w:tcPr>
           <w:p>
             <w:r>
               <w:rPr>
                 <w:rFonts w:ascii="Consolas" w:cs="Consolas" w:eastAsia="Consolas" w:hAnsi="Consolas"/>
-                <w:sz w:val="19"/>
-                <w:szCs w:val="19"/>
+                <w:sz w:val="18"/>
+                <w:szCs w:val="18"/>
               </w:rPr>
-              <w:t xml:space="preserve">type</w:t>
+              <w:t xml:space="preserve">last_name</w:t>
             </w:r>
           </w:p>
         </w:tc>
@@ -701,10 +747,10 @@
               <w:right w:val="single" w:color="DCD7E3" w:sz="4"/>
             </w:tcBorders>
             <w:tcMar>
-              <w:top w:type="dxa" w:w="60"/>
-              <w:left w:type="dxa" w:w="100"/>
-              <w:bottom w:type="dxa" w:w="60"/>
-              <w:right w:type="dxa" w:w="100"/>
+              <w:top w:type="dxa" w:w="35"/>
+              <w:left w:type="dxa" w:w="90"/>
+              <w:bottom w:type="dxa" w:w="35"/>
+              <w:right w:type="dxa" w:w="90"/>
             </w:tcMar>
           </w:tcPr>
           <w:p>
@@ -715,45 +761,45 @@
         </w:tc>
         <w:tc>
           <w:tcPr>
-            <w:tcW w:type="dxa" w:w="4038"/>
-            <w:tcBorders>
-              <w:top w:val="single" w:color="DCD7E3" w:sz="4"/>
-              <w:left w:val="single" w:color="DCD7E3" w:sz="4"/>
-              <w:bottom w:val="single" w:color="DCD7E3" w:sz="4"/>
-              <w:right w:val="single" w:color="DCD7E3" w:sz="4"/>
-            </w:tcBorders>
-            <w:tcMar>
-              <w:top w:type="dxa" w:w="60"/>
-              <w:left w:type="dxa" w:w="100"/>
-              <w:bottom w:type="dxa" w:w="60"/>
-              <w:right w:type="dxa" w:w="100"/>
-            </w:tcMar>
-          </w:tcPr>
-          <w:p>
-            <w:r>
-              <w:t xml:space="preserve">One of the type options below</w:t>
-            </w:r>
-          </w:p>
-        </w:tc>
-        <w:tc>
-          <w:tcPr>
-            <w:tcW w:type="dxa" w:w="3100"/>
-            <w:tcBorders>
-              <w:top w:val="single" w:color="DCD7E3" w:sz="4"/>
-              <w:left w:val="single" w:color="DCD7E3" w:sz="4"/>
-              <w:bottom w:val="single" w:color="DCD7E3" w:sz="4"/>
-              <w:right w:val="single" w:color="DCD7E3" w:sz="4"/>
-            </w:tcBorders>
-            <w:tcMar>
-              <w:top w:type="dxa" w:w="60"/>
-              <w:left w:type="dxa" w:w="100"/>
-              <w:bottom w:type="dxa" w:w="60"/>
-              <w:right w:type="dxa" w:w="100"/>
-            </w:tcMar>
-          </w:tcPr>
-          <w:p>
-            <w:r>
-              <w:t xml:space="preserve">Academy / club</w:t>
+            <w:tcW w:type="dxa" w:w="3838"/>
+            <w:tcBorders>
+              <w:top w:val="single" w:color="DCD7E3" w:sz="4"/>
+              <w:left w:val="single" w:color="DCD7E3" w:sz="4"/>
+              <w:bottom w:val="single" w:color="DCD7E3" w:sz="4"/>
+              <w:right w:val="single" w:color="DCD7E3" w:sz="4"/>
+            </w:tcBorders>
+            <w:tcMar>
+              <w:top w:type="dxa" w:w="35"/>
+              <w:left w:type="dxa" w:w="90"/>
+              <w:bottom w:type="dxa" w:w="35"/>
+              <w:right w:type="dxa" w:w="90"/>
+            </w:tcMar>
+          </w:tcPr>
+          <w:p>
+            <w:r>
+              <w:t xml:space="preserve">Up to 60</w:t>
+            </w:r>
+          </w:p>
+        </w:tc>
+        <w:tc>
+          <w:tcPr>
+            <w:tcW w:type="dxa" w:w="2400"/>
+            <w:tcBorders>
+              <w:top w:val="single" w:color="DCD7E3" w:sz="4"/>
+              <w:left w:val="single" w:color="DCD7E3" w:sz="4"/>
+              <w:bottom w:val="single" w:color="DCD7E3" w:sz="4"/>
+              <w:right w:val="single" w:color="DCD7E3" w:sz="4"/>
+            </w:tcBorders>
+            <w:tcMar>
+              <w:top w:type="dxa" w:w="35"/>
+              <w:left w:type="dxa" w:w="90"/>
+              <w:bottom w:type="dxa" w:w="35"/>
+              <w:right w:type="dxa" w:w="90"/>
+            </w:tcMar>
+          </w:tcPr>
+          <w:p>
+            <w:r>
+              <w:t xml:space="preserve">Last Name</w:t>
             </w:r>
           </w:p>
         </w:tc>
@@ -761,26 +807,604 @@
       <w:tr>
         <w:tc>
           <w:tcPr>
-            <w:tcW w:type="dxa" w:w="1450"/>
-            <w:tcBorders>
-              <w:top w:val="single" w:color="DCD7E3" w:sz="4"/>
-              <w:left w:val="single" w:color="DCD7E3" w:sz="4"/>
-              <w:bottom w:val="single" w:color="DCD7E3" w:sz="4"/>
-              <w:right w:val="single" w:color="DCD7E3" w:sz="4"/>
-            </w:tcBorders>
-            <w:tcMar>
-              <w:top w:type="dxa" w:w="60"/>
-              <w:left w:type="dxa" w:w="100"/>
-              <w:bottom w:type="dxa" w:w="60"/>
-              <w:right w:type="dxa" w:w="100"/>
+            <w:tcW w:type="dxa" w:w="2350"/>
+            <w:tcBorders>
+              <w:top w:val="single" w:color="DCD7E3" w:sz="4"/>
+              <w:left w:val="single" w:color="DCD7E3" w:sz="4"/>
+              <w:bottom w:val="single" w:color="DCD7E3" w:sz="4"/>
+              <w:right w:val="single" w:color="DCD7E3" w:sz="4"/>
+            </w:tcBorders>
+            <w:tcMar>
+              <w:top w:type="dxa" w:w="35"/>
+              <w:left w:type="dxa" w:w="90"/>
+              <w:bottom w:type="dxa" w:w="35"/>
+              <w:right w:type="dxa" w:w="90"/>
             </w:tcMar>
           </w:tcPr>
           <w:p>
             <w:r>
               <w:rPr>
                 <w:rFonts w:ascii="Consolas" w:cs="Consolas" w:eastAsia="Consolas" w:hAnsi="Consolas"/>
-                <w:sz w:val="19"/>
-                <w:szCs w:val="19"/>
+                <w:sz w:val="18"/>
+                <w:szCs w:val="18"/>
+              </w:rPr>
+              <w:t xml:space="preserve">email</w:t>
+            </w:r>
+          </w:p>
+        </w:tc>
+        <w:tc>
+          <w:tcPr>
+            <w:tcW w:type="dxa" w:w="1050"/>
+            <w:tcBorders>
+              <w:top w:val="single" w:color="DCD7E3" w:sz="4"/>
+              <w:left w:val="single" w:color="DCD7E3" w:sz="4"/>
+              <w:bottom w:val="single" w:color="DCD7E3" w:sz="4"/>
+              <w:right w:val="single" w:color="DCD7E3" w:sz="4"/>
+            </w:tcBorders>
+            <w:tcMar>
+              <w:top w:type="dxa" w:w="35"/>
+              <w:left w:type="dxa" w:w="90"/>
+              <w:bottom w:type="dxa" w:w="35"/>
+              <w:right w:type="dxa" w:w="90"/>
+            </w:tcMar>
+          </w:tcPr>
+          <w:p>
+            <w:r>
+              <w:t xml:space="preserve">Yes</w:t>
+            </w:r>
+          </w:p>
+        </w:tc>
+        <w:tc>
+          <w:tcPr>
+            <w:tcW w:type="dxa" w:w="3838"/>
+            <w:tcBorders>
+              <w:top w:val="single" w:color="DCD7E3" w:sz="4"/>
+              <w:left w:val="single" w:color="DCD7E3" w:sz="4"/>
+              <w:bottom w:val="single" w:color="DCD7E3" w:sz="4"/>
+              <w:right w:val="single" w:color="DCD7E3" w:sz="4"/>
+            </w:tcBorders>
+            <w:tcMar>
+              <w:top w:type="dxa" w:w="35"/>
+              <w:left w:type="dxa" w:w="90"/>
+              <w:bottom w:type="dxa" w:w="35"/>
+              <w:right w:type="dxa" w:w="90"/>
+            </w:tcMar>
+          </w:tcPr>
+          <w:p>
+            <w:r>
+              <w:t xml:space="preserve">Valid email, up to 200</w:t>
+            </w:r>
+          </w:p>
+        </w:tc>
+        <w:tc>
+          <w:tcPr>
+            <w:tcW w:type="dxa" w:w="2400"/>
+            <w:tcBorders>
+              <w:top w:val="single" w:color="DCD7E3" w:sz="4"/>
+              <w:left w:val="single" w:color="DCD7E3" w:sz="4"/>
+              <w:bottom w:val="single" w:color="DCD7E3" w:sz="4"/>
+              <w:right w:val="single" w:color="DCD7E3" w:sz="4"/>
+            </w:tcBorders>
+            <w:tcMar>
+              <w:top w:type="dxa" w:w="35"/>
+              <w:left w:type="dxa" w:w="90"/>
+              <w:bottom w:type="dxa" w:w="35"/>
+              <w:right w:type="dxa" w:w="90"/>
+            </w:tcMar>
+          </w:tcPr>
+          <w:p>
+            <w:r>
+              <w:t xml:space="preserve">Email</w:t>
+            </w:r>
+          </w:p>
+        </w:tc>
+      </w:tr>
+      <w:tr>
+        <w:tc>
+          <w:tcPr>
+            <w:tcW w:type="dxa" w:w="2350"/>
+            <w:tcBorders>
+              <w:top w:val="single" w:color="DCD7E3" w:sz="4"/>
+              <w:left w:val="single" w:color="DCD7E3" w:sz="4"/>
+              <w:bottom w:val="single" w:color="DCD7E3" w:sz="4"/>
+              <w:right w:val="single" w:color="DCD7E3" w:sz="4"/>
+            </w:tcBorders>
+            <w:tcMar>
+              <w:top w:type="dxa" w:w="35"/>
+              <w:left w:type="dxa" w:w="90"/>
+              <w:bottom w:type="dxa" w:w="35"/>
+              <w:right w:type="dxa" w:w="90"/>
+            </w:tcMar>
+          </w:tcPr>
+          <w:p>
+            <w:r>
+              <w:rPr>
+                <w:rFonts w:ascii="Consolas" w:cs="Consolas" w:eastAsia="Consolas" w:hAnsi="Consolas"/>
+                <w:sz w:val="18"/>
+                <w:szCs w:val="18"/>
+              </w:rPr>
+              <w:t xml:space="preserve">company_name</w:t>
+            </w:r>
+          </w:p>
+        </w:tc>
+        <w:tc>
+          <w:tcPr>
+            <w:tcW w:type="dxa" w:w="1050"/>
+            <w:tcBorders>
+              <w:top w:val="single" w:color="DCD7E3" w:sz="4"/>
+              <w:left w:val="single" w:color="DCD7E3" w:sz="4"/>
+              <w:bottom w:val="single" w:color="DCD7E3" w:sz="4"/>
+              <w:right w:val="single" w:color="DCD7E3" w:sz="4"/>
+            </w:tcBorders>
+            <w:tcMar>
+              <w:top w:type="dxa" w:w="35"/>
+              <w:left w:type="dxa" w:w="90"/>
+              <w:bottom w:type="dxa" w:w="35"/>
+              <w:right w:type="dxa" w:w="90"/>
+            </w:tcMar>
+          </w:tcPr>
+          <w:p>
+            <w:r>
+              <w:t xml:space="preserve">Yes</w:t>
+            </w:r>
+          </w:p>
+        </w:tc>
+        <w:tc>
+          <w:tcPr>
+            <w:tcW w:type="dxa" w:w="3838"/>
+            <w:tcBorders>
+              <w:top w:val="single" w:color="DCD7E3" w:sz="4"/>
+              <w:left w:val="single" w:color="DCD7E3" w:sz="4"/>
+              <w:bottom w:val="single" w:color="DCD7E3" w:sz="4"/>
+              <w:right w:val="single" w:color="DCD7E3" w:sz="4"/>
+            </w:tcBorders>
+            <w:tcMar>
+              <w:top w:type="dxa" w:w="35"/>
+              <w:left w:type="dxa" w:w="90"/>
+              <w:bottom w:type="dxa" w:w="35"/>
+              <w:right w:type="dxa" w:w="90"/>
+            </w:tcMar>
+          </w:tcPr>
+          <w:p>
+            <w:r>
+              <w:t xml:space="preserve">Organisation name, up to 150</w:t>
+            </w:r>
+          </w:p>
+        </w:tc>
+        <w:tc>
+          <w:tcPr>
+            <w:tcW w:type="dxa" w:w="2400"/>
+            <w:tcBorders>
+              <w:top w:val="single" w:color="DCD7E3" w:sz="4"/>
+              <w:left w:val="single" w:color="DCD7E3" w:sz="4"/>
+              <w:bottom w:val="single" w:color="DCD7E3" w:sz="4"/>
+              <w:right w:val="single" w:color="DCD7E3" w:sz="4"/>
+            </w:tcBorders>
+            <w:tcMar>
+              <w:top w:type="dxa" w:w="35"/>
+              <w:left w:type="dxa" w:w="90"/>
+              <w:bottom w:type="dxa" w:w="35"/>
+              <w:right w:type="dxa" w:w="90"/>
+            </w:tcMar>
+          </w:tcPr>
+          <w:p>
+            <w:r>
+              <w:t xml:space="preserve">Company Name</w:t>
+            </w:r>
+          </w:p>
+        </w:tc>
+      </w:tr>
+      <w:tr>
+        <w:tc>
+          <w:tcPr>
+            <w:tcW w:type="dxa" w:w="2350"/>
+            <w:tcBorders>
+              <w:top w:val="single" w:color="DCD7E3" w:sz="4"/>
+              <w:left w:val="single" w:color="DCD7E3" w:sz="4"/>
+              <w:bottom w:val="single" w:color="DCD7E3" w:sz="4"/>
+              <w:right w:val="single" w:color="DCD7E3" w:sz="4"/>
+            </w:tcBorders>
+            <w:tcMar>
+              <w:top w:type="dxa" w:w="35"/>
+              <w:left w:type="dxa" w:w="90"/>
+              <w:bottom w:type="dxa" w:w="35"/>
+              <w:right w:type="dxa" w:w="90"/>
+            </w:tcMar>
+          </w:tcPr>
+          <w:p>
+            <w:r>
+              <w:rPr>
+                <w:rFonts w:ascii="Consolas" w:cs="Consolas" w:eastAsia="Consolas" w:hAnsi="Consolas"/>
+                <w:sz w:val="18"/>
+                <w:szCs w:val="18"/>
+              </w:rPr>
+              <w:t xml:space="preserve">mobile_number</w:t>
+            </w:r>
+          </w:p>
+        </w:tc>
+        <w:tc>
+          <w:tcPr>
+            <w:tcW w:type="dxa" w:w="1050"/>
+            <w:tcBorders>
+              <w:top w:val="single" w:color="DCD7E3" w:sz="4"/>
+              <w:left w:val="single" w:color="DCD7E3" w:sz="4"/>
+              <w:bottom w:val="single" w:color="DCD7E3" w:sz="4"/>
+              <w:right w:val="single" w:color="DCD7E3" w:sz="4"/>
+            </w:tcBorders>
+            <w:tcMar>
+              <w:top w:type="dxa" w:w="35"/>
+              <w:left w:type="dxa" w:w="90"/>
+              <w:bottom w:type="dxa" w:w="35"/>
+              <w:right w:type="dxa" w:w="90"/>
+            </w:tcMar>
+          </w:tcPr>
+          <w:p>
+            <w:r>
+              <w:t xml:space="preserve">Yes</w:t>
+            </w:r>
+          </w:p>
+        </w:tc>
+        <w:tc>
+          <w:tcPr>
+            <w:tcW w:type="dxa" w:w="3838"/>
+            <w:tcBorders>
+              <w:top w:val="single" w:color="DCD7E3" w:sz="4"/>
+              <w:left w:val="single" w:color="DCD7E3" w:sz="4"/>
+              <w:bottom w:val="single" w:color="DCD7E3" w:sz="4"/>
+              <w:right w:val="single" w:color="DCD7E3" w:sz="4"/>
+            </w:tcBorders>
+            <w:tcMar>
+              <w:top w:type="dxa" w:w="35"/>
+              <w:left w:type="dxa" w:w="90"/>
+              <w:bottom w:type="dxa" w:w="35"/>
+              <w:right w:type="dxa" w:w="90"/>
+            </w:tcMar>
+          </w:tcPr>
+          <w:p>
+            <w:r>
+              <w:t xml:space="preserve">Phone / WhatsApp, at least 7 digits, up to 40</w:t>
+            </w:r>
+          </w:p>
+        </w:tc>
+        <w:tc>
+          <w:tcPr>
+            <w:tcW w:type="dxa" w:w="2400"/>
+            <w:tcBorders>
+              <w:top w:val="single" w:color="DCD7E3" w:sz="4"/>
+              <w:left w:val="single" w:color="DCD7E3" w:sz="4"/>
+              <w:bottom w:val="single" w:color="DCD7E3" w:sz="4"/>
+              <w:right w:val="single" w:color="DCD7E3" w:sz="4"/>
+            </w:tcBorders>
+            <w:tcMar>
+              <w:top w:type="dxa" w:w="35"/>
+              <w:left w:type="dxa" w:w="90"/>
+              <w:bottom w:type="dxa" w:w="35"/>
+              <w:right w:type="dxa" w:w="90"/>
+            </w:tcMar>
+          </w:tcPr>
+          <w:p>
+            <w:r>
+              <w:t xml:space="preserve">Mobile Number</w:t>
+            </w:r>
+          </w:p>
+        </w:tc>
+      </w:tr>
+      <w:tr>
+        <w:tc>
+          <w:tcPr>
+            <w:tcW w:type="dxa" w:w="2350"/>
+            <w:tcBorders>
+              <w:top w:val="single" w:color="DCD7E3" w:sz="4"/>
+              <w:left w:val="single" w:color="DCD7E3" w:sz="4"/>
+              <w:bottom w:val="single" w:color="DCD7E3" w:sz="4"/>
+              <w:right w:val="single" w:color="DCD7E3" w:sz="4"/>
+            </w:tcBorders>
+            <w:tcMar>
+              <w:top w:type="dxa" w:w="35"/>
+              <w:left w:type="dxa" w:w="90"/>
+              <w:bottom w:type="dxa" w:w="35"/>
+              <w:right w:type="dxa" w:w="90"/>
+            </w:tcMar>
+          </w:tcPr>
+          <w:p>
+            <w:r>
+              <w:rPr>
+                <w:rFonts w:ascii="Consolas" w:cs="Consolas" w:eastAsia="Consolas" w:hAnsi="Consolas"/>
+                <w:sz w:val="18"/>
+                <w:szCs w:val="18"/>
+              </w:rPr>
+              <w:t xml:space="preserve">designation</w:t>
+            </w:r>
+          </w:p>
+        </w:tc>
+        <w:tc>
+          <w:tcPr>
+            <w:tcW w:type="dxa" w:w="1050"/>
+            <w:tcBorders>
+              <w:top w:val="single" w:color="DCD7E3" w:sz="4"/>
+              <w:left w:val="single" w:color="DCD7E3" w:sz="4"/>
+              <w:bottom w:val="single" w:color="DCD7E3" w:sz="4"/>
+              <w:right w:val="single" w:color="DCD7E3" w:sz="4"/>
+            </w:tcBorders>
+            <w:tcMar>
+              <w:top w:type="dxa" w:w="35"/>
+              <w:left w:type="dxa" w:w="90"/>
+              <w:bottom w:type="dxa" w:w="35"/>
+              <w:right w:type="dxa" w:w="90"/>
+            </w:tcMar>
+          </w:tcPr>
+          <w:p>
+            <w:r>
+              <w:t xml:space="preserve">No</w:t>
+            </w:r>
+          </w:p>
+        </w:tc>
+        <w:tc>
+          <w:tcPr>
+            <w:tcW w:type="dxa" w:w="3838"/>
+            <w:tcBorders>
+              <w:top w:val="single" w:color="DCD7E3" w:sz="4"/>
+              <w:left w:val="single" w:color="DCD7E3" w:sz="4"/>
+              <w:bottom w:val="single" w:color="DCD7E3" w:sz="4"/>
+              <w:right w:val="single" w:color="DCD7E3" w:sz="4"/>
+            </w:tcBorders>
+            <w:tcMar>
+              <w:top w:type="dxa" w:w="35"/>
+              <w:left w:type="dxa" w:w="90"/>
+              <w:bottom w:type="dxa" w:w="35"/>
+              <w:right w:type="dxa" w:w="90"/>
+            </w:tcMar>
+          </w:tcPr>
+          <w:p>
+            <w:r>
+              <w:t xml:space="preserve">Their role, up to 120</w:t>
+            </w:r>
+          </w:p>
+        </w:tc>
+        <w:tc>
+          <w:tcPr>
+            <w:tcW w:type="dxa" w:w="2400"/>
+            <w:tcBorders>
+              <w:top w:val="single" w:color="DCD7E3" w:sz="4"/>
+              <w:left w:val="single" w:color="DCD7E3" w:sz="4"/>
+              <w:bottom w:val="single" w:color="DCD7E3" w:sz="4"/>
+              <w:right w:val="single" w:color="DCD7E3" w:sz="4"/>
+            </w:tcBorders>
+            <w:tcMar>
+              <w:top w:type="dxa" w:w="35"/>
+              <w:left w:type="dxa" w:w="90"/>
+              <w:bottom w:type="dxa" w:w="35"/>
+              <w:right w:type="dxa" w:w="90"/>
+            </w:tcMar>
+          </w:tcPr>
+          <w:p>
+            <w:r>
+              <w:t xml:space="preserve">Designation</w:t>
+            </w:r>
+          </w:p>
+        </w:tc>
+      </w:tr>
+      <w:tr>
+        <w:tc>
+          <w:tcPr>
+            <w:tcW w:type="dxa" w:w="2350"/>
+            <w:tcBorders>
+              <w:top w:val="single" w:color="DCD7E3" w:sz="4"/>
+              <w:left w:val="single" w:color="DCD7E3" w:sz="4"/>
+              <w:bottom w:val="single" w:color="DCD7E3" w:sz="4"/>
+              <w:right w:val="single" w:color="DCD7E3" w:sz="4"/>
+            </w:tcBorders>
+            <w:tcMar>
+              <w:top w:type="dxa" w:w="35"/>
+              <w:left w:type="dxa" w:w="90"/>
+              <w:bottom w:type="dxa" w:w="35"/>
+              <w:right w:type="dxa" w:w="90"/>
+            </w:tcMar>
+          </w:tcPr>
+          <w:p>
+            <w:r>
+              <w:rPr>
+                <w:rFonts w:ascii="Consolas" w:cs="Consolas" w:eastAsia="Consolas" w:hAnsi="Consolas"/>
+                <w:sz w:val="18"/>
+                <w:szCs w:val="18"/>
+              </w:rPr>
+              <w:t xml:space="preserve">organisation_type</w:t>
+            </w:r>
+          </w:p>
+        </w:tc>
+        <w:tc>
+          <w:tcPr>
+            <w:tcW w:type="dxa" w:w="1050"/>
+            <w:tcBorders>
+              <w:top w:val="single" w:color="DCD7E3" w:sz="4"/>
+              <w:left w:val="single" w:color="DCD7E3" w:sz="4"/>
+              <w:bottom w:val="single" w:color="DCD7E3" w:sz="4"/>
+              <w:right w:val="single" w:color="DCD7E3" w:sz="4"/>
+            </w:tcBorders>
+            <w:tcMar>
+              <w:top w:type="dxa" w:w="35"/>
+              <w:left w:type="dxa" w:w="90"/>
+              <w:bottom w:type="dxa" w:w="35"/>
+              <w:right w:type="dxa" w:w="90"/>
+            </w:tcMar>
+          </w:tcPr>
+          <w:p>
+            <w:r>
+              <w:t xml:space="preserve">Yes</w:t>
+            </w:r>
+          </w:p>
+        </w:tc>
+        <w:tc>
+          <w:tcPr>
+            <w:tcW w:type="dxa" w:w="3838"/>
+            <w:tcBorders>
+              <w:top w:val="single" w:color="DCD7E3" w:sz="4"/>
+              <w:left w:val="single" w:color="DCD7E3" w:sz="4"/>
+              <w:bottom w:val="single" w:color="DCD7E3" w:sz="4"/>
+              <w:right w:val="single" w:color="DCD7E3" w:sz="4"/>
+            </w:tcBorders>
+            <w:tcMar>
+              <w:top w:type="dxa" w:w="35"/>
+              <w:left w:type="dxa" w:w="90"/>
+              <w:bottom w:type="dxa" w:w="35"/>
+              <w:right w:type="dxa" w:w="90"/>
+            </w:tcMar>
+          </w:tcPr>
+          <w:p>
+            <w:r>
+              <w:t xml:space="preserve">One of the type options below</w:t>
+            </w:r>
+          </w:p>
+        </w:tc>
+        <w:tc>
+          <w:tcPr>
+            <w:tcW w:type="dxa" w:w="2400"/>
+            <w:tcBorders>
+              <w:top w:val="single" w:color="DCD7E3" w:sz="4"/>
+              <w:left w:val="single" w:color="DCD7E3" w:sz="4"/>
+              <w:bottom w:val="single" w:color="DCD7E3" w:sz="4"/>
+              <w:right w:val="single" w:color="DCD7E3" w:sz="4"/>
+            </w:tcBorders>
+            <w:tcMar>
+              <w:top w:type="dxa" w:w="35"/>
+              <w:left w:type="dxa" w:w="90"/>
+              <w:bottom w:type="dxa" w:w="35"/>
+              <w:right w:type="dxa" w:w="90"/>
+            </w:tcMar>
+          </w:tcPr>
+          <w:p>
+            <w:r>
+              <w:rPr>
+                <w:b/>
+                <w:bCs/>
+              </w:rPr>
+              <w:t xml:space="preserve">New column</w:t>
+            </w:r>
+          </w:p>
+        </w:tc>
+      </w:tr>
+      <w:tr>
+        <w:tc>
+          <w:tcPr>
+            <w:tcW w:type="dxa" w:w="2350"/>
+            <w:tcBorders>
+              <w:top w:val="single" w:color="DCD7E3" w:sz="4"/>
+              <w:left w:val="single" w:color="DCD7E3" w:sz="4"/>
+              <w:bottom w:val="single" w:color="DCD7E3" w:sz="4"/>
+              <w:right w:val="single" w:color="DCD7E3" w:sz="4"/>
+            </w:tcBorders>
+            <w:tcMar>
+              <w:top w:type="dxa" w:w="35"/>
+              <w:left w:type="dxa" w:w="90"/>
+              <w:bottom w:type="dxa" w:w="35"/>
+              <w:right w:type="dxa" w:w="90"/>
+            </w:tcMar>
+          </w:tcPr>
+          <w:p>
+            <w:r>
+              <w:rPr>
+                <w:rFonts w:ascii="Consolas" w:cs="Consolas" w:eastAsia="Consolas" w:hAnsi="Consolas"/>
+                <w:sz w:val="18"/>
+                <w:szCs w:val="18"/>
+              </w:rPr>
+              <w:t xml:space="preserve">interests</w:t>
+            </w:r>
+          </w:p>
+        </w:tc>
+        <w:tc>
+          <w:tcPr>
+            <w:tcW w:type="dxa" w:w="1050"/>
+            <w:tcBorders>
+              <w:top w:val="single" w:color="DCD7E3" w:sz="4"/>
+              <w:left w:val="single" w:color="DCD7E3" w:sz="4"/>
+              <w:bottom w:val="single" w:color="DCD7E3" w:sz="4"/>
+              <w:right w:val="single" w:color="DCD7E3" w:sz="4"/>
+            </w:tcBorders>
+            <w:tcMar>
+              <w:top w:type="dxa" w:w="35"/>
+              <w:left w:type="dxa" w:w="90"/>
+              <w:bottom w:type="dxa" w:w="35"/>
+              <w:right w:type="dxa" w:w="90"/>
+            </w:tcMar>
+          </w:tcPr>
+          <w:p>
+            <w:r>
+              <w:t xml:space="preserve">No</w:t>
+            </w:r>
+          </w:p>
+        </w:tc>
+        <w:tc>
+          <w:tcPr>
+            <w:tcW w:type="dxa" w:w="3838"/>
+            <w:tcBorders>
+              <w:top w:val="single" w:color="DCD7E3" w:sz="4"/>
+              <w:left w:val="single" w:color="DCD7E3" w:sz="4"/>
+              <w:bottom w:val="single" w:color="DCD7E3" w:sz="4"/>
+              <w:right w:val="single" w:color="DCD7E3" w:sz="4"/>
+            </w:tcBorders>
+            <w:tcMar>
+              <w:top w:type="dxa" w:w="35"/>
+              <w:left w:type="dxa" w:w="90"/>
+              <w:bottom w:type="dxa" w:w="35"/>
+              <w:right w:type="dxa" w:w="90"/>
+            </w:tcMar>
+          </w:tcPr>
+          <w:p>
+            <w:r>
+              <w:t xml:space="preserve">List, any of the interest options below</w:t>
+            </w:r>
+          </w:p>
+        </w:tc>
+        <w:tc>
+          <w:tcPr>
+            <w:tcW w:type="dxa" w:w="2400"/>
+            <w:tcBorders>
+              <w:top w:val="single" w:color="DCD7E3" w:sz="4"/>
+              <w:left w:val="single" w:color="DCD7E3" w:sz="4"/>
+              <w:bottom w:val="single" w:color="DCD7E3" w:sz="4"/>
+              <w:right w:val="single" w:color="DCD7E3" w:sz="4"/>
+            </w:tcBorders>
+            <w:tcMar>
+              <w:top w:type="dxa" w:w="35"/>
+              <w:left w:type="dxa" w:w="90"/>
+              <w:bottom w:type="dxa" w:w="35"/>
+              <w:right w:type="dxa" w:w="90"/>
+            </w:tcMar>
+          </w:tcPr>
+          <w:p>
+            <w:r>
+              <w:rPr>
+                <w:b/>
+                <w:bCs/>
+              </w:rPr>
+              <w:t xml:space="preserve">New column</w:t>
+            </w:r>
+          </w:p>
+        </w:tc>
+      </w:tr>
+      <w:tr>
+        <w:tc>
+          <w:tcPr>
+            <w:tcW w:type="dxa" w:w="2350"/>
+            <w:tcBorders>
+              <w:top w:val="single" w:color="DCD7E3" w:sz="4"/>
+              <w:left w:val="single" w:color="DCD7E3" w:sz="4"/>
+              <w:bottom w:val="single" w:color="DCD7E3" w:sz="4"/>
+              <w:right w:val="single" w:color="DCD7E3" w:sz="4"/>
+            </w:tcBorders>
+            <w:tcMar>
+              <w:top w:type="dxa" w:w="35"/>
+              <w:left w:type="dxa" w:w="90"/>
+              <w:bottom w:type="dxa" w:w="35"/>
+              <w:right w:type="dxa" w:w="90"/>
+            </w:tcMar>
+          </w:tcPr>
+          <w:p>
+            <w:r>
+              <w:rPr>
+                <w:rFonts w:ascii="Consolas" w:cs="Consolas" w:eastAsia="Consolas" w:hAnsi="Consolas"/>
+                <w:sz w:val="18"/>
+                <w:szCs w:val="18"/>
               </w:rPr>
               <w:t xml:space="preserve">activity</w:t>
             </w:r>
@@ -796,10 +1420,10 @@
               <w:right w:val="single" w:color="DCD7E3" w:sz="4"/>
             </w:tcBorders>
             <w:tcMar>
-              <w:top w:type="dxa" w:w="60"/>
-              <w:left w:type="dxa" w:w="100"/>
-              <w:bottom w:type="dxa" w:w="60"/>
-              <w:right w:type="dxa" w:w="100"/>
+              <w:top w:type="dxa" w:w="35"/>
+              <w:left w:type="dxa" w:w="90"/>
+              <w:bottom w:type="dxa" w:w="35"/>
+              <w:right w:type="dxa" w:w="90"/>
             </w:tcMar>
           </w:tcPr>
           <w:p>
@@ -810,18 +1434,18 @@
         </w:tc>
         <w:tc>
           <w:tcPr>
-            <w:tcW w:type="dxa" w:w="4038"/>
-            <w:tcBorders>
-              <w:top w:val="single" w:color="DCD7E3" w:sz="4"/>
-              <w:left w:val="single" w:color="DCD7E3" w:sz="4"/>
-              <w:bottom w:val="single" w:color="DCD7E3" w:sz="4"/>
-              <w:right w:val="single" w:color="DCD7E3" w:sz="4"/>
-            </w:tcBorders>
-            <w:tcMar>
-              <w:top w:type="dxa" w:w="60"/>
-              <w:left w:type="dxa" w:w="100"/>
-              <w:bottom w:type="dxa" w:w="60"/>
-              <w:right w:type="dxa" w:w="100"/>
+            <w:tcW w:type="dxa" w:w="3838"/>
+            <w:tcBorders>
+              <w:top w:val="single" w:color="DCD7E3" w:sz="4"/>
+              <w:left w:val="single" w:color="DCD7E3" w:sz="4"/>
+              <w:bottom w:val="single" w:color="DCD7E3" w:sz="4"/>
+              <w:right w:val="single" w:color="DCD7E3" w:sz="4"/>
+            </w:tcBorders>
+            <w:tcMar>
+              <w:top w:type="dxa" w:w="35"/>
+              <w:left w:type="dxa" w:w="90"/>
+              <w:bottom w:type="dxa" w:w="35"/>
+              <w:right w:type="dxa" w:w="90"/>
             </w:tcMar>
           </w:tcPr>
           <w:p>
@@ -832,23 +1456,27 @@
         </w:tc>
         <w:tc>
           <w:tcPr>
-            <w:tcW w:type="dxa" w:w="3100"/>
-            <w:tcBorders>
-              <w:top w:val="single" w:color="DCD7E3" w:sz="4"/>
-              <w:left w:val="single" w:color="DCD7E3" w:sz="4"/>
-              <w:bottom w:val="single" w:color="DCD7E3" w:sz="4"/>
-              <w:right w:val="single" w:color="DCD7E3" w:sz="4"/>
-            </w:tcBorders>
-            <w:tcMar>
-              <w:top w:type="dxa" w:w="60"/>
-              <w:left w:type="dxa" w:w="100"/>
-              <w:bottom w:type="dxa" w:w="60"/>
-              <w:right w:type="dxa" w:w="100"/>
-            </w:tcMar>
-          </w:tcPr>
-          <w:p>
-            <w:r>
-              <w:t xml:space="preserve">Kids football, ages 4–14</w:t>
+            <w:tcW w:type="dxa" w:w="2400"/>
+            <w:tcBorders>
+              <w:top w:val="single" w:color="DCD7E3" w:sz="4"/>
+              <w:left w:val="single" w:color="DCD7E3" w:sz="4"/>
+              <w:bottom w:val="single" w:color="DCD7E3" w:sz="4"/>
+              <w:right w:val="single" w:color="DCD7E3" w:sz="4"/>
+            </w:tcBorders>
+            <w:tcMar>
+              <w:top w:type="dxa" w:w="35"/>
+              <w:left w:type="dxa" w:w="90"/>
+              <w:bottom w:type="dxa" w:w="35"/>
+              <w:right w:type="dxa" w:w="90"/>
+            </w:tcMar>
+          </w:tcPr>
+          <w:p>
+            <w:r>
+              <w:rPr>
+                <w:b/>
+                <w:bCs/>
+              </w:rPr>
+              <w:t xml:space="preserve">New column</w:t>
             </w:r>
           </w:p>
         </w:tc>
@@ -856,28 +1484,28 @@
       <w:tr>
         <w:tc>
           <w:tcPr>
-            <w:tcW w:type="dxa" w:w="1450"/>
-            <w:tcBorders>
-              <w:top w:val="single" w:color="DCD7E3" w:sz="4"/>
-              <w:left w:val="single" w:color="DCD7E3" w:sz="4"/>
-              <w:bottom w:val="single" w:color="DCD7E3" w:sz="4"/>
-              <w:right w:val="single" w:color="DCD7E3" w:sz="4"/>
-            </w:tcBorders>
-            <w:tcMar>
-              <w:top w:type="dxa" w:w="60"/>
-              <w:left w:type="dxa" w:w="100"/>
-              <w:bottom w:type="dxa" w:w="60"/>
-              <w:right w:type="dxa" w:w="100"/>
+            <w:tcW w:type="dxa" w:w="2350"/>
+            <w:tcBorders>
+              <w:top w:val="single" w:color="DCD7E3" w:sz="4"/>
+              <w:left w:val="single" w:color="DCD7E3" w:sz="4"/>
+              <w:bottom w:val="single" w:color="DCD7E3" w:sz="4"/>
+              <w:right w:val="single" w:color="DCD7E3" w:sz="4"/>
+            </w:tcBorders>
+            <w:tcMar>
+              <w:top w:type="dxa" w:w="35"/>
+              <w:left w:type="dxa" w:w="90"/>
+              <w:bottom w:type="dxa" w:w="35"/>
+              <w:right w:type="dxa" w:w="90"/>
             </w:tcMar>
           </w:tcPr>
           <w:p>
             <w:r>
               <w:rPr>
                 <w:rFonts w:ascii="Consolas" w:cs="Consolas" w:eastAsia="Consolas" w:hAnsi="Consolas"/>
-                <w:sz w:val="19"/>
-                <w:szCs w:val="19"/>
+                <w:sz w:val="18"/>
+                <w:szCs w:val="18"/>
               </w:rPr>
-              <w:t xml:space="preserve">interests</w:t>
+              <w:t xml:space="preserve">website</w:t>
             </w:r>
           </w:p>
         </w:tc>
@@ -891,10 +1519,10 @@
               <w:right w:val="single" w:color="DCD7E3" w:sz="4"/>
             </w:tcBorders>
             <w:tcMar>
-              <w:top w:type="dxa" w:w="60"/>
-              <w:left w:type="dxa" w:w="100"/>
-              <w:bottom w:type="dxa" w:w="60"/>
-              <w:right w:type="dxa" w:w="100"/>
+              <w:top w:type="dxa" w:w="35"/>
+              <w:left w:type="dxa" w:w="90"/>
+              <w:bottom w:type="dxa" w:w="35"/>
+              <w:right w:type="dxa" w:w="90"/>
             </w:tcMar>
           </w:tcPr>
           <w:p>
@@ -905,45 +1533,49 @@
         </w:tc>
         <w:tc>
           <w:tcPr>
-            <w:tcW w:type="dxa" w:w="4038"/>
-            <w:tcBorders>
-              <w:top w:val="single" w:color="DCD7E3" w:sz="4"/>
-              <w:left w:val="single" w:color="DCD7E3" w:sz="4"/>
-              <w:bottom w:val="single" w:color="DCD7E3" w:sz="4"/>
-              <w:right w:val="single" w:color="DCD7E3" w:sz="4"/>
-            </w:tcBorders>
-            <w:tcMar>
-              <w:top w:type="dxa" w:w="60"/>
-              <w:left w:type="dxa" w:w="100"/>
-              <w:bottom w:type="dxa" w:w="60"/>
-              <w:right w:type="dxa" w:w="100"/>
-            </w:tcMar>
-          </w:tcPr>
-          <w:p>
-            <w:r>
-              <w:t xml:space="preserve">List, any of the interest options below</w:t>
-            </w:r>
-          </w:p>
-        </w:tc>
-        <w:tc>
-          <w:tcPr>
-            <w:tcW w:type="dxa" w:w="3100"/>
-            <w:tcBorders>
-              <w:top w:val="single" w:color="DCD7E3" w:sz="4"/>
-              <w:left w:val="single" w:color="DCD7E3" w:sz="4"/>
-              <w:bottom w:val="single" w:color="DCD7E3" w:sz="4"/>
-              <w:right w:val="single" w:color="DCD7E3" w:sz="4"/>
-            </w:tcBorders>
-            <w:tcMar>
-              <w:top w:type="dxa" w:w="60"/>
-              <w:left w:type="dxa" w:w="100"/>
-              <w:bottom w:type="dxa" w:w="60"/>
-              <w:right w:type="dxa" w:w="100"/>
-            </w:tcMar>
-          </w:tcPr>
-          <w:p>
-            <w:r>
-              <w:t xml:space="preserve">[Title Sponsor, Interactive Booths]</w:t>
+            <w:tcW w:type="dxa" w:w="3838"/>
+            <w:tcBorders>
+              <w:top w:val="single" w:color="DCD7E3" w:sz="4"/>
+              <w:left w:val="single" w:color="DCD7E3" w:sz="4"/>
+              <w:bottom w:val="single" w:color="DCD7E3" w:sz="4"/>
+              <w:right w:val="single" w:color="DCD7E3" w:sz="4"/>
+            </w:tcBorders>
+            <w:tcMar>
+              <w:top w:type="dxa" w:w="35"/>
+              <w:left w:type="dxa" w:w="90"/>
+              <w:bottom w:type="dxa" w:w="35"/>
+              <w:right w:type="dxa" w:w="90"/>
+            </w:tcMar>
+          </w:tcPr>
+          <w:p>
+            <w:r>
+              <w:t xml:space="preserve">Website or Instagram, up to 300</w:t>
+            </w:r>
+          </w:p>
+        </w:tc>
+        <w:tc>
+          <w:tcPr>
+            <w:tcW w:type="dxa" w:w="2400"/>
+            <w:tcBorders>
+              <w:top w:val="single" w:color="DCD7E3" w:sz="4"/>
+              <w:left w:val="single" w:color="DCD7E3" w:sz="4"/>
+              <w:bottom w:val="single" w:color="DCD7E3" w:sz="4"/>
+              <w:right w:val="single" w:color="DCD7E3" w:sz="4"/>
+            </w:tcBorders>
+            <w:tcMar>
+              <w:top w:type="dxa" w:w="35"/>
+              <w:left w:type="dxa" w:w="90"/>
+              <w:bottom w:type="dxa" w:w="35"/>
+              <w:right w:type="dxa" w:w="90"/>
+            </w:tcMar>
+          </w:tcPr>
+          <w:p>
+            <w:r>
+              <w:rPr>
+                <w:b/>
+                <w:bCs/>
+              </w:rPr>
+              <w:t xml:space="preserve">New column</w:t>
             </w:r>
           </w:p>
         </w:tc>
@@ -951,28 +1583,28 @@
       <w:tr>
         <w:tc>
           <w:tcPr>
-            <w:tcW w:type="dxa" w:w="1450"/>
-            <w:tcBorders>
-              <w:top w:val="single" w:color="DCD7E3" w:sz="4"/>
-              <w:left w:val="single" w:color="DCD7E3" w:sz="4"/>
-              <w:bottom w:val="single" w:color="DCD7E3" w:sz="4"/>
-              <w:right w:val="single" w:color="DCD7E3" w:sz="4"/>
-            </w:tcBorders>
-            <w:tcMar>
-              <w:top w:type="dxa" w:w="60"/>
-              <w:left w:type="dxa" w:w="100"/>
-              <w:bottom w:type="dxa" w:w="60"/>
-              <w:right w:type="dxa" w:w="100"/>
+            <w:tcW w:type="dxa" w:w="2350"/>
+            <w:tcBorders>
+              <w:top w:val="single" w:color="DCD7E3" w:sz="4"/>
+              <w:left w:val="single" w:color="DCD7E3" w:sz="4"/>
+              <w:bottom w:val="single" w:color="DCD7E3" w:sz="4"/>
+              <w:right w:val="single" w:color="DCD7E3" w:sz="4"/>
+            </w:tcBorders>
+            <w:tcMar>
+              <w:top w:type="dxa" w:w="35"/>
+              <w:left w:type="dxa" w:w="90"/>
+              <w:bottom w:type="dxa" w:w="35"/>
+              <w:right w:type="dxa" w:w="90"/>
             </w:tcMar>
           </w:tcPr>
           <w:p>
             <w:r>
               <w:rPr>
                 <w:rFonts w:ascii="Consolas" w:cs="Consolas" w:eastAsia="Consolas" w:hAnsi="Consolas"/>
-                <w:sz w:val="19"/>
-                <w:szCs w:val="19"/>
+                <w:sz w:val="18"/>
+                <w:szCs w:val="18"/>
               </w:rPr>
-              <w:t xml:space="preserve">name</w:t>
+              <w:t xml:space="preserve">message</w:t>
             </w:r>
           </w:p>
         </w:tc>
@@ -986,59 +1618,63 @@
               <w:right w:val="single" w:color="DCD7E3" w:sz="4"/>
             </w:tcBorders>
             <w:tcMar>
-              <w:top w:type="dxa" w:w="60"/>
-              <w:left w:type="dxa" w:w="100"/>
-              <w:bottom w:type="dxa" w:w="60"/>
-              <w:right w:type="dxa" w:w="100"/>
-            </w:tcMar>
-          </w:tcPr>
-          <w:p>
-            <w:r>
-              <w:t xml:space="preserve">Yes</w:t>
-            </w:r>
-          </w:p>
-        </w:tc>
-        <w:tc>
-          <w:tcPr>
-            <w:tcW w:type="dxa" w:w="4038"/>
-            <w:tcBorders>
-              <w:top w:val="single" w:color="DCD7E3" w:sz="4"/>
-              <w:left w:val="single" w:color="DCD7E3" w:sz="4"/>
-              <w:bottom w:val="single" w:color="DCD7E3" w:sz="4"/>
-              <w:right w:val="single" w:color="DCD7E3" w:sz="4"/>
-            </w:tcBorders>
-            <w:tcMar>
-              <w:top w:type="dxa" w:w="60"/>
-              <w:left w:type="dxa" w:w="100"/>
-              <w:bottom w:type="dxa" w:w="60"/>
-              <w:right w:type="dxa" w:w="100"/>
-            </w:tcMar>
-          </w:tcPr>
-          <w:p>
-            <w:r>
-              <w:t xml:space="preserve">Contact name, up to 120</w:t>
-            </w:r>
-          </w:p>
-        </w:tc>
-        <w:tc>
-          <w:tcPr>
-            <w:tcW w:type="dxa" w:w="3100"/>
-            <w:tcBorders>
-              <w:top w:val="single" w:color="DCD7E3" w:sz="4"/>
-              <w:left w:val="single" w:color="DCD7E3" w:sz="4"/>
-              <w:bottom w:val="single" w:color="DCD7E3" w:sz="4"/>
-              <w:right w:val="single" w:color="DCD7E3" w:sz="4"/>
-            </w:tcBorders>
-            <w:tcMar>
-              <w:top w:type="dxa" w:w="60"/>
-              <w:left w:type="dxa" w:w="100"/>
-              <w:bottom w:type="dxa" w:w="60"/>
-              <w:right w:type="dxa" w:w="100"/>
-            </w:tcMar>
-          </w:tcPr>
-          <w:p>
-            <w:r>
-              <w:t xml:space="preserve">Sara Ahmed</w:t>
+              <w:top w:type="dxa" w:w="35"/>
+              <w:left w:type="dxa" w:w="90"/>
+              <w:bottom w:type="dxa" w:w="35"/>
+              <w:right w:type="dxa" w:w="90"/>
+            </w:tcMar>
+          </w:tcPr>
+          <w:p>
+            <w:r>
+              <w:t xml:space="preserve">No</w:t>
+            </w:r>
+          </w:p>
+        </w:tc>
+        <w:tc>
+          <w:tcPr>
+            <w:tcW w:type="dxa" w:w="3838"/>
+            <w:tcBorders>
+              <w:top w:val="single" w:color="DCD7E3" w:sz="4"/>
+              <w:left w:val="single" w:color="DCD7E3" w:sz="4"/>
+              <w:bottom w:val="single" w:color="DCD7E3" w:sz="4"/>
+              <w:right w:val="single" w:color="DCD7E3" w:sz="4"/>
+            </w:tcBorders>
+            <w:tcMar>
+              <w:top w:type="dxa" w:w="35"/>
+              <w:left w:type="dxa" w:w="90"/>
+              <w:bottom w:type="dxa" w:w="35"/>
+              <w:right w:type="dxa" w:w="90"/>
+            </w:tcMar>
+          </w:tcPr>
+          <w:p>
+            <w:r>
+              <w:t xml:space="preserve">Free text, up to 2000</w:t>
+            </w:r>
+          </w:p>
+        </w:tc>
+        <w:tc>
+          <w:tcPr>
+            <w:tcW w:type="dxa" w:w="2400"/>
+            <w:tcBorders>
+              <w:top w:val="single" w:color="DCD7E3" w:sz="4"/>
+              <w:left w:val="single" w:color="DCD7E3" w:sz="4"/>
+              <w:bottom w:val="single" w:color="DCD7E3" w:sz="4"/>
+              <w:right w:val="single" w:color="DCD7E3" w:sz="4"/>
+            </w:tcBorders>
+            <w:tcMar>
+              <w:top w:type="dxa" w:w="35"/>
+              <w:left w:type="dxa" w:w="90"/>
+              <w:bottom w:type="dxa" w:w="35"/>
+              <w:right w:type="dxa" w:w="90"/>
+            </w:tcMar>
+          </w:tcPr>
+          <w:p>
+            <w:r>
+              <w:rPr>
+                <w:b/>
+                <w:bCs/>
+              </w:rPr>
+              <w:t xml:space="preserve">New column</w:t>
             </w:r>
           </w:p>
         </w:tc>
@@ -1046,28 +1682,28 @@
       <w:tr>
         <w:tc>
           <w:tcPr>
-            <w:tcW w:type="dxa" w:w="1450"/>
-            <w:tcBorders>
-              <w:top w:val="single" w:color="DCD7E3" w:sz="4"/>
-              <w:left w:val="single" w:color="DCD7E3" w:sz="4"/>
-              <w:bottom w:val="single" w:color="DCD7E3" w:sz="4"/>
-              <w:right w:val="single" w:color="DCD7E3" w:sz="4"/>
-            </w:tcBorders>
-            <w:tcMar>
-              <w:top w:type="dxa" w:w="60"/>
-              <w:left w:type="dxa" w:w="100"/>
-              <w:bottom w:type="dxa" w:w="60"/>
-              <w:right w:type="dxa" w:w="100"/>
+            <w:tcW w:type="dxa" w:w="2350"/>
+            <w:tcBorders>
+              <w:top w:val="single" w:color="DCD7E3" w:sz="4"/>
+              <w:left w:val="single" w:color="DCD7E3" w:sz="4"/>
+              <w:bottom w:val="single" w:color="DCD7E3" w:sz="4"/>
+              <w:right w:val="single" w:color="DCD7E3" w:sz="4"/>
+            </w:tcBorders>
+            <w:tcMar>
+              <w:top w:type="dxa" w:w="35"/>
+              <w:left w:type="dxa" w:w="90"/>
+              <w:bottom w:type="dxa" w:w="35"/>
+              <w:right w:type="dxa" w:w="90"/>
             </w:tcMar>
           </w:tcPr>
           <w:p>
             <w:r>
               <w:rPr>
                 <w:rFonts w:ascii="Consolas" w:cs="Consolas" w:eastAsia="Consolas" w:hAnsi="Consolas"/>
-                <w:sz w:val="19"/>
-                <w:szCs w:val="19"/>
+                <w:sz w:val="18"/>
+                <w:szCs w:val="18"/>
               </w:rPr>
-              <w:t xml:space="preserve">role</w:t>
+              <w:t xml:space="preserve">consent</w:t>
             </w:r>
           </w:p>
         </w:tc>
@@ -1081,59 +1717,66 @@
               <w:right w:val="single" w:color="DCD7E3" w:sz="4"/>
             </w:tcBorders>
             <w:tcMar>
-              <w:top w:type="dxa" w:w="60"/>
-              <w:left w:type="dxa" w:w="100"/>
-              <w:bottom w:type="dxa" w:w="60"/>
-              <w:right w:type="dxa" w:w="100"/>
-            </w:tcMar>
-          </w:tcPr>
-          <w:p>
-            <w:r>
-              <w:t xml:space="preserve">No</w:t>
-            </w:r>
-          </w:p>
-        </w:tc>
-        <w:tc>
-          <w:tcPr>
-            <w:tcW w:type="dxa" w:w="4038"/>
-            <w:tcBorders>
-              <w:top w:val="single" w:color="DCD7E3" w:sz="4"/>
-              <w:left w:val="single" w:color="DCD7E3" w:sz="4"/>
-              <w:bottom w:val="single" w:color="DCD7E3" w:sz="4"/>
-              <w:right w:val="single" w:color="DCD7E3" w:sz="4"/>
-            </w:tcBorders>
-            <w:tcMar>
-              <w:top w:type="dxa" w:w="60"/>
-              <w:left w:type="dxa" w:w="100"/>
-              <w:bottom w:type="dxa" w:w="60"/>
-              <w:right w:type="dxa" w:w="100"/>
-            </w:tcMar>
-          </w:tcPr>
-          <w:p>
-            <w:r>
-              <w:t xml:space="preserve">Up to 120</w:t>
-            </w:r>
-          </w:p>
-        </w:tc>
-        <w:tc>
-          <w:tcPr>
-            <w:tcW w:type="dxa" w:w="3100"/>
-            <w:tcBorders>
-              <w:top w:val="single" w:color="DCD7E3" w:sz="4"/>
-              <w:left w:val="single" w:color="DCD7E3" w:sz="4"/>
-              <w:bottom w:val="single" w:color="DCD7E3" w:sz="4"/>
-              <w:right w:val="single" w:color="DCD7E3" w:sz="4"/>
-            </w:tcBorders>
-            <w:tcMar>
-              <w:top w:type="dxa" w:w="60"/>
-              <w:left w:type="dxa" w:w="100"/>
-              <w:bottom w:type="dxa" w:w="60"/>
-              <w:right w:type="dxa" w:w="100"/>
-            </w:tcMar>
-          </w:tcPr>
-          <w:p>
-            <w:r>
-              <w:t xml:space="preserve">Founder</w:t>
+              <w:top w:type="dxa" w:w="35"/>
+              <w:left w:type="dxa" w:w="90"/>
+              <w:bottom w:type="dxa" w:w="35"/>
+              <w:right w:type="dxa" w:w="90"/>
+            </w:tcMar>
+          </w:tcPr>
+          <w:p>
+            <w:r>
+              <w:t xml:space="preserve">Yes</w:t>
+            </w:r>
+          </w:p>
+        </w:tc>
+        <w:tc>
+          <w:tcPr>
+            <w:tcW w:type="dxa" w:w="3838"/>
+            <w:tcBorders>
+              <w:top w:val="single" w:color="DCD7E3" w:sz="4"/>
+              <w:left w:val="single" w:color="DCD7E3" w:sz="4"/>
+              <w:bottom w:val="single" w:color="DCD7E3" w:sz="4"/>
+              <w:right w:val="single" w:color="DCD7E3" w:sz="4"/>
+            </w:tcBorders>
+            <w:tcMar>
+              <w:top w:type="dxa" w:w="35"/>
+              <w:left w:type="dxa" w:w="90"/>
+              <w:bottom w:type="dxa" w:w="35"/>
+              <w:right w:type="dxa" w:w="90"/>
+            </w:tcMar>
+          </w:tcPr>
+          <w:p>
+            <w:r>
+              <w:t xml:space="preserve">Must be true (agreed to be contacted)</w:t>
+            </w:r>
+          </w:p>
+        </w:tc>
+        <w:tc>
+          <w:tcPr>
+            <w:tcW w:type="dxa" w:w="2400"/>
+            <w:tcBorders>
+              <w:top w:val="single" w:color="DCD7E3" w:sz="4"/>
+              <w:left w:val="single" w:color="DCD7E3" w:sz="4"/>
+              <w:bottom w:val="single" w:color="DCD7E3" w:sz="4"/>
+              <w:right w:val="single" w:color="DCD7E3" w:sz="4"/>
+            </w:tcBorders>
+            <w:tcMar>
+              <w:top w:type="dxa" w:w="35"/>
+              <w:left w:type="dxa" w:w="90"/>
+              <w:bottom w:type="dxa" w:w="35"/>
+              <w:right w:type="dxa" w:w="90"/>
+            </w:tcMar>
+          </w:tcPr>
+          <w:p>
+            <w:r>
+              <w:rPr>
+                <w:b/>
+                <w:bCs/>
+              </w:rPr>
+              <w:t xml:space="preserve">New column</w:t>
+            </w:r>
+            <w:r>
+              <w:t xml:space="preserve"> (with date)</w:t>
             </w:r>
           </w:p>
         </w:tc>
@@ -1141,28 +1784,28 @@
       <w:tr>
         <w:tc>
           <w:tcPr>
-            <w:tcW w:type="dxa" w:w="1450"/>
-            <w:tcBorders>
-              <w:top w:val="single" w:color="DCD7E3" w:sz="4"/>
-              <w:left w:val="single" w:color="DCD7E3" w:sz="4"/>
-              <w:bottom w:val="single" w:color="DCD7E3" w:sz="4"/>
-              <w:right w:val="single" w:color="DCD7E3" w:sz="4"/>
-            </w:tcBorders>
-            <w:tcMar>
-              <w:top w:type="dxa" w:w="60"/>
-              <w:left w:type="dxa" w:w="100"/>
-              <w:bottom w:type="dxa" w:w="60"/>
-              <w:right w:type="dxa" w:w="100"/>
+            <w:tcW w:type="dxa" w:w="2350"/>
+            <w:tcBorders>
+              <w:top w:val="single" w:color="DCD7E3" w:sz="4"/>
+              <w:left w:val="single" w:color="DCD7E3" w:sz="4"/>
+              <w:bottom w:val="single" w:color="DCD7E3" w:sz="4"/>
+              <w:right w:val="single" w:color="DCD7E3" w:sz="4"/>
+            </w:tcBorders>
+            <w:tcMar>
+              <w:top w:type="dxa" w:w="35"/>
+              <w:left w:type="dxa" w:w="90"/>
+              <w:bottom w:type="dxa" w:w="35"/>
+              <w:right w:type="dxa" w:w="90"/>
             </w:tcMar>
           </w:tcPr>
           <w:p>
             <w:r>
               <w:rPr>
                 <w:rFonts w:ascii="Consolas" w:cs="Consolas" w:eastAsia="Consolas" w:hAnsi="Consolas"/>
-                <w:sz w:val="19"/>
-                <w:szCs w:val="19"/>
+                <w:sz w:val="18"/>
+                <w:szCs w:val="18"/>
               </w:rPr>
-              <w:t xml:space="preserve">email</w:t>
+              <w:t xml:space="preserve">page</w:t>
             </w:r>
           </w:p>
         </w:tc>
@@ -1176,59 +1819,59 @@
               <w:right w:val="single" w:color="DCD7E3" w:sz="4"/>
             </w:tcBorders>
             <w:tcMar>
-              <w:top w:type="dxa" w:w="60"/>
-              <w:left w:type="dxa" w:w="100"/>
-              <w:bottom w:type="dxa" w:w="60"/>
-              <w:right w:type="dxa" w:w="100"/>
-            </w:tcMar>
-          </w:tcPr>
-          <w:p>
-            <w:r>
-              <w:t xml:space="preserve">Yes</w:t>
-            </w:r>
-          </w:p>
-        </w:tc>
-        <w:tc>
-          <w:tcPr>
-            <w:tcW w:type="dxa" w:w="4038"/>
-            <w:tcBorders>
-              <w:top w:val="single" w:color="DCD7E3" w:sz="4"/>
-              <w:left w:val="single" w:color="DCD7E3" w:sz="4"/>
-              <w:bottom w:val="single" w:color="DCD7E3" w:sz="4"/>
-              <w:right w:val="single" w:color="DCD7E3" w:sz="4"/>
-            </w:tcBorders>
-            <w:tcMar>
-              <w:top w:type="dxa" w:w="60"/>
-              <w:left w:type="dxa" w:w="100"/>
-              <w:bottom w:type="dxa" w:w="60"/>
-              <w:right w:type="dxa" w:w="100"/>
-            </w:tcMar>
-          </w:tcPr>
-          <w:p>
-            <w:r>
-              <w:t xml:space="preserve">Valid email, up to 200</w:t>
-            </w:r>
-          </w:p>
-        </w:tc>
-        <w:tc>
-          <w:tcPr>
-            <w:tcW w:type="dxa" w:w="3100"/>
-            <w:tcBorders>
-              <w:top w:val="single" w:color="DCD7E3" w:sz="4"/>
-              <w:left w:val="single" w:color="DCD7E3" w:sz="4"/>
-              <w:bottom w:val="single" w:color="DCD7E3" w:sz="4"/>
-              <w:right w:val="single" w:color="DCD7E3" w:sz="4"/>
-            </w:tcBorders>
-            <w:tcMar>
-              <w:top w:type="dxa" w:w="60"/>
-              <w:left w:type="dxa" w:w="100"/>
-              <w:bottom w:type="dxa" w:w="60"/>
-              <w:right w:type="dxa" w:w="100"/>
-            </w:tcMar>
-          </w:tcPr>
-          <w:p>
-            <w:r>
-              <w:t xml:space="preserve">sara@example.com</w:t>
+              <w:top w:type="dxa" w:w="35"/>
+              <w:left w:type="dxa" w:w="90"/>
+              <w:bottom w:type="dxa" w:w="35"/>
+              <w:right w:type="dxa" w:w="90"/>
+            </w:tcMar>
+          </w:tcPr>
+          <w:p>
+            <w:r>
+              <w:t xml:space="preserve">No</w:t>
+            </w:r>
+          </w:p>
+        </w:tc>
+        <w:tc>
+          <w:tcPr>
+            <w:tcW w:type="dxa" w:w="3838"/>
+            <w:tcBorders>
+              <w:top w:val="single" w:color="DCD7E3" w:sz="4"/>
+              <w:left w:val="single" w:color="DCD7E3" w:sz="4"/>
+              <w:bottom w:val="single" w:color="DCD7E3" w:sz="4"/>
+              <w:right w:val="single" w:color="DCD7E3" w:sz="4"/>
+            </w:tcBorders>
+            <w:tcMar>
+              <w:top w:type="dxa" w:w="35"/>
+              <w:left w:type="dxa" w:w="90"/>
+              <w:bottom w:type="dxa" w:w="35"/>
+              <w:right w:type="dxa" w:w="90"/>
+            </w:tcMar>
+          </w:tcPr>
+          <w:p>
+            <w:r>
+              <w:t xml:space="preserve">Page the form was sent from</w:t>
+            </w:r>
+          </w:p>
+        </w:tc>
+        <w:tc>
+          <w:tcPr>
+            <w:tcW w:type="dxa" w:w="2400"/>
+            <w:tcBorders>
+              <w:top w:val="single" w:color="DCD7E3" w:sz="4"/>
+              <w:left w:val="single" w:color="DCD7E3" w:sz="4"/>
+              <w:bottom w:val="single" w:color="DCD7E3" w:sz="4"/>
+              <w:right w:val="single" w:color="DCD7E3" w:sz="4"/>
+            </w:tcBorders>
+            <w:tcMar>
+              <w:top w:type="dxa" w:w="35"/>
+              <w:left w:type="dxa" w:w="90"/>
+              <w:bottom w:type="dxa" w:w="35"/>
+              <w:right w:type="dxa" w:w="90"/>
+            </w:tcMar>
+          </w:tcPr>
+          <w:p>
+            <w:r>
+              <w:t xml:space="preserve">Optional</w:t>
             </w:r>
           </w:p>
         </w:tc>
@@ -1236,501 +1879,26 @@
       <w:tr>
         <w:tc>
           <w:tcPr>
-            <w:tcW w:type="dxa" w:w="1450"/>
-            <w:tcBorders>
-              <w:top w:val="single" w:color="DCD7E3" w:sz="4"/>
-              <w:left w:val="single" w:color="DCD7E3" w:sz="4"/>
-              <w:bottom w:val="single" w:color="DCD7E3" w:sz="4"/>
-              <w:right w:val="single" w:color="DCD7E3" w:sz="4"/>
-            </w:tcBorders>
-            <w:tcMar>
-              <w:top w:type="dxa" w:w="60"/>
-              <w:left w:type="dxa" w:w="100"/>
-              <w:bottom w:type="dxa" w:w="60"/>
-              <w:right w:type="dxa" w:w="100"/>
+            <w:tcW w:type="dxa" w:w="2350"/>
+            <w:tcBorders>
+              <w:top w:val="single" w:color="DCD7E3" w:sz="4"/>
+              <w:left w:val="single" w:color="DCD7E3" w:sz="4"/>
+              <w:bottom w:val="single" w:color="DCD7E3" w:sz="4"/>
+              <w:right w:val="single" w:color="DCD7E3" w:sz="4"/>
+            </w:tcBorders>
+            <w:tcMar>
+              <w:top w:type="dxa" w:w="35"/>
+              <w:left w:type="dxa" w:w="90"/>
+              <w:bottom w:type="dxa" w:w="35"/>
+              <w:right w:type="dxa" w:w="90"/>
             </w:tcMar>
           </w:tcPr>
           <w:p>
             <w:r>
               <w:rPr>
                 <w:rFonts w:ascii="Consolas" w:cs="Consolas" w:eastAsia="Consolas" w:hAnsi="Consolas"/>
-                <w:sz w:val="19"/>
-                <w:szCs w:val="19"/>
-              </w:rPr>
-              <w:t xml:space="preserve">phone</w:t>
-            </w:r>
-          </w:p>
-        </w:tc>
-        <w:tc>
-          <w:tcPr>
-            <w:tcW w:type="dxa" w:w="1050"/>
-            <w:tcBorders>
-              <w:top w:val="single" w:color="DCD7E3" w:sz="4"/>
-              <w:left w:val="single" w:color="DCD7E3" w:sz="4"/>
-              <w:bottom w:val="single" w:color="DCD7E3" w:sz="4"/>
-              <w:right w:val="single" w:color="DCD7E3" w:sz="4"/>
-            </w:tcBorders>
-            <w:tcMar>
-              <w:top w:type="dxa" w:w="60"/>
-              <w:left w:type="dxa" w:w="100"/>
-              <w:bottom w:type="dxa" w:w="60"/>
-              <w:right w:type="dxa" w:w="100"/>
-            </w:tcMar>
-          </w:tcPr>
-          <w:p>
-            <w:r>
-              <w:t xml:space="preserve">Yes</w:t>
-            </w:r>
-          </w:p>
-        </w:tc>
-        <w:tc>
-          <w:tcPr>
-            <w:tcW w:type="dxa" w:w="4038"/>
-            <w:tcBorders>
-              <w:top w:val="single" w:color="DCD7E3" w:sz="4"/>
-              <w:left w:val="single" w:color="DCD7E3" w:sz="4"/>
-              <w:bottom w:val="single" w:color="DCD7E3" w:sz="4"/>
-              <w:right w:val="single" w:color="DCD7E3" w:sz="4"/>
-            </w:tcBorders>
-            <w:tcMar>
-              <w:top w:type="dxa" w:w="60"/>
-              <w:left w:type="dxa" w:w="100"/>
-              <w:bottom w:type="dxa" w:w="60"/>
-              <w:right w:type="dxa" w:w="100"/>
-            </w:tcMar>
-          </w:tcPr>
-          <w:p>
-            <w:r>
-              <w:t xml:space="preserve">Phone / WhatsApp, at least 7 digits, up to 40</w:t>
-            </w:r>
-          </w:p>
-        </w:tc>
-        <w:tc>
-          <w:tcPr>
-            <w:tcW w:type="dxa" w:w="3100"/>
-            <w:tcBorders>
-              <w:top w:val="single" w:color="DCD7E3" w:sz="4"/>
-              <w:left w:val="single" w:color="DCD7E3" w:sz="4"/>
-              <w:bottom w:val="single" w:color="DCD7E3" w:sz="4"/>
-              <w:right w:val="single" w:color="DCD7E3" w:sz="4"/>
-            </w:tcBorders>
-            <w:tcMar>
-              <w:top w:type="dxa" w:w="60"/>
-              <w:left w:type="dxa" w:w="100"/>
-              <w:bottom w:type="dxa" w:w="60"/>
-              <w:right w:type="dxa" w:w="100"/>
-            </w:tcMar>
-          </w:tcPr>
-          <w:p>
-            <w:r>
-              <w:t xml:space="preserve">+971 50 123 4567</w:t>
-            </w:r>
-          </w:p>
-        </w:tc>
-      </w:tr>
-      <w:tr>
-        <w:tc>
-          <w:tcPr>
-            <w:tcW w:type="dxa" w:w="1450"/>
-            <w:tcBorders>
-              <w:top w:val="single" w:color="DCD7E3" w:sz="4"/>
-              <w:left w:val="single" w:color="DCD7E3" w:sz="4"/>
-              <w:bottom w:val="single" w:color="DCD7E3" w:sz="4"/>
-              <w:right w:val="single" w:color="DCD7E3" w:sz="4"/>
-            </w:tcBorders>
-            <w:tcMar>
-              <w:top w:type="dxa" w:w="60"/>
-              <w:left w:type="dxa" w:w="100"/>
-              <w:bottom w:type="dxa" w:w="60"/>
-              <w:right w:type="dxa" w:w="100"/>
-            </w:tcMar>
-          </w:tcPr>
-          <w:p>
-            <w:r>
-              <w:rPr>
-                <w:rFonts w:ascii="Consolas" w:cs="Consolas" w:eastAsia="Consolas" w:hAnsi="Consolas"/>
-                <w:sz w:val="19"/>
-                <w:szCs w:val="19"/>
-              </w:rPr>
-              <w:t xml:space="preserve">website</w:t>
-            </w:r>
-          </w:p>
-        </w:tc>
-        <w:tc>
-          <w:tcPr>
-            <w:tcW w:type="dxa" w:w="1050"/>
-            <w:tcBorders>
-              <w:top w:val="single" w:color="DCD7E3" w:sz="4"/>
-              <w:left w:val="single" w:color="DCD7E3" w:sz="4"/>
-              <w:bottom w:val="single" w:color="DCD7E3" w:sz="4"/>
-              <w:right w:val="single" w:color="DCD7E3" w:sz="4"/>
-            </w:tcBorders>
-            <w:tcMar>
-              <w:top w:type="dxa" w:w="60"/>
-              <w:left w:type="dxa" w:w="100"/>
-              <w:bottom w:type="dxa" w:w="60"/>
-              <w:right w:type="dxa" w:w="100"/>
-            </w:tcMar>
-          </w:tcPr>
-          <w:p>
-            <w:r>
-              <w:t xml:space="preserve">No</w:t>
-            </w:r>
-          </w:p>
-        </w:tc>
-        <w:tc>
-          <w:tcPr>
-            <w:tcW w:type="dxa" w:w="4038"/>
-            <w:tcBorders>
-              <w:top w:val="single" w:color="DCD7E3" w:sz="4"/>
-              <w:left w:val="single" w:color="DCD7E3" w:sz="4"/>
-              <w:bottom w:val="single" w:color="DCD7E3" w:sz="4"/>
-              <w:right w:val="single" w:color="DCD7E3" w:sz="4"/>
-            </w:tcBorders>
-            <w:tcMar>
-              <w:top w:type="dxa" w:w="60"/>
-              <w:left w:type="dxa" w:w="100"/>
-              <w:bottom w:type="dxa" w:w="60"/>
-              <w:right w:type="dxa" w:w="100"/>
-            </w:tcMar>
-          </w:tcPr>
-          <w:p>
-            <w:r>
-              <w:t xml:space="preserve">Website or Instagram, up to 300</w:t>
-            </w:r>
-          </w:p>
-        </w:tc>
-        <w:tc>
-          <w:tcPr>
-            <w:tcW w:type="dxa" w:w="3100"/>
-            <w:tcBorders>
-              <w:top w:val="single" w:color="DCD7E3" w:sz="4"/>
-              <w:left w:val="single" w:color="DCD7E3" w:sz="4"/>
-              <w:bottom w:val="single" w:color="DCD7E3" w:sz="4"/>
-              <w:right w:val="single" w:color="DCD7E3" w:sz="4"/>
-            </w:tcBorders>
-            <w:tcMar>
-              <w:top w:type="dxa" w:w="60"/>
-              <w:left w:type="dxa" w:w="100"/>
-              <w:bottom w:type="dxa" w:w="60"/>
-              <w:right w:type="dxa" w:w="100"/>
-            </w:tcMar>
-          </w:tcPr>
-          <w:p>
-            <w:r>
-              <w:t xml:space="preserve">@littlekickersdxb</w:t>
-            </w:r>
-          </w:p>
-        </w:tc>
-      </w:tr>
-      <w:tr>
-        <w:tc>
-          <w:tcPr>
-            <w:tcW w:type="dxa" w:w="1450"/>
-            <w:tcBorders>
-              <w:top w:val="single" w:color="DCD7E3" w:sz="4"/>
-              <w:left w:val="single" w:color="DCD7E3" w:sz="4"/>
-              <w:bottom w:val="single" w:color="DCD7E3" w:sz="4"/>
-              <w:right w:val="single" w:color="DCD7E3" w:sz="4"/>
-            </w:tcBorders>
-            <w:tcMar>
-              <w:top w:type="dxa" w:w="60"/>
-              <w:left w:type="dxa" w:w="100"/>
-              <w:bottom w:type="dxa" w:w="60"/>
-              <w:right w:type="dxa" w:w="100"/>
-            </w:tcMar>
-          </w:tcPr>
-          <w:p>
-            <w:r>
-              <w:rPr>
-                <w:rFonts w:ascii="Consolas" w:cs="Consolas" w:eastAsia="Consolas" w:hAnsi="Consolas"/>
-                <w:sz w:val="19"/>
-                <w:szCs w:val="19"/>
-              </w:rPr>
-              <w:t xml:space="preserve">message</w:t>
-            </w:r>
-          </w:p>
-        </w:tc>
-        <w:tc>
-          <w:tcPr>
-            <w:tcW w:type="dxa" w:w="1050"/>
-            <w:tcBorders>
-              <w:top w:val="single" w:color="DCD7E3" w:sz="4"/>
-              <w:left w:val="single" w:color="DCD7E3" w:sz="4"/>
-              <w:bottom w:val="single" w:color="DCD7E3" w:sz="4"/>
-              <w:right w:val="single" w:color="DCD7E3" w:sz="4"/>
-            </w:tcBorders>
-            <w:tcMar>
-              <w:top w:type="dxa" w:w="60"/>
-              <w:left w:type="dxa" w:w="100"/>
-              <w:bottom w:type="dxa" w:w="60"/>
-              <w:right w:type="dxa" w:w="100"/>
-            </w:tcMar>
-          </w:tcPr>
-          <w:p>
-            <w:r>
-              <w:t xml:space="preserve">No</w:t>
-            </w:r>
-          </w:p>
-        </w:tc>
-        <w:tc>
-          <w:tcPr>
-            <w:tcW w:type="dxa" w:w="4038"/>
-            <w:tcBorders>
-              <w:top w:val="single" w:color="DCD7E3" w:sz="4"/>
-              <w:left w:val="single" w:color="DCD7E3" w:sz="4"/>
-              <w:bottom w:val="single" w:color="DCD7E3" w:sz="4"/>
-              <w:right w:val="single" w:color="DCD7E3" w:sz="4"/>
-            </w:tcBorders>
-            <w:tcMar>
-              <w:top w:type="dxa" w:w="60"/>
-              <w:left w:type="dxa" w:w="100"/>
-              <w:bottom w:type="dxa" w:w="60"/>
-              <w:right w:type="dxa" w:w="100"/>
-            </w:tcMar>
-          </w:tcPr>
-          <w:p>
-            <w:r>
-              <w:t xml:space="preserve">Free text, up to 2000</w:t>
-            </w:r>
-          </w:p>
-        </w:tc>
-        <w:tc>
-          <w:tcPr>
-            <w:tcW w:type="dxa" w:w="3100"/>
-            <w:tcBorders>
-              <w:top w:val="single" w:color="DCD7E3" w:sz="4"/>
-              <w:left w:val="single" w:color="DCD7E3" w:sz="4"/>
-              <w:bottom w:val="single" w:color="DCD7E3" w:sz="4"/>
-              <w:right w:val="single" w:color="DCD7E3" w:sz="4"/>
-            </w:tcBorders>
-            <w:tcMar>
-              <w:top w:type="dxa" w:w="60"/>
-              <w:left w:type="dxa" w:w="100"/>
-              <w:bottom w:type="dxa" w:w="60"/>
-              <w:right w:type="dxa" w:w="100"/>
-            </w:tcMar>
-          </w:tcPr>
-          <w:p>
-            <w:r>
-              <w:t xml:space="preserve">We'd love a booth.</w:t>
-            </w:r>
-          </w:p>
-        </w:tc>
-      </w:tr>
-      <w:tr>
-        <w:tc>
-          <w:tcPr>
-            <w:tcW w:type="dxa" w:w="1450"/>
-            <w:tcBorders>
-              <w:top w:val="single" w:color="DCD7E3" w:sz="4"/>
-              <w:left w:val="single" w:color="DCD7E3" w:sz="4"/>
-              <w:bottom w:val="single" w:color="DCD7E3" w:sz="4"/>
-              <w:right w:val="single" w:color="DCD7E3" w:sz="4"/>
-            </w:tcBorders>
-            <w:tcMar>
-              <w:top w:type="dxa" w:w="60"/>
-              <w:left w:type="dxa" w:w="100"/>
-              <w:bottom w:type="dxa" w:w="60"/>
-              <w:right w:type="dxa" w:w="100"/>
-            </w:tcMar>
-          </w:tcPr>
-          <w:p>
-            <w:r>
-              <w:rPr>
-                <w:rFonts w:ascii="Consolas" w:cs="Consolas" w:eastAsia="Consolas" w:hAnsi="Consolas"/>
-                <w:sz w:val="19"/>
-                <w:szCs w:val="19"/>
-              </w:rPr>
-              <w:t xml:space="preserve">consent</w:t>
-            </w:r>
-          </w:p>
-        </w:tc>
-        <w:tc>
-          <w:tcPr>
-            <w:tcW w:type="dxa" w:w="1050"/>
-            <w:tcBorders>
-              <w:top w:val="single" w:color="DCD7E3" w:sz="4"/>
-              <w:left w:val="single" w:color="DCD7E3" w:sz="4"/>
-              <w:bottom w:val="single" w:color="DCD7E3" w:sz="4"/>
-              <w:right w:val="single" w:color="DCD7E3" w:sz="4"/>
-            </w:tcBorders>
-            <w:tcMar>
-              <w:top w:type="dxa" w:w="60"/>
-              <w:left w:type="dxa" w:w="100"/>
-              <w:bottom w:type="dxa" w:w="60"/>
-              <w:right w:type="dxa" w:w="100"/>
-            </w:tcMar>
-          </w:tcPr>
-          <w:p>
-            <w:r>
-              <w:t xml:space="preserve">Yes</w:t>
-            </w:r>
-          </w:p>
-        </w:tc>
-        <w:tc>
-          <w:tcPr>
-            <w:tcW w:type="dxa" w:w="4038"/>
-            <w:tcBorders>
-              <w:top w:val="single" w:color="DCD7E3" w:sz="4"/>
-              <w:left w:val="single" w:color="DCD7E3" w:sz="4"/>
-              <w:bottom w:val="single" w:color="DCD7E3" w:sz="4"/>
-              <w:right w:val="single" w:color="DCD7E3" w:sz="4"/>
-            </w:tcBorders>
-            <w:tcMar>
-              <w:top w:type="dxa" w:w="60"/>
-              <w:left w:type="dxa" w:w="100"/>
-              <w:bottom w:type="dxa" w:w="60"/>
-              <w:right w:type="dxa" w:w="100"/>
-            </w:tcMar>
-          </w:tcPr>
-          <w:p>
-            <w:r>
-              <w:t xml:space="preserve">Must be true (agreed to be contacted)</w:t>
-            </w:r>
-          </w:p>
-        </w:tc>
-        <w:tc>
-          <w:tcPr>
-            <w:tcW w:type="dxa" w:w="3100"/>
-            <w:tcBorders>
-              <w:top w:val="single" w:color="DCD7E3" w:sz="4"/>
-              <w:left w:val="single" w:color="DCD7E3" w:sz="4"/>
-              <w:bottom w:val="single" w:color="DCD7E3" w:sz="4"/>
-              <w:right w:val="single" w:color="DCD7E3" w:sz="4"/>
-            </w:tcBorders>
-            <w:tcMar>
-              <w:top w:type="dxa" w:w="60"/>
-              <w:left w:type="dxa" w:w="100"/>
-              <w:bottom w:type="dxa" w:w="60"/>
-              <w:right w:type="dxa" w:w="100"/>
-            </w:tcMar>
-          </w:tcPr>
-          <w:p>
-            <w:r>
-              <w:t xml:space="preserve">true</w:t>
-            </w:r>
-          </w:p>
-        </w:tc>
-      </w:tr>
-      <w:tr>
-        <w:tc>
-          <w:tcPr>
-            <w:tcW w:type="dxa" w:w="1450"/>
-            <w:tcBorders>
-              <w:top w:val="single" w:color="DCD7E3" w:sz="4"/>
-              <w:left w:val="single" w:color="DCD7E3" w:sz="4"/>
-              <w:bottom w:val="single" w:color="DCD7E3" w:sz="4"/>
-              <w:right w:val="single" w:color="DCD7E3" w:sz="4"/>
-            </w:tcBorders>
-            <w:tcMar>
-              <w:top w:type="dxa" w:w="60"/>
-              <w:left w:type="dxa" w:w="100"/>
-              <w:bottom w:type="dxa" w:w="60"/>
-              <w:right w:type="dxa" w:w="100"/>
-            </w:tcMar>
-          </w:tcPr>
-          <w:p>
-            <w:r>
-              <w:rPr>
-                <w:rFonts w:ascii="Consolas" w:cs="Consolas" w:eastAsia="Consolas" w:hAnsi="Consolas"/>
-                <w:sz w:val="19"/>
-                <w:szCs w:val="19"/>
-              </w:rPr>
-              <w:t xml:space="preserve">page</w:t>
-            </w:r>
-          </w:p>
-        </w:tc>
-        <w:tc>
-          <w:tcPr>
-            <w:tcW w:type="dxa" w:w="1050"/>
-            <w:tcBorders>
-              <w:top w:val="single" w:color="DCD7E3" w:sz="4"/>
-              <w:left w:val="single" w:color="DCD7E3" w:sz="4"/>
-              <w:bottom w:val="single" w:color="DCD7E3" w:sz="4"/>
-              <w:right w:val="single" w:color="DCD7E3" w:sz="4"/>
-            </w:tcBorders>
-            <w:tcMar>
-              <w:top w:type="dxa" w:w="60"/>
-              <w:left w:type="dxa" w:w="100"/>
-              <w:bottom w:type="dxa" w:w="60"/>
-              <w:right w:type="dxa" w:w="100"/>
-            </w:tcMar>
-          </w:tcPr>
-          <w:p>
-            <w:r>
-              <w:t xml:space="preserve">No</w:t>
-            </w:r>
-          </w:p>
-        </w:tc>
-        <w:tc>
-          <w:tcPr>
-            <w:tcW w:type="dxa" w:w="4038"/>
-            <w:tcBorders>
-              <w:top w:val="single" w:color="DCD7E3" w:sz="4"/>
-              <w:left w:val="single" w:color="DCD7E3" w:sz="4"/>
-              <w:bottom w:val="single" w:color="DCD7E3" w:sz="4"/>
-              <w:right w:val="single" w:color="DCD7E3" w:sz="4"/>
-            </w:tcBorders>
-            <w:tcMar>
-              <w:top w:type="dxa" w:w="60"/>
-              <w:left w:type="dxa" w:w="100"/>
-              <w:bottom w:type="dxa" w:w="60"/>
-              <w:right w:type="dxa" w:w="100"/>
-            </w:tcMar>
-          </w:tcPr>
-          <w:p>
-            <w:r>
-              <w:t xml:space="preserve">Page the form was sent from</w:t>
-            </w:r>
-          </w:p>
-        </w:tc>
-        <w:tc>
-          <w:tcPr>
-            <w:tcW w:type="dxa" w:w="3100"/>
-            <w:tcBorders>
-              <w:top w:val="single" w:color="DCD7E3" w:sz="4"/>
-              <w:left w:val="single" w:color="DCD7E3" w:sz="4"/>
-              <w:bottom w:val="single" w:color="DCD7E3" w:sz="4"/>
-              <w:right w:val="single" w:color="DCD7E3" w:sz="4"/>
-            </w:tcBorders>
-            <w:tcMar>
-              <w:top w:type="dxa" w:w="60"/>
-              <w:left w:type="dxa" w:w="100"/>
-              <w:bottom w:type="dxa" w:w="60"/>
-              <w:right w:type="dxa" w:w="100"/>
-            </w:tcMar>
-          </w:tcPr>
-          <w:p>
-            <w:r>
-              <w:t xml:space="preserve">/partner-with-us</w:t>
-            </w:r>
-          </w:p>
-        </w:tc>
-      </w:tr>
-      <w:tr>
-        <w:tc>
-          <w:tcPr>
-            <w:tcW w:type="dxa" w:w="1450"/>
-            <w:tcBorders>
-              <w:top w:val="single" w:color="DCD7E3" w:sz="4"/>
-              <w:left w:val="single" w:color="DCD7E3" w:sz="4"/>
-              <w:bottom w:val="single" w:color="DCD7E3" w:sz="4"/>
-              <w:right w:val="single" w:color="DCD7E3" w:sz="4"/>
-            </w:tcBorders>
-            <w:tcMar>
-              <w:top w:type="dxa" w:w="60"/>
-              <w:left w:type="dxa" w:w="100"/>
-              <w:bottom w:type="dxa" w:w="60"/>
-              <w:right w:type="dxa" w:w="100"/>
-            </w:tcMar>
-          </w:tcPr>
-          <w:p>
-            <w:r>
-              <w:rPr>
-                <w:rFonts w:ascii="Consolas" w:cs="Consolas" w:eastAsia="Consolas" w:hAnsi="Consolas"/>
-                <w:sz w:val="19"/>
-                <w:szCs w:val="19"/>
+                <w:sz w:val="18"/>
+                <w:szCs w:val="18"/>
               </w:rPr>
               <w:t xml:space="preserve">company_url</w:t>
             </w:r>
@@ -1746,10 +1914,10 @@
               <w:right w:val="single" w:color="DCD7E3" w:sz="4"/>
             </w:tcBorders>
             <w:tcMar>
-              <w:top w:type="dxa" w:w="60"/>
-              <w:left w:type="dxa" w:w="100"/>
-              <w:bottom w:type="dxa" w:w="60"/>
-              <w:right w:type="dxa" w:w="100"/>
+              <w:top w:type="dxa" w:w="35"/>
+              <w:left w:type="dxa" w:w="90"/>
+              <w:bottom w:type="dxa" w:w="35"/>
+              <w:right w:type="dxa" w:w="90"/>
             </w:tcMar>
           </w:tcPr>
           <w:p>
@@ -1760,45 +1928,45 @@
         </w:tc>
         <w:tc>
           <w:tcPr>
-            <w:tcW w:type="dxa" w:w="4038"/>
-            <w:tcBorders>
-              <w:top w:val="single" w:color="DCD7E3" w:sz="4"/>
-              <w:left w:val="single" w:color="DCD7E3" w:sz="4"/>
-              <w:bottom w:val="single" w:color="DCD7E3" w:sz="4"/>
-              <w:right w:val="single" w:color="DCD7E3" w:sz="4"/>
-            </w:tcBorders>
-            <w:tcMar>
-              <w:top w:type="dxa" w:w="60"/>
-              <w:left w:type="dxa" w:w="100"/>
-              <w:bottom w:type="dxa" w:w="60"/>
-              <w:right w:type="dxa" w:w="100"/>
-            </w:tcMar>
-          </w:tcPr>
-          <w:p>
-            <w:r>
-              <w:t xml:space="preserve">Hidden spam trap. Real people leave it empty</w:t>
-            </w:r>
-          </w:p>
-        </w:tc>
-        <w:tc>
-          <w:tcPr>
-            <w:tcW w:type="dxa" w:w="3100"/>
-            <w:tcBorders>
-              <w:top w:val="single" w:color="DCD7E3" w:sz="4"/>
-              <w:left w:val="single" w:color="DCD7E3" w:sz="4"/>
-              <w:bottom w:val="single" w:color="DCD7E3" w:sz="4"/>
-              <w:right w:val="single" w:color="DCD7E3" w:sz="4"/>
-            </w:tcBorders>
-            <w:tcMar>
-              <w:top w:type="dxa" w:w="60"/>
-              <w:left w:type="dxa" w:w="100"/>
-              <w:bottom w:type="dxa" w:w="60"/>
-              <w:right w:type="dxa" w:w="100"/>
-            </w:tcMar>
-          </w:tcPr>
-          <w:p>
-            <w:r>
-              <w:t xml:space="preserve">(empty)</w:t>
+            <w:tcW w:type="dxa" w:w="3838"/>
+            <w:tcBorders>
+              <w:top w:val="single" w:color="DCD7E3" w:sz="4"/>
+              <w:left w:val="single" w:color="DCD7E3" w:sz="4"/>
+              <w:bottom w:val="single" w:color="DCD7E3" w:sz="4"/>
+              <w:right w:val="single" w:color="DCD7E3" w:sz="4"/>
+            </w:tcBorders>
+            <w:tcMar>
+              <w:top w:type="dxa" w:w="35"/>
+              <w:left w:type="dxa" w:w="90"/>
+              <w:bottom w:type="dxa" w:w="35"/>
+              <w:right w:type="dxa" w:w="90"/>
+            </w:tcMar>
+          </w:tcPr>
+          <w:p>
+            <w:r>
+              <w:t xml:space="preserve">Hidden spam trap. Real people leave it empty. Don't save</w:t>
+            </w:r>
+          </w:p>
+        </w:tc>
+        <w:tc>
+          <w:tcPr>
+            <w:tcW w:type="dxa" w:w="2400"/>
+            <w:tcBorders>
+              <w:top w:val="single" w:color="DCD7E3" w:sz="4"/>
+              <w:left w:val="single" w:color="DCD7E3" w:sz="4"/>
+              <w:bottom w:val="single" w:color="DCD7E3" w:sz="4"/>
+              <w:right w:val="single" w:color="DCD7E3" w:sz="4"/>
+            </w:tcBorders>
+            <w:tcMar>
+              <w:top w:type="dxa" w:w="35"/>
+              <w:left w:type="dxa" w:w="90"/>
+              <w:bottom w:type="dxa" w:w="35"/>
+              <w:right w:type="dxa" w:w="90"/>
+            </w:tcMar>
+          </w:tcPr>
+          <w:p>
+            <w:r>
+              <w:t xml:space="preserve">-</w:t>
             </w:r>
           </w:p>
         </w:tc>
@@ -1860,8 +2028,8 @@
       <w:r>
         <w:rPr>
           <w:rFonts w:ascii="Consolas" w:cs="Consolas" w:eastAsia="Consolas" w:hAnsi="Consolas"/>
-          <w:sz w:val="16"/>
-          <w:szCs w:val="16"/>
+          <w:sz w:val="15"/>
+          <w:szCs w:val="15"/>
         </w:rPr>
         <w:t xml:space="preserve">POST /api/partner-applications</w:t>
       </w:r>
@@ -1875,8 +2043,8 @@
       <w:r>
         <w:rPr>
           <w:rFonts w:ascii="Consolas" w:cs="Consolas" w:eastAsia="Consolas" w:hAnsi="Consolas"/>
-          <w:sz w:val="16"/>
-          <w:szCs w:val="16"/>
+          <w:sz w:val="15"/>
+          <w:szCs w:val="15"/>
         </w:rPr>
         <w:t xml:space="preserve">Origin: https://www.activatemefest.com</w:t>
       </w:r>
@@ -1890,8 +2058,8 @@
       <w:r>
         <w:rPr>
           <w:rFonts w:ascii="Consolas" w:cs="Consolas" w:eastAsia="Consolas" w:hAnsi="Consolas"/>
-          <w:sz w:val="16"/>
-          <w:szCs w:val="16"/>
+          <w:sz w:val="15"/>
+          <w:szCs w:val="15"/>
         </w:rPr>
         <w:t xml:space="preserve">Content-Type: application/json</w:t>
       </w:r>
@@ -1905,8 +2073,8 @@
       <w:r>
         <w:rPr>
           <w:rFonts w:ascii="Consolas" w:cs="Consolas" w:eastAsia="Consolas" w:hAnsi="Consolas"/>
-          <w:sz w:val="16"/>
-          <w:szCs w:val="16"/>
+          <w:sz w:val="15"/>
+          <w:szCs w:val="15"/>
         </w:rPr>
         <w:t xml:space="preserve"> </w:t>
       </w:r>
@@ -1920,8 +2088,8 @@
       <w:r>
         <w:rPr>
           <w:rFonts w:ascii="Consolas" w:cs="Consolas" w:eastAsia="Consolas" w:hAnsi="Consolas"/>
-          <w:sz w:val="16"/>
-          <w:szCs w:val="16"/>
+          <w:sz w:val="15"/>
+          <w:szCs w:val="15"/>
         </w:rPr>
         <w:t xml:space="preserve">{</w:t>
       </w:r>
@@ -1935,8 +2103,8 @@
       <w:r>
         <w:rPr>
           <w:rFonts w:ascii="Consolas" w:cs="Consolas" w:eastAsia="Consolas" w:hAnsi="Consolas"/>
-          <w:sz w:val="16"/>
-          <w:szCs w:val="16"/>
+          <w:sz w:val="15"/>
+          <w:szCs w:val="15"/>
         </w:rPr>
         <w:t xml:space="preserve">  "event": "activate-me-festival",</w:t>
       </w:r>
@@ -1950,10 +2118,10 @@
       <w:r>
         <w:rPr>
           <w:rFonts w:ascii="Consolas" w:cs="Consolas" w:eastAsia="Consolas" w:hAnsi="Consolas"/>
-          <w:sz w:val="16"/>
-          <w:szCs w:val="16"/>
-        </w:rPr>
-        <w:t xml:space="preserve">  "org": "Little Kickers Dubai",</w:t>
+          <w:sz w:val="15"/>
+          <w:szCs w:val="15"/>
+        </w:rPr>
+        <w:t xml:space="preserve">  "first_name": "Sara",</w:t>
       </w:r>
     </w:p>
     <w:p>
@@ -1965,10 +2133,10 @@
       <w:r>
         <w:rPr>
           <w:rFonts w:ascii="Consolas" w:cs="Consolas" w:eastAsia="Consolas" w:hAnsi="Consolas"/>
-          <w:sz w:val="16"/>
-          <w:szCs w:val="16"/>
-        </w:rPr>
-        <w:t xml:space="preserve">  "type": "Academy / club",</w:t>
+          <w:sz w:val="15"/>
+          <w:szCs w:val="15"/>
+        </w:rPr>
+        <w:t xml:space="preserve">  "last_name": "Ahmed",</w:t>
       </w:r>
     </w:p>
     <w:p>
@@ -1980,10 +2148,10 @@
       <w:r>
         <w:rPr>
           <w:rFonts w:ascii="Consolas" w:cs="Consolas" w:eastAsia="Consolas" w:hAnsi="Consolas"/>
-          <w:sz w:val="16"/>
-          <w:szCs w:val="16"/>
-        </w:rPr>
-        <w:t xml:space="preserve">  "activity": "Kids football academy, ages 4-14",</w:t>
+          <w:sz w:val="15"/>
+          <w:szCs w:val="15"/>
+        </w:rPr>
+        <w:t xml:space="preserve">  "email": "sara@example.com",</w:t>
       </w:r>
     </w:p>
     <w:p>
@@ -1995,10 +2163,10 @@
       <w:r>
         <w:rPr>
           <w:rFonts w:ascii="Consolas" w:cs="Consolas" w:eastAsia="Consolas" w:hAnsi="Consolas"/>
-          <w:sz w:val="16"/>
-          <w:szCs w:val="16"/>
-        </w:rPr>
-        <w:t xml:space="preserve">  "interests": ["Title Sponsor", "Interactive Booths"],</w:t>
+          <w:sz w:val="15"/>
+          <w:szCs w:val="15"/>
+        </w:rPr>
+        <w:t xml:space="preserve">  "company_name": "Little Kickers Dubai",</w:t>
       </w:r>
     </w:p>
     <w:p>
@@ -2010,10 +2178,10 @@
       <w:r>
         <w:rPr>
           <w:rFonts w:ascii="Consolas" w:cs="Consolas" w:eastAsia="Consolas" w:hAnsi="Consolas"/>
-          <w:sz w:val="16"/>
-          <w:szCs w:val="16"/>
-        </w:rPr>
-        <w:t xml:space="preserve">  "name": "Sara Ahmed",</w:t>
+          <w:sz w:val="15"/>
+          <w:szCs w:val="15"/>
+        </w:rPr>
+        <w:t xml:space="preserve">  "mobile_number": "+971 50 123 4567",</w:t>
       </w:r>
     </w:p>
     <w:p>
@@ -2025,10 +2193,10 @@
       <w:r>
         <w:rPr>
           <w:rFonts w:ascii="Consolas" w:cs="Consolas" w:eastAsia="Consolas" w:hAnsi="Consolas"/>
-          <w:sz w:val="16"/>
-          <w:szCs w:val="16"/>
-        </w:rPr>
-        <w:t xml:space="preserve">  "role": "Founder",</w:t>
+          <w:sz w:val="15"/>
+          <w:szCs w:val="15"/>
+        </w:rPr>
+        <w:t xml:space="preserve">  "designation": "Founder",</w:t>
       </w:r>
     </w:p>
     <w:p>
@@ -2040,10 +2208,10 @@
       <w:r>
         <w:rPr>
           <w:rFonts w:ascii="Consolas" w:cs="Consolas" w:eastAsia="Consolas" w:hAnsi="Consolas"/>
-          <w:sz w:val="16"/>
-          <w:szCs w:val="16"/>
-        </w:rPr>
-        <w:t xml:space="preserve">  "email": "sara@example.com",</w:t>
+          <w:sz w:val="15"/>
+          <w:szCs w:val="15"/>
+        </w:rPr>
+        <w:t xml:space="preserve">  "organisation_type": "Academy / club",</w:t>
       </w:r>
     </w:p>
     <w:p>
@@ -2055,10 +2223,10 @@
       <w:r>
         <w:rPr>
           <w:rFonts w:ascii="Consolas" w:cs="Consolas" w:eastAsia="Consolas" w:hAnsi="Consolas"/>
-          <w:sz w:val="16"/>
-          <w:szCs w:val="16"/>
-        </w:rPr>
-        <w:t xml:space="preserve">  "phone": "+971 50 123 4567",</w:t>
+          <w:sz w:val="15"/>
+          <w:szCs w:val="15"/>
+        </w:rPr>
+        <w:t xml:space="preserve">  "interests": ["Title Sponsor", "Interactive Booths"],</w:t>
       </w:r>
     </w:p>
     <w:p>
@@ -2070,10 +2238,10 @@
       <w:r>
         <w:rPr>
           <w:rFonts w:ascii="Consolas" w:cs="Consolas" w:eastAsia="Consolas" w:hAnsi="Consolas"/>
-          <w:sz w:val="16"/>
-          <w:szCs w:val="16"/>
-        </w:rPr>
-        <w:t xml:space="preserve">  "website": "@littlekickersdxb",</w:t>
+          <w:sz w:val="15"/>
+          <w:szCs w:val="15"/>
+        </w:rPr>
+        <w:t xml:space="preserve">  "activity": "Kids football academy, ages 4-14",</w:t>
       </w:r>
     </w:p>
     <w:p>
@@ -2085,10 +2253,10 @@
       <w:r>
         <w:rPr>
           <w:rFonts w:ascii="Consolas" w:cs="Consolas" w:eastAsia="Consolas" w:hAnsi="Consolas"/>
-          <w:sz w:val="16"/>
-          <w:szCs w:val="16"/>
-        </w:rPr>
-        <w:t xml:space="preserve">  "message": "We'd love a booth on both days.",</w:t>
+          <w:sz w:val="15"/>
+          <w:szCs w:val="15"/>
+        </w:rPr>
+        <w:t xml:space="preserve">  "website": "@littlekickersdxb",</w:t>
       </w:r>
     </w:p>
     <w:p>
@@ -2100,10 +2268,10 @@
       <w:r>
         <w:rPr>
           <w:rFonts w:ascii="Consolas" w:cs="Consolas" w:eastAsia="Consolas" w:hAnsi="Consolas"/>
-          <w:sz w:val="16"/>
-          <w:szCs w:val="16"/>
-        </w:rPr>
-        <w:t xml:space="preserve">  "consent": true,</w:t>
+          <w:sz w:val="15"/>
+          <w:szCs w:val="15"/>
+        </w:rPr>
+        <w:t xml:space="preserve">  "message": "We'd love a booth on both days.",</w:t>
       </w:r>
     </w:p>
     <w:p>
@@ -2115,10 +2283,10 @@
       <w:r>
         <w:rPr>
           <w:rFonts w:ascii="Consolas" w:cs="Consolas" w:eastAsia="Consolas" w:hAnsi="Consolas"/>
-          <w:sz w:val="16"/>
-          <w:szCs w:val="16"/>
-        </w:rPr>
-        <w:t xml:space="preserve">  "page": "/partner-with-us",</w:t>
+          <w:sz w:val="15"/>
+          <w:szCs w:val="15"/>
+        </w:rPr>
+        <w:t xml:space="preserve">  "consent": true,</w:t>
       </w:r>
     </w:p>
     <w:p>
@@ -2130,10 +2298,10 @@
       <w:r>
         <w:rPr>
           <w:rFonts w:ascii="Consolas" w:cs="Consolas" w:eastAsia="Consolas" w:hAnsi="Consolas"/>
-          <w:sz w:val="16"/>
-          <w:szCs w:val="16"/>
-        </w:rPr>
-        <w:t xml:space="preserve">  "company_url": ""</w:t>
+          <w:sz w:val="15"/>
+          <w:szCs w:val="15"/>
+        </w:rPr>
+        <w:t xml:space="preserve">  "page": "/partner-with-us",</w:t>
       </w:r>
     </w:p>
     <w:p>
@@ -2145,8 +2313,23 @@
       <w:r>
         <w:rPr>
           <w:rFonts w:ascii="Consolas" w:cs="Consolas" w:eastAsia="Consolas" w:hAnsi="Consolas"/>
-          <w:sz w:val="16"/>
-          <w:szCs w:val="16"/>
+          <w:sz w:val="15"/>
+          <w:szCs w:val="15"/>
+        </w:rPr>
+        <w:t xml:space="preserve">  "company_url": ""</w:t>
+      </w:r>
+    </w:p>
+    <w:p>
+      <w:pPr>
+        <w:shd w:fill="F5F2F9" w:color="auto" w:val="clear"/>
+        <w:spacing w:after="0" w:before="0"/>
+        <w:ind w:left="200" w:right="200"/>
+      </w:pPr>
+      <w:r>
+        <w:rPr>
+          <w:rFonts w:ascii="Consolas" w:cs="Consolas" w:eastAsia="Consolas" w:hAnsi="Consolas"/>
+          <w:sz w:val="15"/>
+          <w:szCs w:val="15"/>
         </w:rPr>
         <w:t xml:space="preserve">}</w:t>
       </w:r>
@@ -2183,8 +2366,8 @@
       <w:r>
         <w:rPr>
           <w:rFonts w:ascii="Consolas" w:cs="Consolas" w:eastAsia="Consolas" w:hAnsi="Consolas"/>
-          <w:sz w:val="19"/>
-          <w:szCs w:val="19"/>
+          <w:sz w:val="18"/>
+          <w:szCs w:val="18"/>
         </w:rPr>
         <w:t xml:space="preserve">403</w:t>
       </w:r>
@@ -2207,8 +2390,8 @@
       <w:r>
         <w:rPr>
           <w:rFonts w:ascii="Consolas" w:cs="Consolas" w:eastAsia="Consolas" w:hAnsi="Consolas"/>
-          <w:sz w:val="19"/>
-          <w:szCs w:val="19"/>
+          <w:sz w:val="18"/>
+          <w:szCs w:val="18"/>
         </w:rPr>
         <w:t xml:space="preserve">company_url</w:t>
       </w:r>
@@ -2218,8 +2401,8 @@
       <w:r>
         <w:rPr>
           <w:rFonts w:ascii="Consolas" w:cs="Consolas" w:eastAsia="Consolas" w:hAnsi="Consolas"/>
-          <w:sz w:val="19"/>
-          <w:szCs w:val="19"/>
+          <w:sz w:val="18"/>
+          <w:szCs w:val="18"/>
         </w:rPr>
         <w:t xml:space="preserve">ok</w:t>
       </w:r>
@@ -2239,10 +2422,10 @@
       <w:r>
         <w:rPr>
           <w:rFonts w:ascii="Consolas" w:cs="Consolas" w:eastAsia="Consolas" w:hAnsi="Consolas"/>
-          <w:sz w:val="19"/>
-          <w:szCs w:val="19"/>
-        </w:rPr>
-        <w:t xml:space="preserve">org</w:t>
+          <w:sz w:val="18"/>
+          <w:szCs w:val="18"/>
+        </w:rPr>
+        <w:t xml:space="preserve">first_name</w:t>
       </w:r>
       <w:r>
         <w:t xml:space="preserve">, </w:t>
@@ -2250,10 +2433,10 @@
       <w:r>
         <w:rPr>
           <w:rFonts w:ascii="Consolas" w:cs="Consolas" w:eastAsia="Consolas" w:hAnsi="Consolas"/>
-          <w:sz w:val="19"/>
-          <w:szCs w:val="19"/>
-        </w:rPr>
-        <w:t xml:space="preserve">name</w:t>
+          <w:sz w:val="18"/>
+          <w:szCs w:val="18"/>
+        </w:rPr>
+        <w:t xml:space="preserve">last_name</w:t>
       </w:r>
       <w:r>
         <w:t xml:space="preserve">, </w:t>
@@ -2261,8 +2444,30 @@
       <w:r>
         <w:rPr>
           <w:rFonts w:ascii="Consolas" w:cs="Consolas" w:eastAsia="Consolas" w:hAnsi="Consolas"/>
-          <w:sz w:val="19"/>
-          <w:szCs w:val="19"/>
+          <w:sz w:val="18"/>
+          <w:szCs w:val="18"/>
+        </w:rPr>
+        <w:t xml:space="preserve">company_name</w:t>
+      </w:r>
+      <w:r>
+        <w:t xml:space="preserve">, </w:t>
+      </w:r>
+      <w:r>
+        <w:rPr>
+          <w:rFonts w:ascii="Consolas" w:cs="Consolas" w:eastAsia="Consolas" w:hAnsi="Consolas"/>
+          <w:sz w:val="18"/>
+          <w:szCs w:val="18"/>
+        </w:rPr>
+        <w:t xml:space="preserve">organisation_type</w:t>
+      </w:r>
+      <w:r>
+        <w:t xml:space="preserve">, </w:t>
+      </w:r>
+      <w:r>
+        <w:rPr>
+          <w:rFonts w:ascii="Consolas" w:cs="Consolas" w:eastAsia="Consolas" w:hAnsi="Consolas"/>
+          <w:sz w:val="18"/>
+          <w:szCs w:val="18"/>
         </w:rPr>
         <w:t xml:space="preserve">email</w:t>
       </w:r>
@@ -2272,10 +2477,10 @@
       <w:r>
         <w:rPr>
           <w:rFonts w:ascii="Consolas" w:cs="Consolas" w:eastAsia="Consolas" w:hAnsi="Consolas"/>
-          <w:sz w:val="19"/>
-          <w:szCs w:val="19"/>
-        </w:rPr>
-        <w:t xml:space="preserve">phone</w:t>
+          <w:sz w:val="18"/>
+          <w:szCs w:val="18"/>
+        </w:rPr>
+        <w:t xml:space="preserve">mobile_number</w:t>
       </w:r>
       <w:r>
         <w:t xml:space="preserve"> (7+ digits) and </w:t>
@@ -2283,8 +2488,8 @@
       <w:r>
         <w:rPr>
           <w:rFonts w:ascii="Consolas" w:cs="Consolas" w:eastAsia="Consolas" w:hAnsi="Consolas"/>
-          <w:sz w:val="19"/>
-          <w:szCs w:val="19"/>
+          <w:sz w:val="18"/>
+          <w:szCs w:val="18"/>
         </w:rPr>
         <w:t xml:space="preserve">consent = true</w:t>
       </w:r>
@@ -2294,8 +2499,8 @@
       <w:r>
         <w:rPr>
           <w:rFonts w:ascii="Consolas" w:cs="Consolas" w:eastAsia="Consolas" w:hAnsi="Consolas"/>
-          <w:sz w:val="19"/>
-          <w:szCs w:val="19"/>
+          <w:sz w:val="18"/>
+          <w:szCs w:val="18"/>
         </w:rPr>
         <w:t xml:space="preserve">400</w:t>
       </w:r>
@@ -2318,10 +2523,10 @@
       <w:r>
         <w:rPr>
           <w:rFonts w:ascii="Consolas" w:cs="Consolas" w:eastAsia="Consolas" w:hAnsi="Consolas"/>
-          <w:sz w:val="19"/>
-          <w:szCs w:val="19"/>
-        </w:rPr>
-        <w:t xml:space="preserve">type</w:t>
+          <w:sz w:val="18"/>
+          <w:szCs w:val="18"/>
+        </w:rPr>
+        <w:t xml:space="preserve">organisation_type</w:t>
       </w:r>
       <w:r>
         <w:t xml:space="preserve"> → save as Other. Unknown </w:t>
@@ -2329,8 +2534,8 @@
       <w:r>
         <w:rPr>
           <w:rFonts w:ascii="Consolas" w:cs="Consolas" w:eastAsia="Consolas" w:hAnsi="Consolas"/>
-          <w:sz w:val="19"/>
-          <w:szCs w:val="19"/>
+          <w:sz w:val="18"/>
+          <w:szCs w:val="18"/>
         </w:rPr>
         <w:t xml:space="preserve">interests</w:t>
       </w:r>
@@ -2370,8 +2575,8 @@
       <w:r>
         <w:rPr>
           <w:rFonts w:ascii="Consolas" w:cs="Consolas" w:eastAsia="Consolas" w:hAnsi="Consolas"/>
-          <w:sz w:val="19"/>
-          <w:szCs w:val="19"/>
+          <w:sz w:val="18"/>
+          <w:szCs w:val="18"/>
         </w:rPr>
         <w:t xml:space="preserve">error</w:t>
       </w:r>
@@ -2411,10 +2616,10 @@
             </w:tcBorders>
             <w:shd w:fill="6F2FA0" w:color="auto" w:val="clear"/>
             <w:tcMar>
-              <w:top w:type="dxa" w:w="60"/>
-              <w:left w:type="dxa" w:w="100"/>
-              <w:bottom w:type="dxa" w:w="60"/>
-              <w:right w:type="dxa" w:w="100"/>
+              <w:top w:type="dxa" w:w="35"/>
+              <w:left w:type="dxa" w:w="90"/>
+              <w:bottom w:type="dxa" w:w="35"/>
+              <w:right w:type="dxa" w:w="90"/>
             </w:tcMar>
           </w:tcPr>
           <w:p>
@@ -2441,10 +2646,10 @@
             </w:tcBorders>
             <w:shd w:fill="6F2FA0" w:color="auto" w:val="clear"/>
             <w:tcMar>
-              <w:top w:type="dxa" w:w="60"/>
-              <w:left w:type="dxa" w:w="100"/>
-              <w:bottom w:type="dxa" w:w="60"/>
-              <w:right w:type="dxa" w:w="100"/>
+              <w:top w:type="dxa" w:w="35"/>
+              <w:left w:type="dxa" w:w="90"/>
+              <w:bottom w:type="dxa" w:w="35"/>
+              <w:right w:type="dxa" w:w="90"/>
             </w:tcMar>
           </w:tcPr>
           <w:p>
@@ -2471,10 +2676,10 @@
             </w:tcBorders>
             <w:shd w:fill="6F2FA0" w:color="auto" w:val="clear"/>
             <w:tcMar>
-              <w:top w:type="dxa" w:w="60"/>
-              <w:left w:type="dxa" w:w="100"/>
-              <w:bottom w:type="dxa" w:w="60"/>
-              <w:right w:type="dxa" w:w="100"/>
+              <w:top w:type="dxa" w:w="35"/>
+              <w:left w:type="dxa" w:w="90"/>
+              <w:bottom w:type="dxa" w:w="35"/>
+              <w:right w:type="dxa" w:w="90"/>
             </w:tcMar>
           </w:tcPr>
           <w:p>
@@ -2502,10 +2707,10 @@
               <w:right w:val="single" w:color="DCD7E3" w:sz="4"/>
             </w:tcBorders>
             <w:tcMar>
-              <w:top w:type="dxa" w:w="60"/>
-              <w:left w:type="dxa" w:w="100"/>
-              <w:bottom w:type="dxa" w:w="60"/>
-              <w:right w:type="dxa" w:w="100"/>
+              <w:top w:type="dxa" w:w="35"/>
+              <w:left w:type="dxa" w:w="90"/>
+              <w:bottom w:type="dxa" w:w="35"/>
+              <w:right w:type="dxa" w:w="90"/>
             </w:tcMar>
           </w:tcPr>
           <w:p>
@@ -2524,10 +2729,10 @@
               <w:right w:val="single" w:color="DCD7E3" w:sz="4"/>
             </w:tcBorders>
             <w:tcMar>
-              <w:top w:type="dxa" w:w="60"/>
-              <w:left w:type="dxa" w:w="100"/>
-              <w:bottom w:type="dxa" w:w="60"/>
-              <w:right w:type="dxa" w:w="100"/>
+              <w:top w:type="dxa" w:w="35"/>
+              <w:left w:type="dxa" w:w="90"/>
+              <w:bottom w:type="dxa" w:w="35"/>
+              <w:right w:type="dxa" w:w="90"/>
             </w:tcMar>
           </w:tcPr>
           <w:p>
@@ -2546,10 +2751,10 @@
               <w:right w:val="single" w:color="DCD7E3" w:sz="4"/>
             </w:tcBorders>
             <w:tcMar>
-              <w:top w:type="dxa" w:w="60"/>
-              <w:left w:type="dxa" w:w="100"/>
-              <w:bottom w:type="dxa" w:w="60"/>
-              <w:right w:type="dxa" w:w="100"/>
+              <w:top w:type="dxa" w:w="35"/>
+              <w:left w:type="dxa" w:w="90"/>
+              <w:bottom w:type="dxa" w:w="35"/>
+              <w:right w:type="dxa" w:w="90"/>
             </w:tcMar>
           </w:tcPr>
           <w:p>
@@ -2570,10 +2775,10 @@
               <w:right w:val="single" w:color="DCD7E3" w:sz="4"/>
             </w:tcBorders>
             <w:tcMar>
-              <w:top w:type="dxa" w:w="60"/>
-              <w:left w:type="dxa" w:w="100"/>
-              <w:bottom w:type="dxa" w:w="60"/>
-              <w:right w:type="dxa" w:w="100"/>
+              <w:top w:type="dxa" w:w="35"/>
+              <w:left w:type="dxa" w:w="90"/>
+              <w:bottom w:type="dxa" w:w="35"/>
+              <w:right w:type="dxa" w:w="90"/>
             </w:tcMar>
           </w:tcPr>
           <w:p>
@@ -2592,10 +2797,10 @@
               <w:right w:val="single" w:color="DCD7E3" w:sz="4"/>
             </w:tcBorders>
             <w:tcMar>
-              <w:top w:type="dxa" w:w="60"/>
-              <w:left w:type="dxa" w:w="100"/>
-              <w:bottom w:type="dxa" w:w="60"/>
-              <w:right w:type="dxa" w:w="100"/>
+              <w:top w:type="dxa" w:w="35"/>
+              <w:left w:type="dxa" w:w="90"/>
+              <w:bottom w:type="dxa" w:w="35"/>
+              <w:right w:type="dxa" w:w="90"/>
             </w:tcMar>
           </w:tcPr>
           <w:p>
@@ -2614,15 +2819,15 @@
               <w:right w:val="single" w:color="DCD7E3" w:sz="4"/>
             </w:tcBorders>
             <w:tcMar>
-              <w:top w:type="dxa" w:w="60"/>
-              <w:left w:type="dxa" w:w="100"/>
-              <w:bottom w:type="dxa" w:w="60"/>
-              <w:right w:type="dxa" w:w="100"/>
-            </w:tcMar>
-          </w:tcPr>
-          <w:p>
-            <w:r>
-              <w:t xml:space="preserve">{"ok": false, "error": "Please fill in your organisation, name, a valid email and phone number."}</w:t>
+              <w:top w:type="dxa" w:w="35"/>
+              <w:left w:type="dxa" w:w="90"/>
+              <w:bottom w:type="dxa" w:w="35"/>
+              <w:right w:type="dxa" w:w="90"/>
+            </w:tcMar>
+          </w:tcPr>
+          <w:p>
+            <w:r>
+              <w:t xml:space="preserve">{"ok": false, "error": "Please fill in your organisation, first and last name, a valid email and phone number."}</w:t>
             </w:r>
           </w:p>
         </w:tc>
@@ -2638,10 +2843,10 @@
               <w:right w:val="single" w:color="DCD7E3" w:sz="4"/>
             </w:tcBorders>
             <w:tcMar>
-              <w:top w:type="dxa" w:w="60"/>
-              <w:left w:type="dxa" w:w="100"/>
-              <w:bottom w:type="dxa" w:w="60"/>
-              <w:right w:type="dxa" w:w="100"/>
+              <w:top w:type="dxa" w:w="35"/>
+              <w:left w:type="dxa" w:w="90"/>
+              <w:bottom w:type="dxa" w:w="35"/>
+              <w:right w:type="dxa" w:w="90"/>
             </w:tcMar>
           </w:tcPr>
           <w:p>
@@ -2660,10 +2865,10 @@
               <w:right w:val="single" w:color="DCD7E3" w:sz="4"/>
             </w:tcBorders>
             <w:tcMar>
-              <w:top w:type="dxa" w:w="60"/>
-              <w:left w:type="dxa" w:w="100"/>
-              <w:bottom w:type="dxa" w:w="60"/>
-              <w:right w:type="dxa" w:w="100"/>
+              <w:top w:type="dxa" w:w="35"/>
+              <w:left w:type="dxa" w:w="90"/>
+              <w:bottom w:type="dxa" w:w="35"/>
+              <w:right w:type="dxa" w:w="90"/>
             </w:tcMar>
           </w:tcPr>
           <w:p>
@@ -2682,10 +2887,10 @@
               <w:right w:val="single" w:color="DCD7E3" w:sz="4"/>
             </w:tcBorders>
             <w:tcMar>
-              <w:top w:type="dxa" w:w="60"/>
-              <w:left w:type="dxa" w:w="100"/>
-              <w:bottom w:type="dxa" w:w="60"/>
-              <w:right w:type="dxa" w:w="100"/>
+              <w:top w:type="dxa" w:w="35"/>
+              <w:left w:type="dxa" w:w="90"/>
+              <w:bottom w:type="dxa" w:w="35"/>
+              <w:right w:type="dxa" w:w="90"/>
             </w:tcMar>
           </w:tcPr>
           <w:p>
@@ -2706,10 +2911,10 @@
               <w:right w:val="single" w:color="DCD7E3" w:sz="4"/>
             </w:tcBorders>
             <w:tcMar>
-              <w:top w:type="dxa" w:w="60"/>
-              <w:left w:type="dxa" w:w="100"/>
-              <w:bottom w:type="dxa" w:w="60"/>
-              <w:right w:type="dxa" w:w="100"/>
+              <w:top w:type="dxa" w:w="35"/>
+              <w:left w:type="dxa" w:w="90"/>
+              <w:bottom w:type="dxa" w:w="35"/>
+              <w:right w:type="dxa" w:w="90"/>
             </w:tcMar>
           </w:tcPr>
           <w:p>
@@ -2728,10 +2933,10 @@
               <w:right w:val="single" w:color="DCD7E3" w:sz="4"/>
             </w:tcBorders>
             <w:tcMar>
-              <w:top w:type="dxa" w:w="60"/>
-              <w:left w:type="dxa" w:w="100"/>
-              <w:bottom w:type="dxa" w:w="60"/>
-              <w:right w:type="dxa" w:w="100"/>
+              <w:top w:type="dxa" w:w="35"/>
+              <w:left w:type="dxa" w:w="90"/>
+              <w:bottom w:type="dxa" w:w="35"/>
+              <w:right w:type="dxa" w:w="90"/>
             </w:tcMar>
           </w:tcPr>
           <w:p>
@@ -2750,10 +2955,10 @@
               <w:right w:val="single" w:color="DCD7E3" w:sz="4"/>
             </w:tcBorders>
             <w:tcMar>
-              <w:top w:type="dxa" w:w="60"/>
-              <w:left w:type="dxa" w:w="100"/>
-              <w:bottom w:type="dxa" w:w="60"/>
-              <w:right w:type="dxa" w:w="100"/>
+              <w:top w:type="dxa" w:w="35"/>
+              <w:left w:type="dxa" w:w="90"/>
+              <w:bottom w:type="dxa" w:w="35"/>
+              <w:right w:type="dxa" w:w="90"/>
             </w:tcMar>
           </w:tcPr>
           <w:p>
@@ -2774,10 +2979,10 @@
               <w:right w:val="single" w:color="DCD7E3" w:sz="4"/>
             </w:tcBorders>
             <w:tcMar>
-              <w:top w:type="dxa" w:w="60"/>
-              <w:left w:type="dxa" w:w="100"/>
-              <w:bottom w:type="dxa" w:w="60"/>
-              <w:right w:type="dxa" w:w="100"/>
+              <w:top w:type="dxa" w:w="35"/>
+              <w:left w:type="dxa" w:w="90"/>
+              <w:bottom w:type="dxa" w:w="35"/>
+              <w:right w:type="dxa" w:w="90"/>
             </w:tcMar>
           </w:tcPr>
           <w:p>
@@ -2796,10 +3001,10 @@
               <w:right w:val="single" w:color="DCD7E3" w:sz="4"/>
             </w:tcBorders>
             <w:tcMar>
-              <w:top w:type="dxa" w:w="60"/>
-              <w:left w:type="dxa" w:w="100"/>
-              <w:bottom w:type="dxa" w:w="60"/>
-              <w:right w:type="dxa" w:w="100"/>
+              <w:top w:type="dxa" w:w="35"/>
+              <w:left w:type="dxa" w:w="90"/>
+              <w:bottom w:type="dxa" w:w="35"/>
+              <w:right w:type="dxa" w:w="90"/>
             </w:tcMar>
           </w:tcPr>
           <w:p>
@@ -2818,10 +3023,10 @@
               <w:right w:val="single" w:color="DCD7E3" w:sz="4"/>
             </w:tcBorders>
             <w:tcMar>
-              <w:top w:type="dxa" w:w="60"/>
-              <w:left w:type="dxa" w:w="100"/>
-              <w:bottom w:type="dxa" w:w="60"/>
-              <w:right w:type="dxa" w:w="100"/>
+              <w:top w:type="dxa" w:w="35"/>
+              <w:left w:type="dxa" w:w="90"/>
+              <w:bottom w:type="dxa" w:w="35"/>
+              <w:right w:type="dxa" w:w="90"/>
             </w:tcMar>
           </w:tcPr>
           <w:p>
@@ -2842,10 +3047,10 @@
               <w:right w:val="single" w:color="DCD7E3" w:sz="4"/>
             </w:tcBorders>
             <w:tcMar>
-              <w:top w:type="dxa" w:w="60"/>
-              <w:left w:type="dxa" w:w="100"/>
-              <w:bottom w:type="dxa" w:w="60"/>
-              <w:right w:type="dxa" w:w="100"/>
+              <w:top w:type="dxa" w:w="35"/>
+              <w:left w:type="dxa" w:w="90"/>
+              <w:bottom w:type="dxa" w:w="35"/>
+              <w:right w:type="dxa" w:w="90"/>
             </w:tcMar>
           </w:tcPr>
           <w:p>
@@ -2864,10 +3069,10 @@
               <w:right w:val="single" w:color="DCD7E3" w:sz="4"/>
             </w:tcBorders>
             <w:tcMar>
-              <w:top w:type="dxa" w:w="60"/>
-              <w:left w:type="dxa" w:w="100"/>
-              <w:bottom w:type="dxa" w:w="60"/>
-              <w:right w:type="dxa" w:w="100"/>
+              <w:top w:type="dxa" w:w="35"/>
+              <w:left w:type="dxa" w:w="90"/>
+              <w:bottom w:type="dxa" w:w="35"/>
+              <w:right w:type="dxa" w:w="90"/>
             </w:tcMar>
           </w:tcPr>
           <w:p>
@@ -2886,10 +3091,10 @@
               <w:right w:val="single" w:color="DCD7E3" w:sz="4"/>
             </w:tcBorders>
             <w:tcMar>
-              <w:top w:type="dxa" w:w="60"/>
-              <w:left w:type="dxa" w:w="100"/>
-              <w:bottom w:type="dxa" w:w="60"/>
-              <w:right w:type="dxa" w:w="100"/>
+              <w:top w:type="dxa" w:w="35"/>
+              <w:left w:type="dxa" w:w="90"/>
+              <w:bottom w:type="dxa" w:w="35"/>
+              <w:right w:type="dxa" w:w="90"/>
             </w:tcMar>
           </w:tcPr>
           <w:p>
@@ -2926,18 +3131,7 @@
         <w:t xml:space="preserve">Save:</w:t>
       </w:r>
       <w:r>
-        <w:t xml:space="preserve"> all inputs (except </w:t>
-      </w:r>
-      <w:r>
-        <w:rPr>
-          <w:rFonts w:ascii="Consolas" w:cs="Consolas" w:eastAsia="Consolas" w:hAnsi="Consolas"/>
-          <w:sz w:val="19"/>
-          <w:szCs w:val="19"/>
-        </w:rPr>
-        <w:t xml:space="preserve">company_url</w:t>
-      </w:r>
-      <w:r>
-        <w:t xml:space="preserve">), plus date received, the website it came from, consent date, </w:t>
+        <w:t xml:space="preserve"> in the Become a Partner report, with the new columns above, plus the website it came from, </w:t>
       </w:r>
       <w:r>
         <w:rPr>
@@ -2974,10 +3168,10 @@
           <w:b/>
           <w:bCs/>
         </w:rPr>
-        <w:t xml:space="preserve">Admin section</w:t>
-      </w:r>
-      <w:r>
-        <w:t xml:space="preserve"> in ActivateMe® Fest: list of applications (newest first), change status (New / Contacted / Interested / Joined / Declined), add notes, filter by status, export to Excel, delete (spam or data-removal requests). Team logins only.</w:t>
+        <w:t xml:space="preserve">In the report:</w:t>
+      </w:r>
+      <w:r>
+        <w:t xml:space="preserve"> change status (New / Contacted / Interested / Joined / Declined), add notes, filter by status, export to Excel, delete (spam or data-removal requests). Team logins only.</w:t>
       </w:r>
     </w:p>
     <w:p>
@@ -3249,8 +3443,8 @@
       <w:rPr>
         <w:rFonts w:ascii="Arial" w:cs="Arial" w:eastAsia="Arial" w:hAnsi="Arial"/>
         <w:color w:val="1D1D24"/>
-        <w:sz w:val="21"/>
-        <w:szCs w:val="21"/>
+        <w:sz w:val="20"/>
+        <w:szCs w:val="20"/>
       </w:rPr>
     </w:rPrDefault>
     <w:pPrDefault/>

</xml_diff>

<commit_message>
API document: black and white, plainer intro about the Become a Partner report
Co-Authored-By: Claude Opus 5.5 <noreply@anthropic.com>
Claude-Session: https://claude.ai/code/session_01JKzPv4mpS97vuJFLXRBcgv
</commit_message>
<xml_diff>
--- a/docs/ActivateMe-Partner-Form-API.docx
+++ b/docs/ActivateMe-Partner-Form-API.docx
@@ -15,42 +15,23 @@
         <w:spacing w:after="160"/>
       </w:pPr>
       <w:r>
-        <w:rPr>
-          <w:color w:val="5D5866"/>
-        </w:rPr>
-        <w:t xml:space="preserve">What the form sends, what to check, and what to reply. Prepared by Aseel (Marketing).</w:t>
-      </w:r>
-    </w:p>
-    <w:p>
-      <w:pPr>
-        <w:shd w:fill="FFF4EC" w:color="auto" w:val="clear"/>
-        <w:spacing w:after="160"/>
-      </w:pPr>
+        <w:t xml:space="preserve">I noticed there's already a </w:t>
+      </w:r>
       <w:r>
         <w:rPr>
           <w:b/>
           <w:bCs/>
         </w:rPr>
-        <w:t xml:space="preserve">Good news:</w:t>
-      </w:r>
-      <w:r>
-        <w:t xml:space="preserve"> Reporting → </w:t>
+        <w:t xml:space="preserve">Become a Partner</w:t>
+      </w:r>
+      <w:r>
+        <w:t xml:space="preserve"> report under Reporting, with First Name, Last Name, Email, Company Name, Mobile Number, Designation and Created date. I think this is where Andreas would like the applications to be stored, so I've matched the form's fields to it. It would just need a few </w:t>
       </w:r>
       <w:r>
         <w:rPr>
           <w:b/>
           <w:bCs/>
         </w:rPr>
-        <w:t xml:space="preserve">Become a Partner</w:t>
-      </w:r>
-      <w:r>
-        <w:t xml:space="preserve"> already has First Name, Last Name, Email, Company Name, Mobile Number, Designation and Created date. The form now uses the same fields, so it could feed that report directly. It just needs a few </w:t>
-      </w:r>
-      <w:r>
-        <w:rPr>
-          <w:b/>
-          <w:bCs/>
-        </w:rPr>
         <w:t xml:space="preserve">new columns</w:t>
       </w:r>
       <w:r>
@@ -60,6 +41,7 @@
     <w:p>
       <w:pPr>
         <w:pStyle w:val="Heading2"/>
+        <w:keepNext/>
         <w:spacing w:after="80" w:before="200"/>
       </w:pPr>
       <w:r>
@@ -181,6 +163,7 @@
     <w:p>
       <w:pPr>
         <w:pStyle w:val="Heading2"/>
+        <w:keepNext/>
         <w:spacing w:after="80" w:before="200"/>
       </w:pPr>
       <w:r>
@@ -359,6 +342,7 @@
     <w:p>
       <w:pPr>
         <w:pStyle w:val="Heading2"/>
+        <w:keepNext/>
         <w:spacing w:after="80" w:before="200"/>
       </w:pPr>
       <w:r>
@@ -391,12 +375,12 @@
           <w:tcPr>
             <w:tcW w:type="dxa" w:w="2350"/>
             <w:tcBorders>
-              <w:top w:val="single" w:color="DCD7E3" w:sz="4"/>
-              <w:left w:val="single" w:color="DCD7E3" w:sz="4"/>
-              <w:bottom w:val="single" w:color="DCD7E3" w:sz="4"/>
-              <w:right w:val="single" w:color="DCD7E3" w:sz="4"/>
-            </w:tcBorders>
-            <w:shd w:fill="6F2FA0" w:color="auto" w:val="clear"/>
+              <w:top w:val="single" w:color="999999" w:sz="4"/>
+              <w:left w:val="single" w:color="999999" w:sz="4"/>
+              <w:bottom w:val="single" w:color="999999" w:sz="4"/>
+              <w:right w:val="single" w:color="999999" w:sz="4"/>
+            </w:tcBorders>
+            <w:shd w:fill="E6E6E6" w:color="auto" w:val="clear"/>
             <w:tcMar>
               <w:top w:type="dxa" w:w="35"/>
               <w:left w:type="dxa" w:w="90"/>
@@ -409,7 +393,7 @@
               <w:rPr>
                 <w:b/>
                 <w:bCs/>
-                <w:color w:val="FFFFFF"/>
+                <w:color w:val="000000"/>
                 <w:sz w:val="19"/>
                 <w:szCs w:val="19"/>
               </w:rPr>
@@ -421,12 +405,12 @@
           <w:tcPr>
             <w:tcW w:type="dxa" w:w="1050"/>
             <w:tcBorders>
-              <w:top w:val="single" w:color="DCD7E3" w:sz="4"/>
-              <w:left w:val="single" w:color="DCD7E3" w:sz="4"/>
-              <w:bottom w:val="single" w:color="DCD7E3" w:sz="4"/>
-              <w:right w:val="single" w:color="DCD7E3" w:sz="4"/>
-            </w:tcBorders>
-            <w:shd w:fill="6F2FA0" w:color="auto" w:val="clear"/>
+              <w:top w:val="single" w:color="999999" w:sz="4"/>
+              <w:left w:val="single" w:color="999999" w:sz="4"/>
+              <w:bottom w:val="single" w:color="999999" w:sz="4"/>
+              <w:right w:val="single" w:color="999999" w:sz="4"/>
+            </w:tcBorders>
+            <w:shd w:fill="E6E6E6" w:color="auto" w:val="clear"/>
             <w:tcMar>
               <w:top w:type="dxa" w:w="35"/>
               <w:left w:type="dxa" w:w="90"/>
@@ -439,7 +423,7 @@
               <w:rPr>
                 <w:b/>
                 <w:bCs/>
-                <w:color w:val="FFFFFF"/>
+                <w:color w:val="000000"/>
                 <w:sz w:val="19"/>
                 <w:szCs w:val="19"/>
               </w:rPr>
@@ -451,12 +435,12 @@
           <w:tcPr>
             <w:tcW w:type="dxa" w:w="3838"/>
             <w:tcBorders>
-              <w:top w:val="single" w:color="DCD7E3" w:sz="4"/>
-              <w:left w:val="single" w:color="DCD7E3" w:sz="4"/>
-              <w:bottom w:val="single" w:color="DCD7E3" w:sz="4"/>
-              <w:right w:val="single" w:color="DCD7E3" w:sz="4"/>
-            </w:tcBorders>
-            <w:shd w:fill="6F2FA0" w:color="auto" w:val="clear"/>
+              <w:top w:val="single" w:color="999999" w:sz="4"/>
+              <w:left w:val="single" w:color="999999" w:sz="4"/>
+              <w:bottom w:val="single" w:color="999999" w:sz="4"/>
+              <w:right w:val="single" w:color="999999" w:sz="4"/>
+            </w:tcBorders>
+            <w:shd w:fill="E6E6E6" w:color="auto" w:val="clear"/>
             <w:tcMar>
               <w:top w:type="dxa" w:w="35"/>
               <w:left w:type="dxa" w:w="90"/>
@@ -469,7 +453,7 @@
               <w:rPr>
                 <w:b/>
                 <w:bCs/>
-                <w:color w:val="FFFFFF"/>
+                <w:color w:val="000000"/>
                 <w:sz w:val="19"/>
                 <w:szCs w:val="19"/>
               </w:rPr>
@@ -481,12 +465,12 @@
           <w:tcPr>
             <w:tcW w:type="dxa" w:w="2400"/>
             <w:tcBorders>
-              <w:top w:val="single" w:color="DCD7E3" w:sz="4"/>
-              <w:left w:val="single" w:color="DCD7E3" w:sz="4"/>
-              <w:bottom w:val="single" w:color="DCD7E3" w:sz="4"/>
-              <w:right w:val="single" w:color="DCD7E3" w:sz="4"/>
-            </w:tcBorders>
-            <w:shd w:fill="6F2FA0" w:color="auto" w:val="clear"/>
+              <w:top w:val="single" w:color="999999" w:sz="4"/>
+              <w:left w:val="single" w:color="999999" w:sz="4"/>
+              <w:bottom w:val="single" w:color="999999" w:sz="4"/>
+              <w:right w:val="single" w:color="999999" w:sz="4"/>
+            </w:tcBorders>
+            <w:shd w:fill="E6E6E6" w:color="auto" w:val="clear"/>
             <w:tcMar>
               <w:top w:type="dxa" w:w="35"/>
               <w:left w:type="dxa" w:w="90"/>
@@ -499,7 +483,7 @@
               <w:rPr>
                 <w:b/>
                 <w:bCs/>
-                <w:color w:val="FFFFFF"/>
+                <w:color w:val="000000"/>
                 <w:sz w:val="19"/>
                 <w:szCs w:val="19"/>
               </w:rPr>
@@ -513,10 +497,10 @@
           <w:tcPr>
             <w:tcW w:type="dxa" w:w="2350"/>
             <w:tcBorders>
-              <w:top w:val="single" w:color="DCD7E3" w:sz="4"/>
-              <w:left w:val="single" w:color="DCD7E3" w:sz="4"/>
-              <w:bottom w:val="single" w:color="DCD7E3" w:sz="4"/>
-              <w:right w:val="single" w:color="DCD7E3" w:sz="4"/>
+              <w:top w:val="single" w:color="999999" w:sz="4"/>
+              <w:left w:val="single" w:color="999999" w:sz="4"/>
+              <w:bottom w:val="single" w:color="999999" w:sz="4"/>
+              <w:right w:val="single" w:color="999999" w:sz="4"/>
             </w:tcBorders>
             <w:tcMar>
               <w:top w:type="dxa" w:w="35"/>
@@ -540,10 +524,10 @@
           <w:tcPr>
             <w:tcW w:type="dxa" w:w="1050"/>
             <w:tcBorders>
-              <w:top w:val="single" w:color="DCD7E3" w:sz="4"/>
-              <w:left w:val="single" w:color="DCD7E3" w:sz="4"/>
-              <w:bottom w:val="single" w:color="DCD7E3" w:sz="4"/>
-              <w:right w:val="single" w:color="DCD7E3" w:sz="4"/>
+              <w:top w:val="single" w:color="999999" w:sz="4"/>
+              <w:left w:val="single" w:color="999999" w:sz="4"/>
+              <w:bottom w:val="single" w:color="999999" w:sz="4"/>
+              <w:right w:val="single" w:color="999999" w:sz="4"/>
             </w:tcBorders>
             <w:tcMar>
               <w:top w:type="dxa" w:w="35"/>
@@ -562,10 +546,10 @@
           <w:tcPr>
             <w:tcW w:type="dxa" w:w="3838"/>
             <w:tcBorders>
-              <w:top w:val="single" w:color="DCD7E3" w:sz="4"/>
-              <w:left w:val="single" w:color="DCD7E3" w:sz="4"/>
-              <w:bottom w:val="single" w:color="DCD7E3" w:sz="4"/>
-              <w:right w:val="single" w:color="DCD7E3" w:sz="4"/>
+              <w:top w:val="single" w:color="999999" w:sz="4"/>
+              <w:left w:val="single" w:color="999999" w:sz="4"/>
+              <w:bottom w:val="single" w:color="999999" w:sz="4"/>
+              <w:right w:val="single" w:color="999999" w:sz="4"/>
             </w:tcBorders>
             <w:tcMar>
               <w:top w:type="dxa" w:w="35"/>
@@ -595,10 +579,10 @@
           <w:tcPr>
             <w:tcW w:type="dxa" w:w="2400"/>
             <w:tcBorders>
-              <w:top w:val="single" w:color="DCD7E3" w:sz="4"/>
-              <w:left w:val="single" w:color="DCD7E3" w:sz="4"/>
-              <w:bottom w:val="single" w:color="DCD7E3" w:sz="4"/>
-              <w:right w:val="single" w:color="DCD7E3" w:sz="4"/>
+              <w:top w:val="single" w:color="999999" w:sz="4"/>
+              <w:left w:val="single" w:color="999999" w:sz="4"/>
+              <w:bottom w:val="single" w:color="999999" w:sz="4"/>
+              <w:right w:val="single" w:color="999999" w:sz="4"/>
             </w:tcBorders>
             <w:tcMar>
               <w:top w:type="dxa" w:w="35"/>
@@ -619,10 +603,10 @@
           <w:tcPr>
             <w:tcW w:type="dxa" w:w="2350"/>
             <w:tcBorders>
-              <w:top w:val="single" w:color="DCD7E3" w:sz="4"/>
-              <w:left w:val="single" w:color="DCD7E3" w:sz="4"/>
-              <w:bottom w:val="single" w:color="DCD7E3" w:sz="4"/>
-              <w:right w:val="single" w:color="DCD7E3" w:sz="4"/>
+              <w:top w:val="single" w:color="999999" w:sz="4"/>
+              <w:left w:val="single" w:color="999999" w:sz="4"/>
+              <w:bottom w:val="single" w:color="999999" w:sz="4"/>
+              <w:right w:val="single" w:color="999999" w:sz="4"/>
             </w:tcBorders>
             <w:tcMar>
               <w:top w:type="dxa" w:w="35"/>
@@ -646,10 +630,10 @@
           <w:tcPr>
             <w:tcW w:type="dxa" w:w="1050"/>
             <w:tcBorders>
-              <w:top w:val="single" w:color="DCD7E3" w:sz="4"/>
-              <w:left w:val="single" w:color="DCD7E3" w:sz="4"/>
-              <w:bottom w:val="single" w:color="DCD7E3" w:sz="4"/>
-              <w:right w:val="single" w:color="DCD7E3" w:sz="4"/>
+              <w:top w:val="single" w:color="999999" w:sz="4"/>
+              <w:left w:val="single" w:color="999999" w:sz="4"/>
+              <w:bottom w:val="single" w:color="999999" w:sz="4"/>
+              <w:right w:val="single" w:color="999999" w:sz="4"/>
             </w:tcBorders>
             <w:tcMar>
               <w:top w:type="dxa" w:w="35"/>
@@ -668,10 +652,10 @@
           <w:tcPr>
             <w:tcW w:type="dxa" w:w="3838"/>
             <w:tcBorders>
-              <w:top w:val="single" w:color="DCD7E3" w:sz="4"/>
-              <w:left w:val="single" w:color="DCD7E3" w:sz="4"/>
-              <w:bottom w:val="single" w:color="DCD7E3" w:sz="4"/>
-              <w:right w:val="single" w:color="DCD7E3" w:sz="4"/>
+              <w:top w:val="single" w:color="999999" w:sz="4"/>
+              <w:left w:val="single" w:color="999999" w:sz="4"/>
+              <w:bottom w:val="single" w:color="999999" w:sz="4"/>
+              <w:right w:val="single" w:color="999999" w:sz="4"/>
             </w:tcBorders>
             <w:tcMar>
               <w:top w:type="dxa" w:w="35"/>
@@ -690,10 +674,10 @@
           <w:tcPr>
             <w:tcW w:type="dxa" w:w="2400"/>
             <w:tcBorders>
-              <w:top w:val="single" w:color="DCD7E3" w:sz="4"/>
-              <w:left w:val="single" w:color="DCD7E3" w:sz="4"/>
-              <w:bottom w:val="single" w:color="DCD7E3" w:sz="4"/>
-              <w:right w:val="single" w:color="DCD7E3" w:sz="4"/>
+              <w:top w:val="single" w:color="999999" w:sz="4"/>
+              <w:left w:val="single" w:color="999999" w:sz="4"/>
+              <w:bottom w:val="single" w:color="999999" w:sz="4"/>
+              <w:right w:val="single" w:color="999999" w:sz="4"/>
             </w:tcBorders>
             <w:tcMar>
               <w:top w:type="dxa" w:w="35"/>
@@ -714,10 +698,10 @@
           <w:tcPr>
             <w:tcW w:type="dxa" w:w="2350"/>
             <w:tcBorders>
-              <w:top w:val="single" w:color="DCD7E3" w:sz="4"/>
-              <w:left w:val="single" w:color="DCD7E3" w:sz="4"/>
-              <w:bottom w:val="single" w:color="DCD7E3" w:sz="4"/>
-              <w:right w:val="single" w:color="DCD7E3" w:sz="4"/>
+              <w:top w:val="single" w:color="999999" w:sz="4"/>
+              <w:left w:val="single" w:color="999999" w:sz="4"/>
+              <w:bottom w:val="single" w:color="999999" w:sz="4"/>
+              <w:right w:val="single" w:color="999999" w:sz="4"/>
             </w:tcBorders>
             <w:tcMar>
               <w:top w:type="dxa" w:w="35"/>
@@ -741,10 +725,10 @@
           <w:tcPr>
             <w:tcW w:type="dxa" w:w="1050"/>
             <w:tcBorders>
-              <w:top w:val="single" w:color="DCD7E3" w:sz="4"/>
-              <w:left w:val="single" w:color="DCD7E3" w:sz="4"/>
-              <w:bottom w:val="single" w:color="DCD7E3" w:sz="4"/>
-              <w:right w:val="single" w:color="DCD7E3" w:sz="4"/>
+              <w:top w:val="single" w:color="999999" w:sz="4"/>
+              <w:left w:val="single" w:color="999999" w:sz="4"/>
+              <w:bottom w:val="single" w:color="999999" w:sz="4"/>
+              <w:right w:val="single" w:color="999999" w:sz="4"/>
             </w:tcBorders>
             <w:tcMar>
               <w:top w:type="dxa" w:w="35"/>
@@ -763,10 +747,10 @@
           <w:tcPr>
             <w:tcW w:type="dxa" w:w="3838"/>
             <w:tcBorders>
-              <w:top w:val="single" w:color="DCD7E3" w:sz="4"/>
-              <w:left w:val="single" w:color="DCD7E3" w:sz="4"/>
-              <w:bottom w:val="single" w:color="DCD7E3" w:sz="4"/>
-              <w:right w:val="single" w:color="DCD7E3" w:sz="4"/>
+              <w:top w:val="single" w:color="999999" w:sz="4"/>
+              <w:left w:val="single" w:color="999999" w:sz="4"/>
+              <w:bottom w:val="single" w:color="999999" w:sz="4"/>
+              <w:right w:val="single" w:color="999999" w:sz="4"/>
             </w:tcBorders>
             <w:tcMar>
               <w:top w:type="dxa" w:w="35"/>
@@ -785,10 +769,10 @@
           <w:tcPr>
             <w:tcW w:type="dxa" w:w="2400"/>
             <w:tcBorders>
-              <w:top w:val="single" w:color="DCD7E3" w:sz="4"/>
-              <w:left w:val="single" w:color="DCD7E3" w:sz="4"/>
-              <w:bottom w:val="single" w:color="DCD7E3" w:sz="4"/>
-              <w:right w:val="single" w:color="DCD7E3" w:sz="4"/>
+              <w:top w:val="single" w:color="999999" w:sz="4"/>
+              <w:left w:val="single" w:color="999999" w:sz="4"/>
+              <w:bottom w:val="single" w:color="999999" w:sz="4"/>
+              <w:right w:val="single" w:color="999999" w:sz="4"/>
             </w:tcBorders>
             <w:tcMar>
               <w:top w:type="dxa" w:w="35"/>
@@ -809,10 +793,10 @@
           <w:tcPr>
             <w:tcW w:type="dxa" w:w="2350"/>
             <w:tcBorders>
-              <w:top w:val="single" w:color="DCD7E3" w:sz="4"/>
-              <w:left w:val="single" w:color="DCD7E3" w:sz="4"/>
-              <w:bottom w:val="single" w:color="DCD7E3" w:sz="4"/>
-              <w:right w:val="single" w:color="DCD7E3" w:sz="4"/>
+              <w:top w:val="single" w:color="999999" w:sz="4"/>
+              <w:left w:val="single" w:color="999999" w:sz="4"/>
+              <w:bottom w:val="single" w:color="999999" w:sz="4"/>
+              <w:right w:val="single" w:color="999999" w:sz="4"/>
             </w:tcBorders>
             <w:tcMar>
               <w:top w:type="dxa" w:w="35"/>
@@ -836,10 +820,10 @@
           <w:tcPr>
             <w:tcW w:type="dxa" w:w="1050"/>
             <w:tcBorders>
-              <w:top w:val="single" w:color="DCD7E3" w:sz="4"/>
-              <w:left w:val="single" w:color="DCD7E3" w:sz="4"/>
-              <w:bottom w:val="single" w:color="DCD7E3" w:sz="4"/>
-              <w:right w:val="single" w:color="DCD7E3" w:sz="4"/>
+              <w:top w:val="single" w:color="999999" w:sz="4"/>
+              <w:left w:val="single" w:color="999999" w:sz="4"/>
+              <w:bottom w:val="single" w:color="999999" w:sz="4"/>
+              <w:right w:val="single" w:color="999999" w:sz="4"/>
             </w:tcBorders>
             <w:tcMar>
               <w:top w:type="dxa" w:w="35"/>
@@ -858,10 +842,10 @@
           <w:tcPr>
             <w:tcW w:type="dxa" w:w="3838"/>
             <w:tcBorders>
-              <w:top w:val="single" w:color="DCD7E3" w:sz="4"/>
-              <w:left w:val="single" w:color="DCD7E3" w:sz="4"/>
-              <w:bottom w:val="single" w:color="DCD7E3" w:sz="4"/>
-              <w:right w:val="single" w:color="DCD7E3" w:sz="4"/>
+              <w:top w:val="single" w:color="999999" w:sz="4"/>
+              <w:left w:val="single" w:color="999999" w:sz="4"/>
+              <w:bottom w:val="single" w:color="999999" w:sz="4"/>
+              <w:right w:val="single" w:color="999999" w:sz="4"/>
             </w:tcBorders>
             <w:tcMar>
               <w:top w:type="dxa" w:w="35"/>
@@ -880,10 +864,10 @@
           <w:tcPr>
             <w:tcW w:type="dxa" w:w="2400"/>
             <w:tcBorders>
-              <w:top w:val="single" w:color="DCD7E3" w:sz="4"/>
-              <w:left w:val="single" w:color="DCD7E3" w:sz="4"/>
-              <w:bottom w:val="single" w:color="DCD7E3" w:sz="4"/>
-              <w:right w:val="single" w:color="DCD7E3" w:sz="4"/>
+              <w:top w:val="single" w:color="999999" w:sz="4"/>
+              <w:left w:val="single" w:color="999999" w:sz="4"/>
+              <w:bottom w:val="single" w:color="999999" w:sz="4"/>
+              <w:right w:val="single" w:color="999999" w:sz="4"/>
             </w:tcBorders>
             <w:tcMar>
               <w:top w:type="dxa" w:w="35"/>
@@ -904,10 +888,10 @@
           <w:tcPr>
             <w:tcW w:type="dxa" w:w="2350"/>
             <w:tcBorders>
-              <w:top w:val="single" w:color="DCD7E3" w:sz="4"/>
-              <w:left w:val="single" w:color="DCD7E3" w:sz="4"/>
-              <w:bottom w:val="single" w:color="DCD7E3" w:sz="4"/>
-              <w:right w:val="single" w:color="DCD7E3" w:sz="4"/>
+              <w:top w:val="single" w:color="999999" w:sz="4"/>
+              <w:left w:val="single" w:color="999999" w:sz="4"/>
+              <w:bottom w:val="single" w:color="999999" w:sz="4"/>
+              <w:right w:val="single" w:color="999999" w:sz="4"/>
             </w:tcBorders>
             <w:tcMar>
               <w:top w:type="dxa" w:w="35"/>
@@ -931,10 +915,10 @@
           <w:tcPr>
             <w:tcW w:type="dxa" w:w="1050"/>
             <w:tcBorders>
-              <w:top w:val="single" w:color="DCD7E3" w:sz="4"/>
-              <w:left w:val="single" w:color="DCD7E3" w:sz="4"/>
-              <w:bottom w:val="single" w:color="DCD7E3" w:sz="4"/>
-              <w:right w:val="single" w:color="DCD7E3" w:sz="4"/>
+              <w:top w:val="single" w:color="999999" w:sz="4"/>
+              <w:left w:val="single" w:color="999999" w:sz="4"/>
+              <w:bottom w:val="single" w:color="999999" w:sz="4"/>
+              <w:right w:val="single" w:color="999999" w:sz="4"/>
             </w:tcBorders>
             <w:tcMar>
               <w:top w:type="dxa" w:w="35"/>
@@ -953,10 +937,10 @@
           <w:tcPr>
             <w:tcW w:type="dxa" w:w="3838"/>
             <w:tcBorders>
-              <w:top w:val="single" w:color="DCD7E3" w:sz="4"/>
-              <w:left w:val="single" w:color="DCD7E3" w:sz="4"/>
-              <w:bottom w:val="single" w:color="DCD7E3" w:sz="4"/>
-              <w:right w:val="single" w:color="DCD7E3" w:sz="4"/>
+              <w:top w:val="single" w:color="999999" w:sz="4"/>
+              <w:left w:val="single" w:color="999999" w:sz="4"/>
+              <w:bottom w:val="single" w:color="999999" w:sz="4"/>
+              <w:right w:val="single" w:color="999999" w:sz="4"/>
             </w:tcBorders>
             <w:tcMar>
               <w:top w:type="dxa" w:w="35"/>
@@ -975,10 +959,10 @@
           <w:tcPr>
             <w:tcW w:type="dxa" w:w="2400"/>
             <w:tcBorders>
-              <w:top w:val="single" w:color="DCD7E3" w:sz="4"/>
-              <w:left w:val="single" w:color="DCD7E3" w:sz="4"/>
-              <w:bottom w:val="single" w:color="DCD7E3" w:sz="4"/>
-              <w:right w:val="single" w:color="DCD7E3" w:sz="4"/>
+              <w:top w:val="single" w:color="999999" w:sz="4"/>
+              <w:left w:val="single" w:color="999999" w:sz="4"/>
+              <w:bottom w:val="single" w:color="999999" w:sz="4"/>
+              <w:right w:val="single" w:color="999999" w:sz="4"/>
             </w:tcBorders>
             <w:tcMar>
               <w:top w:type="dxa" w:w="35"/>
@@ -999,10 +983,10 @@
           <w:tcPr>
             <w:tcW w:type="dxa" w:w="2350"/>
             <w:tcBorders>
-              <w:top w:val="single" w:color="DCD7E3" w:sz="4"/>
-              <w:left w:val="single" w:color="DCD7E3" w:sz="4"/>
-              <w:bottom w:val="single" w:color="DCD7E3" w:sz="4"/>
-              <w:right w:val="single" w:color="DCD7E3" w:sz="4"/>
+              <w:top w:val="single" w:color="999999" w:sz="4"/>
+              <w:left w:val="single" w:color="999999" w:sz="4"/>
+              <w:bottom w:val="single" w:color="999999" w:sz="4"/>
+              <w:right w:val="single" w:color="999999" w:sz="4"/>
             </w:tcBorders>
             <w:tcMar>
               <w:top w:type="dxa" w:w="35"/>
@@ -1026,10 +1010,10 @@
           <w:tcPr>
             <w:tcW w:type="dxa" w:w="1050"/>
             <w:tcBorders>
-              <w:top w:val="single" w:color="DCD7E3" w:sz="4"/>
-              <w:left w:val="single" w:color="DCD7E3" w:sz="4"/>
-              <w:bottom w:val="single" w:color="DCD7E3" w:sz="4"/>
-              <w:right w:val="single" w:color="DCD7E3" w:sz="4"/>
+              <w:top w:val="single" w:color="999999" w:sz="4"/>
+              <w:left w:val="single" w:color="999999" w:sz="4"/>
+              <w:bottom w:val="single" w:color="999999" w:sz="4"/>
+              <w:right w:val="single" w:color="999999" w:sz="4"/>
             </w:tcBorders>
             <w:tcMar>
               <w:top w:type="dxa" w:w="35"/>
@@ -1048,10 +1032,10 @@
           <w:tcPr>
             <w:tcW w:type="dxa" w:w="3838"/>
             <w:tcBorders>
-              <w:top w:val="single" w:color="DCD7E3" w:sz="4"/>
-              <w:left w:val="single" w:color="DCD7E3" w:sz="4"/>
-              <w:bottom w:val="single" w:color="DCD7E3" w:sz="4"/>
-              <w:right w:val="single" w:color="DCD7E3" w:sz="4"/>
+              <w:top w:val="single" w:color="999999" w:sz="4"/>
+              <w:left w:val="single" w:color="999999" w:sz="4"/>
+              <w:bottom w:val="single" w:color="999999" w:sz="4"/>
+              <w:right w:val="single" w:color="999999" w:sz="4"/>
             </w:tcBorders>
             <w:tcMar>
               <w:top w:type="dxa" w:w="35"/>
@@ -1070,10 +1054,10 @@
           <w:tcPr>
             <w:tcW w:type="dxa" w:w="2400"/>
             <w:tcBorders>
-              <w:top w:val="single" w:color="DCD7E3" w:sz="4"/>
-              <w:left w:val="single" w:color="DCD7E3" w:sz="4"/>
-              <w:bottom w:val="single" w:color="DCD7E3" w:sz="4"/>
-              <w:right w:val="single" w:color="DCD7E3" w:sz="4"/>
+              <w:top w:val="single" w:color="999999" w:sz="4"/>
+              <w:left w:val="single" w:color="999999" w:sz="4"/>
+              <w:bottom w:val="single" w:color="999999" w:sz="4"/>
+              <w:right w:val="single" w:color="999999" w:sz="4"/>
             </w:tcBorders>
             <w:tcMar>
               <w:top w:type="dxa" w:w="35"/>
@@ -1094,10 +1078,10 @@
           <w:tcPr>
             <w:tcW w:type="dxa" w:w="2350"/>
             <w:tcBorders>
-              <w:top w:val="single" w:color="DCD7E3" w:sz="4"/>
-              <w:left w:val="single" w:color="DCD7E3" w:sz="4"/>
-              <w:bottom w:val="single" w:color="DCD7E3" w:sz="4"/>
-              <w:right w:val="single" w:color="DCD7E3" w:sz="4"/>
+              <w:top w:val="single" w:color="999999" w:sz="4"/>
+              <w:left w:val="single" w:color="999999" w:sz="4"/>
+              <w:bottom w:val="single" w:color="999999" w:sz="4"/>
+              <w:right w:val="single" w:color="999999" w:sz="4"/>
             </w:tcBorders>
             <w:tcMar>
               <w:top w:type="dxa" w:w="35"/>
@@ -1121,10 +1105,10 @@
           <w:tcPr>
             <w:tcW w:type="dxa" w:w="1050"/>
             <w:tcBorders>
-              <w:top w:val="single" w:color="DCD7E3" w:sz="4"/>
-              <w:left w:val="single" w:color="DCD7E3" w:sz="4"/>
-              <w:bottom w:val="single" w:color="DCD7E3" w:sz="4"/>
-              <w:right w:val="single" w:color="DCD7E3" w:sz="4"/>
+              <w:top w:val="single" w:color="999999" w:sz="4"/>
+              <w:left w:val="single" w:color="999999" w:sz="4"/>
+              <w:bottom w:val="single" w:color="999999" w:sz="4"/>
+              <w:right w:val="single" w:color="999999" w:sz="4"/>
             </w:tcBorders>
             <w:tcMar>
               <w:top w:type="dxa" w:w="35"/>
@@ -1143,10 +1127,10 @@
           <w:tcPr>
             <w:tcW w:type="dxa" w:w="3838"/>
             <w:tcBorders>
-              <w:top w:val="single" w:color="DCD7E3" w:sz="4"/>
-              <w:left w:val="single" w:color="DCD7E3" w:sz="4"/>
-              <w:bottom w:val="single" w:color="DCD7E3" w:sz="4"/>
-              <w:right w:val="single" w:color="DCD7E3" w:sz="4"/>
+              <w:top w:val="single" w:color="999999" w:sz="4"/>
+              <w:left w:val="single" w:color="999999" w:sz="4"/>
+              <w:bottom w:val="single" w:color="999999" w:sz="4"/>
+              <w:right w:val="single" w:color="999999" w:sz="4"/>
             </w:tcBorders>
             <w:tcMar>
               <w:top w:type="dxa" w:w="35"/>
@@ -1165,10 +1149,10 @@
           <w:tcPr>
             <w:tcW w:type="dxa" w:w="2400"/>
             <w:tcBorders>
-              <w:top w:val="single" w:color="DCD7E3" w:sz="4"/>
-              <w:left w:val="single" w:color="DCD7E3" w:sz="4"/>
-              <w:bottom w:val="single" w:color="DCD7E3" w:sz="4"/>
-              <w:right w:val="single" w:color="DCD7E3" w:sz="4"/>
+              <w:top w:val="single" w:color="999999" w:sz="4"/>
+              <w:left w:val="single" w:color="999999" w:sz="4"/>
+              <w:bottom w:val="single" w:color="999999" w:sz="4"/>
+              <w:right w:val="single" w:color="999999" w:sz="4"/>
             </w:tcBorders>
             <w:tcMar>
               <w:top w:type="dxa" w:w="35"/>
@@ -1189,10 +1173,10 @@
           <w:tcPr>
             <w:tcW w:type="dxa" w:w="2350"/>
             <w:tcBorders>
-              <w:top w:val="single" w:color="DCD7E3" w:sz="4"/>
-              <w:left w:val="single" w:color="DCD7E3" w:sz="4"/>
-              <w:bottom w:val="single" w:color="DCD7E3" w:sz="4"/>
-              <w:right w:val="single" w:color="DCD7E3" w:sz="4"/>
+              <w:top w:val="single" w:color="999999" w:sz="4"/>
+              <w:left w:val="single" w:color="999999" w:sz="4"/>
+              <w:bottom w:val="single" w:color="999999" w:sz="4"/>
+              <w:right w:val="single" w:color="999999" w:sz="4"/>
             </w:tcBorders>
             <w:tcMar>
               <w:top w:type="dxa" w:w="35"/>
@@ -1216,10 +1200,10 @@
           <w:tcPr>
             <w:tcW w:type="dxa" w:w="1050"/>
             <w:tcBorders>
-              <w:top w:val="single" w:color="DCD7E3" w:sz="4"/>
-              <w:left w:val="single" w:color="DCD7E3" w:sz="4"/>
-              <w:bottom w:val="single" w:color="DCD7E3" w:sz="4"/>
-              <w:right w:val="single" w:color="DCD7E3" w:sz="4"/>
+              <w:top w:val="single" w:color="999999" w:sz="4"/>
+              <w:left w:val="single" w:color="999999" w:sz="4"/>
+              <w:bottom w:val="single" w:color="999999" w:sz="4"/>
+              <w:right w:val="single" w:color="999999" w:sz="4"/>
             </w:tcBorders>
             <w:tcMar>
               <w:top w:type="dxa" w:w="35"/>
@@ -1238,10 +1222,10 @@
           <w:tcPr>
             <w:tcW w:type="dxa" w:w="3838"/>
             <w:tcBorders>
-              <w:top w:val="single" w:color="DCD7E3" w:sz="4"/>
-              <w:left w:val="single" w:color="DCD7E3" w:sz="4"/>
-              <w:bottom w:val="single" w:color="DCD7E3" w:sz="4"/>
-              <w:right w:val="single" w:color="DCD7E3" w:sz="4"/>
+              <w:top w:val="single" w:color="999999" w:sz="4"/>
+              <w:left w:val="single" w:color="999999" w:sz="4"/>
+              <w:bottom w:val="single" w:color="999999" w:sz="4"/>
+              <w:right w:val="single" w:color="999999" w:sz="4"/>
             </w:tcBorders>
             <w:tcMar>
               <w:top w:type="dxa" w:w="35"/>
@@ -1260,10 +1244,10 @@
           <w:tcPr>
             <w:tcW w:type="dxa" w:w="2400"/>
             <w:tcBorders>
-              <w:top w:val="single" w:color="DCD7E3" w:sz="4"/>
-              <w:left w:val="single" w:color="DCD7E3" w:sz="4"/>
-              <w:bottom w:val="single" w:color="DCD7E3" w:sz="4"/>
-              <w:right w:val="single" w:color="DCD7E3" w:sz="4"/>
+              <w:top w:val="single" w:color="999999" w:sz="4"/>
+              <w:left w:val="single" w:color="999999" w:sz="4"/>
+              <w:bottom w:val="single" w:color="999999" w:sz="4"/>
+              <w:right w:val="single" w:color="999999" w:sz="4"/>
             </w:tcBorders>
             <w:tcMar>
               <w:top w:type="dxa" w:w="35"/>
@@ -1288,10 +1272,10 @@
           <w:tcPr>
             <w:tcW w:type="dxa" w:w="2350"/>
             <w:tcBorders>
-              <w:top w:val="single" w:color="DCD7E3" w:sz="4"/>
-              <w:left w:val="single" w:color="DCD7E3" w:sz="4"/>
-              <w:bottom w:val="single" w:color="DCD7E3" w:sz="4"/>
-              <w:right w:val="single" w:color="DCD7E3" w:sz="4"/>
+              <w:top w:val="single" w:color="999999" w:sz="4"/>
+              <w:left w:val="single" w:color="999999" w:sz="4"/>
+              <w:bottom w:val="single" w:color="999999" w:sz="4"/>
+              <w:right w:val="single" w:color="999999" w:sz="4"/>
             </w:tcBorders>
             <w:tcMar>
               <w:top w:type="dxa" w:w="35"/>
@@ -1315,10 +1299,10 @@
           <w:tcPr>
             <w:tcW w:type="dxa" w:w="1050"/>
             <w:tcBorders>
-              <w:top w:val="single" w:color="DCD7E3" w:sz="4"/>
-              <w:left w:val="single" w:color="DCD7E3" w:sz="4"/>
-              <w:bottom w:val="single" w:color="DCD7E3" w:sz="4"/>
-              <w:right w:val="single" w:color="DCD7E3" w:sz="4"/>
+              <w:top w:val="single" w:color="999999" w:sz="4"/>
+              <w:left w:val="single" w:color="999999" w:sz="4"/>
+              <w:bottom w:val="single" w:color="999999" w:sz="4"/>
+              <w:right w:val="single" w:color="999999" w:sz="4"/>
             </w:tcBorders>
             <w:tcMar>
               <w:top w:type="dxa" w:w="35"/>
@@ -1337,10 +1321,10 @@
           <w:tcPr>
             <w:tcW w:type="dxa" w:w="3838"/>
             <w:tcBorders>
-              <w:top w:val="single" w:color="DCD7E3" w:sz="4"/>
-              <w:left w:val="single" w:color="DCD7E3" w:sz="4"/>
-              <w:bottom w:val="single" w:color="DCD7E3" w:sz="4"/>
-              <w:right w:val="single" w:color="DCD7E3" w:sz="4"/>
+              <w:top w:val="single" w:color="999999" w:sz="4"/>
+              <w:left w:val="single" w:color="999999" w:sz="4"/>
+              <w:bottom w:val="single" w:color="999999" w:sz="4"/>
+              <w:right w:val="single" w:color="999999" w:sz="4"/>
             </w:tcBorders>
             <w:tcMar>
               <w:top w:type="dxa" w:w="35"/>
@@ -1359,10 +1343,10 @@
           <w:tcPr>
             <w:tcW w:type="dxa" w:w="2400"/>
             <w:tcBorders>
-              <w:top w:val="single" w:color="DCD7E3" w:sz="4"/>
-              <w:left w:val="single" w:color="DCD7E3" w:sz="4"/>
-              <w:bottom w:val="single" w:color="DCD7E3" w:sz="4"/>
-              <w:right w:val="single" w:color="DCD7E3" w:sz="4"/>
+              <w:top w:val="single" w:color="999999" w:sz="4"/>
+              <w:left w:val="single" w:color="999999" w:sz="4"/>
+              <w:bottom w:val="single" w:color="999999" w:sz="4"/>
+              <w:right w:val="single" w:color="999999" w:sz="4"/>
             </w:tcBorders>
             <w:tcMar>
               <w:top w:type="dxa" w:w="35"/>
@@ -1387,10 +1371,10 @@
           <w:tcPr>
             <w:tcW w:type="dxa" w:w="2350"/>
             <w:tcBorders>
-              <w:top w:val="single" w:color="DCD7E3" w:sz="4"/>
-              <w:left w:val="single" w:color="DCD7E3" w:sz="4"/>
-              <w:bottom w:val="single" w:color="DCD7E3" w:sz="4"/>
-              <w:right w:val="single" w:color="DCD7E3" w:sz="4"/>
+              <w:top w:val="single" w:color="999999" w:sz="4"/>
+              <w:left w:val="single" w:color="999999" w:sz="4"/>
+              <w:bottom w:val="single" w:color="999999" w:sz="4"/>
+              <w:right w:val="single" w:color="999999" w:sz="4"/>
             </w:tcBorders>
             <w:tcMar>
               <w:top w:type="dxa" w:w="35"/>
@@ -1414,10 +1398,10 @@
           <w:tcPr>
             <w:tcW w:type="dxa" w:w="1050"/>
             <w:tcBorders>
-              <w:top w:val="single" w:color="DCD7E3" w:sz="4"/>
-              <w:left w:val="single" w:color="DCD7E3" w:sz="4"/>
-              <w:bottom w:val="single" w:color="DCD7E3" w:sz="4"/>
-              <w:right w:val="single" w:color="DCD7E3" w:sz="4"/>
+              <w:top w:val="single" w:color="999999" w:sz="4"/>
+              <w:left w:val="single" w:color="999999" w:sz="4"/>
+              <w:bottom w:val="single" w:color="999999" w:sz="4"/>
+              <w:right w:val="single" w:color="999999" w:sz="4"/>
             </w:tcBorders>
             <w:tcMar>
               <w:top w:type="dxa" w:w="35"/>
@@ -1436,10 +1420,10 @@
           <w:tcPr>
             <w:tcW w:type="dxa" w:w="3838"/>
             <w:tcBorders>
-              <w:top w:val="single" w:color="DCD7E3" w:sz="4"/>
-              <w:left w:val="single" w:color="DCD7E3" w:sz="4"/>
-              <w:bottom w:val="single" w:color="DCD7E3" w:sz="4"/>
-              <w:right w:val="single" w:color="DCD7E3" w:sz="4"/>
+              <w:top w:val="single" w:color="999999" w:sz="4"/>
+              <w:left w:val="single" w:color="999999" w:sz="4"/>
+              <w:bottom w:val="single" w:color="999999" w:sz="4"/>
+              <w:right w:val="single" w:color="999999" w:sz="4"/>
             </w:tcBorders>
             <w:tcMar>
               <w:top w:type="dxa" w:w="35"/>
@@ -1458,10 +1442,10 @@
           <w:tcPr>
             <w:tcW w:type="dxa" w:w="2400"/>
             <w:tcBorders>
-              <w:top w:val="single" w:color="DCD7E3" w:sz="4"/>
-              <w:left w:val="single" w:color="DCD7E3" w:sz="4"/>
-              <w:bottom w:val="single" w:color="DCD7E3" w:sz="4"/>
-              <w:right w:val="single" w:color="DCD7E3" w:sz="4"/>
+              <w:top w:val="single" w:color="999999" w:sz="4"/>
+              <w:left w:val="single" w:color="999999" w:sz="4"/>
+              <w:bottom w:val="single" w:color="999999" w:sz="4"/>
+              <w:right w:val="single" w:color="999999" w:sz="4"/>
             </w:tcBorders>
             <w:tcMar>
               <w:top w:type="dxa" w:w="35"/>
@@ -1486,10 +1470,10 @@
           <w:tcPr>
             <w:tcW w:type="dxa" w:w="2350"/>
             <w:tcBorders>
-              <w:top w:val="single" w:color="DCD7E3" w:sz="4"/>
-              <w:left w:val="single" w:color="DCD7E3" w:sz="4"/>
-              <w:bottom w:val="single" w:color="DCD7E3" w:sz="4"/>
-              <w:right w:val="single" w:color="DCD7E3" w:sz="4"/>
+              <w:top w:val="single" w:color="999999" w:sz="4"/>
+              <w:left w:val="single" w:color="999999" w:sz="4"/>
+              <w:bottom w:val="single" w:color="999999" w:sz="4"/>
+              <w:right w:val="single" w:color="999999" w:sz="4"/>
             </w:tcBorders>
             <w:tcMar>
               <w:top w:type="dxa" w:w="35"/>
@@ -1513,10 +1497,10 @@
           <w:tcPr>
             <w:tcW w:type="dxa" w:w="1050"/>
             <w:tcBorders>
-              <w:top w:val="single" w:color="DCD7E3" w:sz="4"/>
-              <w:left w:val="single" w:color="DCD7E3" w:sz="4"/>
-              <w:bottom w:val="single" w:color="DCD7E3" w:sz="4"/>
-              <w:right w:val="single" w:color="DCD7E3" w:sz="4"/>
+              <w:top w:val="single" w:color="999999" w:sz="4"/>
+              <w:left w:val="single" w:color="999999" w:sz="4"/>
+              <w:bottom w:val="single" w:color="999999" w:sz="4"/>
+              <w:right w:val="single" w:color="999999" w:sz="4"/>
             </w:tcBorders>
             <w:tcMar>
               <w:top w:type="dxa" w:w="35"/>
@@ -1535,10 +1519,10 @@
           <w:tcPr>
             <w:tcW w:type="dxa" w:w="3838"/>
             <w:tcBorders>
-              <w:top w:val="single" w:color="DCD7E3" w:sz="4"/>
-              <w:left w:val="single" w:color="DCD7E3" w:sz="4"/>
-              <w:bottom w:val="single" w:color="DCD7E3" w:sz="4"/>
-              <w:right w:val="single" w:color="DCD7E3" w:sz="4"/>
+              <w:top w:val="single" w:color="999999" w:sz="4"/>
+              <w:left w:val="single" w:color="999999" w:sz="4"/>
+              <w:bottom w:val="single" w:color="999999" w:sz="4"/>
+              <w:right w:val="single" w:color="999999" w:sz="4"/>
             </w:tcBorders>
             <w:tcMar>
               <w:top w:type="dxa" w:w="35"/>
@@ -1557,10 +1541,10 @@
           <w:tcPr>
             <w:tcW w:type="dxa" w:w="2400"/>
             <w:tcBorders>
-              <w:top w:val="single" w:color="DCD7E3" w:sz="4"/>
-              <w:left w:val="single" w:color="DCD7E3" w:sz="4"/>
-              <w:bottom w:val="single" w:color="DCD7E3" w:sz="4"/>
-              <w:right w:val="single" w:color="DCD7E3" w:sz="4"/>
+              <w:top w:val="single" w:color="999999" w:sz="4"/>
+              <w:left w:val="single" w:color="999999" w:sz="4"/>
+              <w:bottom w:val="single" w:color="999999" w:sz="4"/>
+              <w:right w:val="single" w:color="999999" w:sz="4"/>
             </w:tcBorders>
             <w:tcMar>
               <w:top w:type="dxa" w:w="35"/>
@@ -1585,10 +1569,10 @@
           <w:tcPr>
             <w:tcW w:type="dxa" w:w="2350"/>
             <w:tcBorders>
-              <w:top w:val="single" w:color="DCD7E3" w:sz="4"/>
-              <w:left w:val="single" w:color="DCD7E3" w:sz="4"/>
-              <w:bottom w:val="single" w:color="DCD7E3" w:sz="4"/>
-              <w:right w:val="single" w:color="DCD7E3" w:sz="4"/>
+              <w:top w:val="single" w:color="999999" w:sz="4"/>
+              <w:left w:val="single" w:color="999999" w:sz="4"/>
+              <w:bottom w:val="single" w:color="999999" w:sz="4"/>
+              <w:right w:val="single" w:color="999999" w:sz="4"/>
             </w:tcBorders>
             <w:tcMar>
               <w:top w:type="dxa" w:w="35"/>
@@ -1612,10 +1596,10 @@
           <w:tcPr>
             <w:tcW w:type="dxa" w:w="1050"/>
             <w:tcBorders>
-              <w:top w:val="single" w:color="DCD7E3" w:sz="4"/>
-              <w:left w:val="single" w:color="DCD7E3" w:sz="4"/>
-              <w:bottom w:val="single" w:color="DCD7E3" w:sz="4"/>
-              <w:right w:val="single" w:color="DCD7E3" w:sz="4"/>
+              <w:top w:val="single" w:color="999999" w:sz="4"/>
+              <w:left w:val="single" w:color="999999" w:sz="4"/>
+              <w:bottom w:val="single" w:color="999999" w:sz="4"/>
+              <w:right w:val="single" w:color="999999" w:sz="4"/>
             </w:tcBorders>
             <w:tcMar>
               <w:top w:type="dxa" w:w="35"/>
@@ -1634,10 +1618,10 @@
           <w:tcPr>
             <w:tcW w:type="dxa" w:w="3838"/>
             <w:tcBorders>
-              <w:top w:val="single" w:color="DCD7E3" w:sz="4"/>
-              <w:left w:val="single" w:color="DCD7E3" w:sz="4"/>
-              <w:bottom w:val="single" w:color="DCD7E3" w:sz="4"/>
-              <w:right w:val="single" w:color="DCD7E3" w:sz="4"/>
+              <w:top w:val="single" w:color="999999" w:sz="4"/>
+              <w:left w:val="single" w:color="999999" w:sz="4"/>
+              <w:bottom w:val="single" w:color="999999" w:sz="4"/>
+              <w:right w:val="single" w:color="999999" w:sz="4"/>
             </w:tcBorders>
             <w:tcMar>
               <w:top w:type="dxa" w:w="35"/>
@@ -1656,10 +1640,10 @@
           <w:tcPr>
             <w:tcW w:type="dxa" w:w="2400"/>
             <w:tcBorders>
-              <w:top w:val="single" w:color="DCD7E3" w:sz="4"/>
-              <w:left w:val="single" w:color="DCD7E3" w:sz="4"/>
-              <w:bottom w:val="single" w:color="DCD7E3" w:sz="4"/>
-              <w:right w:val="single" w:color="DCD7E3" w:sz="4"/>
+              <w:top w:val="single" w:color="999999" w:sz="4"/>
+              <w:left w:val="single" w:color="999999" w:sz="4"/>
+              <w:bottom w:val="single" w:color="999999" w:sz="4"/>
+              <w:right w:val="single" w:color="999999" w:sz="4"/>
             </w:tcBorders>
             <w:tcMar>
               <w:top w:type="dxa" w:w="35"/>
@@ -1684,10 +1668,10 @@
           <w:tcPr>
             <w:tcW w:type="dxa" w:w="2350"/>
             <w:tcBorders>
-              <w:top w:val="single" w:color="DCD7E3" w:sz="4"/>
-              <w:left w:val="single" w:color="DCD7E3" w:sz="4"/>
-              <w:bottom w:val="single" w:color="DCD7E3" w:sz="4"/>
-              <w:right w:val="single" w:color="DCD7E3" w:sz="4"/>
+              <w:top w:val="single" w:color="999999" w:sz="4"/>
+              <w:left w:val="single" w:color="999999" w:sz="4"/>
+              <w:bottom w:val="single" w:color="999999" w:sz="4"/>
+              <w:right w:val="single" w:color="999999" w:sz="4"/>
             </w:tcBorders>
             <w:tcMar>
               <w:top w:type="dxa" w:w="35"/>
@@ -1711,10 +1695,10 @@
           <w:tcPr>
             <w:tcW w:type="dxa" w:w="1050"/>
             <w:tcBorders>
-              <w:top w:val="single" w:color="DCD7E3" w:sz="4"/>
-              <w:left w:val="single" w:color="DCD7E3" w:sz="4"/>
-              <w:bottom w:val="single" w:color="DCD7E3" w:sz="4"/>
-              <w:right w:val="single" w:color="DCD7E3" w:sz="4"/>
+              <w:top w:val="single" w:color="999999" w:sz="4"/>
+              <w:left w:val="single" w:color="999999" w:sz="4"/>
+              <w:bottom w:val="single" w:color="999999" w:sz="4"/>
+              <w:right w:val="single" w:color="999999" w:sz="4"/>
             </w:tcBorders>
             <w:tcMar>
               <w:top w:type="dxa" w:w="35"/>
@@ -1733,10 +1717,10 @@
           <w:tcPr>
             <w:tcW w:type="dxa" w:w="3838"/>
             <w:tcBorders>
-              <w:top w:val="single" w:color="DCD7E3" w:sz="4"/>
-              <w:left w:val="single" w:color="DCD7E3" w:sz="4"/>
-              <w:bottom w:val="single" w:color="DCD7E3" w:sz="4"/>
-              <w:right w:val="single" w:color="DCD7E3" w:sz="4"/>
+              <w:top w:val="single" w:color="999999" w:sz="4"/>
+              <w:left w:val="single" w:color="999999" w:sz="4"/>
+              <w:bottom w:val="single" w:color="999999" w:sz="4"/>
+              <w:right w:val="single" w:color="999999" w:sz="4"/>
             </w:tcBorders>
             <w:tcMar>
               <w:top w:type="dxa" w:w="35"/>
@@ -1755,10 +1739,10 @@
           <w:tcPr>
             <w:tcW w:type="dxa" w:w="2400"/>
             <w:tcBorders>
-              <w:top w:val="single" w:color="DCD7E3" w:sz="4"/>
-              <w:left w:val="single" w:color="DCD7E3" w:sz="4"/>
-              <w:bottom w:val="single" w:color="DCD7E3" w:sz="4"/>
-              <w:right w:val="single" w:color="DCD7E3" w:sz="4"/>
+              <w:top w:val="single" w:color="999999" w:sz="4"/>
+              <w:left w:val="single" w:color="999999" w:sz="4"/>
+              <w:bottom w:val="single" w:color="999999" w:sz="4"/>
+              <w:right w:val="single" w:color="999999" w:sz="4"/>
             </w:tcBorders>
             <w:tcMar>
               <w:top w:type="dxa" w:w="35"/>
@@ -1786,10 +1770,10 @@
           <w:tcPr>
             <w:tcW w:type="dxa" w:w="2350"/>
             <w:tcBorders>
-              <w:top w:val="single" w:color="DCD7E3" w:sz="4"/>
-              <w:left w:val="single" w:color="DCD7E3" w:sz="4"/>
-              <w:bottom w:val="single" w:color="DCD7E3" w:sz="4"/>
-              <w:right w:val="single" w:color="DCD7E3" w:sz="4"/>
+              <w:top w:val="single" w:color="999999" w:sz="4"/>
+              <w:left w:val="single" w:color="999999" w:sz="4"/>
+              <w:bottom w:val="single" w:color="999999" w:sz="4"/>
+              <w:right w:val="single" w:color="999999" w:sz="4"/>
             </w:tcBorders>
             <w:tcMar>
               <w:top w:type="dxa" w:w="35"/>
@@ -1813,10 +1797,10 @@
           <w:tcPr>
             <w:tcW w:type="dxa" w:w="1050"/>
             <w:tcBorders>
-              <w:top w:val="single" w:color="DCD7E3" w:sz="4"/>
-              <w:left w:val="single" w:color="DCD7E3" w:sz="4"/>
-              <w:bottom w:val="single" w:color="DCD7E3" w:sz="4"/>
-              <w:right w:val="single" w:color="DCD7E3" w:sz="4"/>
+              <w:top w:val="single" w:color="999999" w:sz="4"/>
+              <w:left w:val="single" w:color="999999" w:sz="4"/>
+              <w:bottom w:val="single" w:color="999999" w:sz="4"/>
+              <w:right w:val="single" w:color="999999" w:sz="4"/>
             </w:tcBorders>
             <w:tcMar>
               <w:top w:type="dxa" w:w="35"/>
@@ -1835,10 +1819,10 @@
           <w:tcPr>
             <w:tcW w:type="dxa" w:w="3838"/>
             <w:tcBorders>
-              <w:top w:val="single" w:color="DCD7E3" w:sz="4"/>
-              <w:left w:val="single" w:color="DCD7E3" w:sz="4"/>
-              <w:bottom w:val="single" w:color="DCD7E3" w:sz="4"/>
-              <w:right w:val="single" w:color="DCD7E3" w:sz="4"/>
+              <w:top w:val="single" w:color="999999" w:sz="4"/>
+              <w:left w:val="single" w:color="999999" w:sz="4"/>
+              <w:bottom w:val="single" w:color="999999" w:sz="4"/>
+              <w:right w:val="single" w:color="999999" w:sz="4"/>
             </w:tcBorders>
             <w:tcMar>
               <w:top w:type="dxa" w:w="35"/>
@@ -1857,10 +1841,10 @@
           <w:tcPr>
             <w:tcW w:type="dxa" w:w="2400"/>
             <w:tcBorders>
-              <w:top w:val="single" w:color="DCD7E3" w:sz="4"/>
-              <w:left w:val="single" w:color="DCD7E3" w:sz="4"/>
-              <w:bottom w:val="single" w:color="DCD7E3" w:sz="4"/>
-              <w:right w:val="single" w:color="DCD7E3" w:sz="4"/>
+              <w:top w:val="single" w:color="999999" w:sz="4"/>
+              <w:left w:val="single" w:color="999999" w:sz="4"/>
+              <w:bottom w:val="single" w:color="999999" w:sz="4"/>
+              <w:right w:val="single" w:color="999999" w:sz="4"/>
             </w:tcBorders>
             <w:tcMar>
               <w:top w:type="dxa" w:w="35"/>
@@ -1881,10 +1865,10 @@
           <w:tcPr>
             <w:tcW w:type="dxa" w:w="2350"/>
             <w:tcBorders>
-              <w:top w:val="single" w:color="DCD7E3" w:sz="4"/>
-              <w:left w:val="single" w:color="DCD7E3" w:sz="4"/>
-              <w:bottom w:val="single" w:color="DCD7E3" w:sz="4"/>
-              <w:right w:val="single" w:color="DCD7E3" w:sz="4"/>
+              <w:top w:val="single" w:color="999999" w:sz="4"/>
+              <w:left w:val="single" w:color="999999" w:sz="4"/>
+              <w:bottom w:val="single" w:color="999999" w:sz="4"/>
+              <w:right w:val="single" w:color="999999" w:sz="4"/>
             </w:tcBorders>
             <w:tcMar>
               <w:top w:type="dxa" w:w="35"/>
@@ -1908,10 +1892,10 @@
           <w:tcPr>
             <w:tcW w:type="dxa" w:w="1050"/>
             <w:tcBorders>
-              <w:top w:val="single" w:color="DCD7E3" w:sz="4"/>
-              <w:left w:val="single" w:color="DCD7E3" w:sz="4"/>
-              <w:bottom w:val="single" w:color="DCD7E3" w:sz="4"/>
-              <w:right w:val="single" w:color="DCD7E3" w:sz="4"/>
+              <w:top w:val="single" w:color="999999" w:sz="4"/>
+              <w:left w:val="single" w:color="999999" w:sz="4"/>
+              <w:bottom w:val="single" w:color="999999" w:sz="4"/>
+              <w:right w:val="single" w:color="999999" w:sz="4"/>
             </w:tcBorders>
             <w:tcMar>
               <w:top w:type="dxa" w:w="35"/>
@@ -1930,10 +1914,10 @@
           <w:tcPr>
             <w:tcW w:type="dxa" w:w="3838"/>
             <w:tcBorders>
-              <w:top w:val="single" w:color="DCD7E3" w:sz="4"/>
-              <w:left w:val="single" w:color="DCD7E3" w:sz="4"/>
-              <w:bottom w:val="single" w:color="DCD7E3" w:sz="4"/>
-              <w:right w:val="single" w:color="DCD7E3" w:sz="4"/>
+              <w:top w:val="single" w:color="999999" w:sz="4"/>
+              <w:left w:val="single" w:color="999999" w:sz="4"/>
+              <w:bottom w:val="single" w:color="999999" w:sz="4"/>
+              <w:right w:val="single" w:color="999999" w:sz="4"/>
             </w:tcBorders>
             <w:tcMar>
               <w:top w:type="dxa" w:w="35"/>
@@ -1952,10 +1936,10 @@
           <w:tcPr>
             <w:tcW w:type="dxa" w:w="2400"/>
             <w:tcBorders>
-              <w:top w:val="single" w:color="DCD7E3" w:sz="4"/>
-              <w:left w:val="single" w:color="DCD7E3" w:sz="4"/>
-              <w:bottom w:val="single" w:color="DCD7E3" w:sz="4"/>
-              <w:right w:val="single" w:color="DCD7E3" w:sz="4"/>
+              <w:top w:val="single" w:color="999999" w:sz="4"/>
+              <w:left w:val="single" w:color="999999" w:sz="4"/>
+              <w:bottom w:val="single" w:color="999999" w:sz="4"/>
+              <w:right w:val="single" w:color="999999" w:sz="4"/>
             </w:tcBorders>
             <w:tcMar>
               <w:top w:type="dxa" w:w="35"/>
@@ -2013,6 +1997,7 @@
     <w:p>
       <w:pPr>
         <w:pStyle w:val="Heading2"/>
+        <w:keepNext/>
         <w:spacing w:after="80" w:before="200"/>
       </w:pPr>
       <w:r>
@@ -2021,7 +2006,9 @@
     </w:p>
     <w:p>
       <w:pPr>
-        <w:shd w:fill="F5F2F9" w:color="auto" w:val="clear"/>
+        <w:keepNext/>
+        <w:keepLines/>
+        <w:shd w:fill="F2F2F2" w:color="auto" w:val="clear"/>
         <w:spacing w:after="0" w:before="60"/>
         <w:ind w:left="200" w:right="200"/>
       </w:pPr>
@@ -2036,7 +2023,9 @@
     </w:p>
     <w:p>
       <w:pPr>
-        <w:shd w:fill="F5F2F9" w:color="auto" w:val="clear"/>
+        <w:keepNext/>
+        <w:keepLines/>
+        <w:shd w:fill="F2F2F2" w:color="auto" w:val="clear"/>
         <w:spacing w:after="0" w:before="0"/>
         <w:ind w:left="200" w:right="200"/>
       </w:pPr>
@@ -2051,7 +2040,9 @@
     </w:p>
     <w:p>
       <w:pPr>
-        <w:shd w:fill="F5F2F9" w:color="auto" w:val="clear"/>
+        <w:keepNext/>
+        <w:keepLines/>
+        <w:shd w:fill="F2F2F2" w:color="auto" w:val="clear"/>
         <w:spacing w:after="0" w:before="0"/>
         <w:ind w:left="200" w:right="200"/>
       </w:pPr>
@@ -2066,7 +2057,9 @@
     </w:p>
     <w:p>
       <w:pPr>
-        <w:shd w:fill="F5F2F9" w:color="auto" w:val="clear"/>
+        <w:keepNext/>
+        <w:keepLines/>
+        <w:shd w:fill="F2F2F2" w:color="auto" w:val="clear"/>
         <w:spacing w:after="0" w:before="0"/>
         <w:ind w:left="200" w:right="200"/>
       </w:pPr>
@@ -2081,7 +2074,9 @@
     </w:p>
     <w:p>
       <w:pPr>
-        <w:shd w:fill="F5F2F9" w:color="auto" w:val="clear"/>
+        <w:keepNext/>
+        <w:keepLines/>
+        <w:shd w:fill="F2F2F2" w:color="auto" w:val="clear"/>
         <w:spacing w:after="0" w:before="0"/>
         <w:ind w:left="200" w:right="200"/>
       </w:pPr>
@@ -2096,7 +2091,9 @@
     </w:p>
     <w:p>
       <w:pPr>
-        <w:shd w:fill="F5F2F9" w:color="auto" w:val="clear"/>
+        <w:keepNext/>
+        <w:keepLines/>
+        <w:shd w:fill="F2F2F2" w:color="auto" w:val="clear"/>
         <w:spacing w:after="0" w:before="0"/>
         <w:ind w:left="200" w:right="200"/>
       </w:pPr>
@@ -2111,7 +2108,9 @@
     </w:p>
     <w:p>
       <w:pPr>
-        <w:shd w:fill="F5F2F9" w:color="auto" w:val="clear"/>
+        <w:keepNext/>
+        <w:keepLines/>
+        <w:shd w:fill="F2F2F2" w:color="auto" w:val="clear"/>
         <w:spacing w:after="0" w:before="0"/>
         <w:ind w:left="200" w:right="200"/>
       </w:pPr>
@@ -2126,7 +2125,9 @@
     </w:p>
     <w:p>
       <w:pPr>
-        <w:shd w:fill="F5F2F9" w:color="auto" w:val="clear"/>
+        <w:keepNext/>
+        <w:keepLines/>
+        <w:shd w:fill="F2F2F2" w:color="auto" w:val="clear"/>
         <w:spacing w:after="0" w:before="0"/>
         <w:ind w:left="200" w:right="200"/>
       </w:pPr>
@@ -2141,7 +2142,9 @@
     </w:p>
     <w:p>
       <w:pPr>
-        <w:shd w:fill="F5F2F9" w:color="auto" w:val="clear"/>
+        <w:keepNext/>
+        <w:keepLines/>
+        <w:shd w:fill="F2F2F2" w:color="auto" w:val="clear"/>
         <w:spacing w:after="0" w:before="0"/>
         <w:ind w:left="200" w:right="200"/>
       </w:pPr>
@@ -2156,7 +2159,9 @@
     </w:p>
     <w:p>
       <w:pPr>
-        <w:shd w:fill="F5F2F9" w:color="auto" w:val="clear"/>
+        <w:keepNext/>
+        <w:keepLines/>
+        <w:shd w:fill="F2F2F2" w:color="auto" w:val="clear"/>
         <w:spacing w:after="0" w:before="0"/>
         <w:ind w:left="200" w:right="200"/>
       </w:pPr>
@@ -2171,7 +2176,9 @@
     </w:p>
     <w:p>
       <w:pPr>
-        <w:shd w:fill="F5F2F9" w:color="auto" w:val="clear"/>
+        <w:keepNext/>
+        <w:keepLines/>
+        <w:shd w:fill="F2F2F2" w:color="auto" w:val="clear"/>
         <w:spacing w:after="0" w:before="0"/>
         <w:ind w:left="200" w:right="200"/>
       </w:pPr>
@@ -2186,7 +2193,9 @@
     </w:p>
     <w:p>
       <w:pPr>
-        <w:shd w:fill="F5F2F9" w:color="auto" w:val="clear"/>
+        <w:keepNext/>
+        <w:keepLines/>
+        <w:shd w:fill="F2F2F2" w:color="auto" w:val="clear"/>
         <w:spacing w:after="0" w:before="0"/>
         <w:ind w:left="200" w:right="200"/>
       </w:pPr>
@@ -2201,7 +2210,9 @@
     </w:p>
     <w:p>
       <w:pPr>
-        <w:shd w:fill="F5F2F9" w:color="auto" w:val="clear"/>
+        <w:keepNext/>
+        <w:keepLines/>
+        <w:shd w:fill="F2F2F2" w:color="auto" w:val="clear"/>
         <w:spacing w:after="0" w:before="0"/>
         <w:ind w:left="200" w:right="200"/>
       </w:pPr>
@@ -2216,7 +2227,9 @@
     </w:p>
     <w:p>
       <w:pPr>
-        <w:shd w:fill="F5F2F9" w:color="auto" w:val="clear"/>
+        <w:keepNext/>
+        <w:keepLines/>
+        <w:shd w:fill="F2F2F2" w:color="auto" w:val="clear"/>
         <w:spacing w:after="0" w:before="0"/>
         <w:ind w:left="200" w:right="200"/>
       </w:pPr>
@@ -2231,7 +2244,9 @@
     </w:p>
     <w:p>
       <w:pPr>
-        <w:shd w:fill="F5F2F9" w:color="auto" w:val="clear"/>
+        <w:keepNext/>
+        <w:keepLines/>
+        <w:shd w:fill="F2F2F2" w:color="auto" w:val="clear"/>
         <w:spacing w:after="0" w:before="0"/>
         <w:ind w:left="200" w:right="200"/>
       </w:pPr>
@@ -2246,7 +2261,9 @@
     </w:p>
     <w:p>
       <w:pPr>
-        <w:shd w:fill="F5F2F9" w:color="auto" w:val="clear"/>
+        <w:keepNext/>
+        <w:keepLines/>
+        <w:shd w:fill="F2F2F2" w:color="auto" w:val="clear"/>
         <w:spacing w:after="0" w:before="0"/>
         <w:ind w:left="200" w:right="200"/>
       </w:pPr>
@@ -2261,7 +2278,9 @@
     </w:p>
     <w:p>
       <w:pPr>
-        <w:shd w:fill="F5F2F9" w:color="auto" w:val="clear"/>
+        <w:keepNext/>
+        <w:keepLines/>
+        <w:shd w:fill="F2F2F2" w:color="auto" w:val="clear"/>
         <w:spacing w:after="0" w:before="0"/>
         <w:ind w:left="200" w:right="200"/>
       </w:pPr>
@@ -2276,7 +2295,9 @@
     </w:p>
     <w:p>
       <w:pPr>
-        <w:shd w:fill="F5F2F9" w:color="auto" w:val="clear"/>
+        <w:keepNext/>
+        <w:keepLines/>
+        <w:shd w:fill="F2F2F2" w:color="auto" w:val="clear"/>
         <w:spacing w:after="0" w:before="0"/>
         <w:ind w:left="200" w:right="200"/>
       </w:pPr>
@@ -2291,7 +2312,9 @@
     </w:p>
     <w:p>
       <w:pPr>
-        <w:shd w:fill="F5F2F9" w:color="auto" w:val="clear"/>
+        <w:keepNext/>
+        <w:keepLines/>
+        <w:shd w:fill="F2F2F2" w:color="auto" w:val="clear"/>
         <w:spacing w:after="0" w:before="0"/>
         <w:ind w:left="200" w:right="200"/>
       </w:pPr>
@@ -2306,7 +2329,9 @@
     </w:p>
     <w:p>
       <w:pPr>
-        <w:shd w:fill="F5F2F9" w:color="auto" w:val="clear"/>
+        <w:keepNext/>
+        <w:keepLines/>
+        <w:shd w:fill="F2F2F2" w:color="auto" w:val="clear"/>
         <w:spacing w:after="0" w:before="0"/>
         <w:ind w:left="200" w:right="200"/>
       </w:pPr>
@@ -2321,7 +2346,9 @@
     </w:p>
     <w:p>
       <w:pPr>
-        <w:shd w:fill="F5F2F9" w:color="auto" w:val="clear"/>
+        <w:keepNext w:val="false"/>
+        <w:keepLines/>
+        <w:shd w:fill="F2F2F2" w:color="auto" w:val="clear"/>
         <w:spacing w:after="0" w:before="0"/>
         <w:ind w:left="200" w:right="200"/>
       </w:pPr>
@@ -2337,6 +2364,7 @@
     <w:p>
       <w:pPr>
         <w:pStyle w:val="Heading2"/>
+        <w:keepNext/>
         <w:spacing w:after="80" w:before="200"/>
       </w:pPr>
       <w:r>
@@ -2559,6 +2587,7 @@
     <w:p>
       <w:pPr>
         <w:pStyle w:val="Heading2"/>
+        <w:keepNext/>
         <w:spacing w:after="80" w:before="200"/>
       </w:pPr>
       <w:r>
@@ -2609,12 +2638,12 @@
           <w:tcPr>
             <w:tcW w:type="dxa" w:w="3000"/>
             <w:tcBorders>
-              <w:top w:val="single" w:color="DCD7E3" w:sz="4"/>
-              <w:left w:val="single" w:color="DCD7E3" w:sz="4"/>
-              <w:bottom w:val="single" w:color="DCD7E3" w:sz="4"/>
-              <w:right w:val="single" w:color="DCD7E3" w:sz="4"/>
-            </w:tcBorders>
-            <w:shd w:fill="6F2FA0" w:color="auto" w:val="clear"/>
+              <w:top w:val="single" w:color="999999" w:sz="4"/>
+              <w:left w:val="single" w:color="999999" w:sz="4"/>
+              <w:bottom w:val="single" w:color="999999" w:sz="4"/>
+              <w:right w:val="single" w:color="999999" w:sz="4"/>
+            </w:tcBorders>
+            <w:shd w:fill="E6E6E6" w:color="auto" w:val="clear"/>
             <w:tcMar>
               <w:top w:type="dxa" w:w="35"/>
               <w:left w:type="dxa" w:w="90"/>
@@ -2627,7 +2656,7 @@
               <w:rPr>
                 <w:b/>
                 <w:bCs/>
-                <w:color w:val="FFFFFF"/>
+                <w:color w:val="000000"/>
                 <w:sz w:val="19"/>
                 <w:szCs w:val="19"/>
               </w:rPr>
@@ -2639,12 +2668,12 @@
           <w:tcPr>
             <w:tcW w:type="dxa" w:w="1000"/>
             <w:tcBorders>
-              <w:top w:val="single" w:color="DCD7E3" w:sz="4"/>
-              <w:left w:val="single" w:color="DCD7E3" w:sz="4"/>
-              <w:bottom w:val="single" w:color="DCD7E3" w:sz="4"/>
-              <w:right w:val="single" w:color="DCD7E3" w:sz="4"/>
-            </w:tcBorders>
-            <w:shd w:fill="6F2FA0" w:color="auto" w:val="clear"/>
+              <w:top w:val="single" w:color="999999" w:sz="4"/>
+              <w:left w:val="single" w:color="999999" w:sz="4"/>
+              <w:bottom w:val="single" w:color="999999" w:sz="4"/>
+              <w:right w:val="single" w:color="999999" w:sz="4"/>
+            </w:tcBorders>
+            <w:shd w:fill="E6E6E6" w:color="auto" w:val="clear"/>
             <w:tcMar>
               <w:top w:type="dxa" w:w="35"/>
               <w:left w:type="dxa" w:w="90"/>
@@ -2657,7 +2686,7 @@
               <w:rPr>
                 <w:b/>
                 <w:bCs/>
-                <w:color w:val="FFFFFF"/>
+                <w:color w:val="000000"/>
                 <w:sz w:val="19"/>
                 <w:szCs w:val="19"/>
               </w:rPr>
@@ -2669,12 +2698,12 @@
           <w:tcPr>
             <w:tcW w:type="dxa" w:w="5638"/>
             <w:tcBorders>
-              <w:top w:val="single" w:color="DCD7E3" w:sz="4"/>
-              <w:left w:val="single" w:color="DCD7E3" w:sz="4"/>
-              <w:bottom w:val="single" w:color="DCD7E3" w:sz="4"/>
-              <w:right w:val="single" w:color="DCD7E3" w:sz="4"/>
-            </w:tcBorders>
-            <w:shd w:fill="6F2FA0" w:color="auto" w:val="clear"/>
+              <w:top w:val="single" w:color="999999" w:sz="4"/>
+              <w:left w:val="single" w:color="999999" w:sz="4"/>
+              <w:bottom w:val="single" w:color="999999" w:sz="4"/>
+              <w:right w:val="single" w:color="999999" w:sz="4"/>
+            </w:tcBorders>
+            <w:shd w:fill="E6E6E6" w:color="auto" w:val="clear"/>
             <w:tcMar>
               <w:top w:type="dxa" w:w="35"/>
               <w:left w:type="dxa" w:w="90"/>
@@ -2687,7 +2716,7 @@
               <w:rPr>
                 <w:b/>
                 <w:bCs/>
-                <w:color w:val="FFFFFF"/>
+                <w:color w:val="000000"/>
                 <w:sz w:val="19"/>
                 <w:szCs w:val="19"/>
               </w:rPr>
@@ -2701,10 +2730,10 @@
           <w:tcPr>
             <w:tcW w:type="dxa" w:w="3000"/>
             <w:tcBorders>
-              <w:top w:val="single" w:color="DCD7E3" w:sz="4"/>
-              <w:left w:val="single" w:color="DCD7E3" w:sz="4"/>
-              <w:bottom w:val="single" w:color="DCD7E3" w:sz="4"/>
-              <w:right w:val="single" w:color="DCD7E3" w:sz="4"/>
+              <w:top w:val="single" w:color="999999" w:sz="4"/>
+              <w:left w:val="single" w:color="999999" w:sz="4"/>
+              <w:bottom w:val="single" w:color="999999" w:sz="4"/>
+              <w:right w:val="single" w:color="999999" w:sz="4"/>
             </w:tcBorders>
             <w:tcMar>
               <w:top w:type="dxa" w:w="35"/>
@@ -2723,10 +2752,10 @@
           <w:tcPr>
             <w:tcW w:type="dxa" w:w="1000"/>
             <w:tcBorders>
-              <w:top w:val="single" w:color="DCD7E3" w:sz="4"/>
-              <w:left w:val="single" w:color="DCD7E3" w:sz="4"/>
-              <w:bottom w:val="single" w:color="DCD7E3" w:sz="4"/>
-              <w:right w:val="single" w:color="DCD7E3" w:sz="4"/>
+              <w:top w:val="single" w:color="999999" w:sz="4"/>
+              <w:left w:val="single" w:color="999999" w:sz="4"/>
+              <w:bottom w:val="single" w:color="999999" w:sz="4"/>
+              <w:right w:val="single" w:color="999999" w:sz="4"/>
             </w:tcBorders>
             <w:tcMar>
               <w:top w:type="dxa" w:w="35"/>
@@ -2745,10 +2774,10 @@
           <w:tcPr>
             <w:tcW w:type="dxa" w:w="5638"/>
             <w:tcBorders>
-              <w:top w:val="single" w:color="DCD7E3" w:sz="4"/>
-              <w:left w:val="single" w:color="DCD7E3" w:sz="4"/>
-              <w:bottom w:val="single" w:color="DCD7E3" w:sz="4"/>
-              <w:right w:val="single" w:color="DCD7E3" w:sz="4"/>
+              <w:top w:val="single" w:color="999999" w:sz="4"/>
+              <w:left w:val="single" w:color="999999" w:sz="4"/>
+              <w:bottom w:val="single" w:color="999999" w:sz="4"/>
+              <w:right w:val="single" w:color="999999" w:sz="4"/>
             </w:tcBorders>
             <w:tcMar>
               <w:top w:type="dxa" w:w="35"/>
@@ -2769,10 +2798,10 @@
           <w:tcPr>
             <w:tcW w:type="dxa" w:w="3000"/>
             <w:tcBorders>
-              <w:top w:val="single" w:color="DCD7E3" w:sz="4"/>
-              <w:left w:val="single" w:color="DCD7E3" w:sz="4"/>
-              <w:bottom w:val="single" w:color="DCD7E3" w:sz="4"/>
-              <w:right w:val="single" w:color="DCD7E3" w:sz="4"/>
+              <w:top w:val="single" w:color="999999" w:sz="4"/>
+              <w:left w:val="single" w:color="999999" w:sz="4"/>
+              <w:bottom w:val="single" w:color="999999" w:sz="4"/>
+              <w:right w:val="single" w:color="999999" w:sz="4"/>
             </w:tcBorders>
             <w:tcMar>
               <w:top w:type="dxa" w:w="35"/>
@@ -2791,10 +2820,10 @@
           <w:tcPr>
             <w:tcW w:type="dxa" w:w="1000"/>
             <w:tcBorders>
-              <w:top w:val="single" w:color="DCD7E3" w:sz="4"/>
-              <w:left w:val="single" w:color="DCD7E3" w:sz="4"/>
-              <w:bottom w:val="single" w:color="DCD7E3" w:sz="4"/>
-              <w:right w:val="single" w:color="DCD7E3" w:sz="4"/>
+              <w:top w:val="single" w:color="999999" w:sz="4"/>
+              <w:left w:val="single" w:color="999999" w:sz="4"/>
+              <w:bottom w:val="single" w:color="999999" w:sz="4"/>
+              <w:right w:val="single" w:color="999999" w:sz="4"/>
             </w:tcBorders>
             <w:tcMar>
               <w:top w:type="dxa" w:w="35"/>
@@ -2813,10 +2842,10 @@
           <w:tcPr>
             <w:tcW w:type="dxa" w:w="5638"/>
             <w:tcBorders>
-              <w:top w:val="single" w:color="DCD7E3" w:sz="4"/>
-              <w:left w:val="single" w:color="DCD7E3" w:sz="4"/>
-              <w:bottom w:val="single" w:color="DCD7E3" w:sz="4"/>
-              <w:right w:val="single" w:color="DCD7E3" w:sz="4"/>
+              <w:top w:val="single" w:color="999999" w:sz="4"/>
+              <w:left w:val="single" w:color="999999" w:sz="4"/>
+              <w:bottom w:val="single" w:color="999999" w:sz="4"/>
+              <w:right w:val="single" w:color="999999" w:sz="4"/>
             </w:tcBorders>
             <w:tcMar>
               <w:top w:type="dxa" w:w="35"/>
@@ -2837,10 +2866,10 @@
           <w:tcPr>
             <w:tcW w:type="dxa" w:w="3000"/>
             <w:tcBorders>
-              <w:top w:val="single" w:color="DCD7E3" w:sz="4"/>
-              <w:left w:val="single" w:color="DCD7E3" w:sz="4"/>
-              <w:bottom w:val="single" w:color="DCD7E3" w:sz="4"/>
-              <w:right w:val="single" w:color="DCD7E3" w:sz="4"/>
+              <w:top w:val="single" w:color="999999" w:sz="4"/>
+              <w:left w:val="single" w:color="999999" w:sz="4"/>
+              <w:bottom w:val="single" w:color="999999" w:sz="4"/>
+              <w:right w:val="single" w:color="999999" w:sz="4"/>
             </w:tcBorders>
             <w:tcMar>
               <w:top w:type="dxa" w:w="35"/>
@@ -2859,10 +2888,10 @@
           <w:tcPr>
             <w:tcW w:type="dxa" w:w="1000"/>
             <w:tcBorders>
-              <w:top w:val="single" w:color="DCD7E3" w:sz="4"/>
-              <w:left w:val="single" w:color="DCD7E3" w:sz="4"/>
-              <w:bottom w:val="single" w:color="DCD7E3" w:sz="4"/>
-              <w:right w:val="single" w:color="DCD7E3" w:sz="4"/>
+              <w:top w:val="single" w:color="999999" w:sz="4"/>
+              <w:left w:val="single" w:color="999999" w:sz="4"/>
+              <w:bottom w:val="single" w:color="999999" w:sz="4"/>
+              <w:right w:val="single" w:color="999999" w:sz="4"/>
             </w:tcBorders>
             <w:tcMar>
               <w:top w:type="dxa" w:w="35"/>
@@ -2881,10 +2910,10 @@
           <w:tcPr>
             <w:tcW w:type="dxa" w:w="5638"/>
             <w:tcBorders>
-              <w:top w:val="single" w:color="DCD7E3" w:sz="4"/>
-              <w:left w:val="single" w:color="DCD7E3" w:sz="4"/>
-              <w:bottom w:val="single" w:color="DCD7E3" w:sz="4"/>
-              <w:right w:val="single" w:color="DCD7E3" w:sz="4"/>
+              <w:top w:val="single" w:color="999999" w:sz="4"/>
+              <w:left w:val="single" w:color="999999" w:sz="4"/>
+              <w:bottom w:val="single" w:color="999999" w:sz="4"/>
+              <w:right w:val="single" w:color="999999" w:sz="4"/>
             </w:tcBorders>
             <w:tcMar>
               <w:top w:type="dxa" w:w="35"/>
@@ -2905,10 +2934,10 @@
           <w:tcPr>
             <w:tcW w:type="dxa" w:w="3000"/>
             <w:tcBorders>
-              <w:top w:val="single" w:color="DCD7E3" w:sz="4"/>
-              <w:left w:val="single" w:color="DCD7E3" w:sz="4"/>
-              <w:bottom w:val="single" w:color="DCD7E3" w:sz="4"/>
-              <w:right w:val="single" w:color="DCD7E3" w:sz="4"/>
+              <w:top w:val="single" w:color="999999" w:sz="4"/>
+              <w:left w:val="single" w:color="999999" w:sz="4"/>
+              <w:bottom w:val="single" w:color="999999" w:sz="4"/>
+              <w:right w:val="single" w:color="999999" w:sz="4"/>
             </w:tcBorders>
             <w:tcMar>
               <w:top w:type="dxa" w:w="35"/>
@@ -2927,10 +2956,10 @@
           <w:tcPr>
             <w:tcW w:type="dxa" w:w="1000"/>
             <w:tcBorders>
-              <w:top w:val="single" w:color="DCD7E3" w:sz="4"/>
-              <w:left w:val="single" w:color="DCD7E3" w:sz="4"/>
-              <w:bottom w:val="single" w:color="DCD7E3" w:sz="4"/>
-              <w:right w:val="single" w:color="DCD7E3" w:sz="4"/>
+              <w:top w:val="single" w:color="999999" w:sz="4"/>
+              <w:left w:val="single" w:color="999999" w:sz="4"/>
+              <w:bottom w:val="single" w:color="999999" w:sz="4"/>
+              <w:right w:val="single" w:color="999999" w:sz="4"/>
             </w:tcBorders>
             <w:tcMar>
               <w:top w:type="dxa" w:w="35"/>
@@ -2949,10 +2978,10 @@
           <w:tcPr>
             <w:tcW w:type="dxa" w:w="5638"/>
             <w:tcBorders>
-              <w:top w:val="single" w:color="DCD7E3" w:sz="4"/>
-              <w:left w:val="single" w:color="DCD7E3" w:sz="4"/>
-              <w:bottom w:val="single" w:color="DCD7E3" w:sz="4"/>
-              <w:right w:val="single" w:color="DCD7E3" w:sz="4"/>
+              <w:top w:val="single" w:color="999999" w:sz="4"/>
+              <w:left w:val="single" w:color="999999" w:sz="4"/>
+              <w:bottom w:val="single" w:color="999999" w:sz="4"/>
+              <w:right w:val="single" w:color="999999" w:sz="4"/>
             </w:tcBorders>
             <w:tcMar>
               <w:top w:type="dxa" w:w="35"/>
@@ -2973,10 +3002,10 @@
           <w:tcPr>
             <w:tcW w:type="dxa" w:w="3000"/>
             <w:tcBorders>
-              <w:top w:val="single" w:color="DCD7E3" w:sz="4"/>
-              <w:left w:val="single" w:color="DCD7E3" w:sz="4"/>
-              <w:bottom w:val="single" w:color="DCD7E3" w:sz="4"/>
-              <w:right w:val="single" w:color="DCD7E3" w:sz="4"/>
+              <w:top w:val="single" w:color="999999" w:sz="4"/>
+              <w:left w:val="single" w:color="999999" w:sz="4"/>
+              <w:bottom w:val="single" w:color="999999" w:sz="4"/>
+              <w:right w:val="single" w:color="999999" w:sz="4"/>
             </w:tcBorders>
             <w:tcMar>
               <w:top w:type="dxa" w:w="35"/>
@@ -2995,10 +3024,10 @@
           <w:tcPr>
             <w:tcW w:type="dxa" w:w="1000"/>
             <w:tcBorders>
-              <w:top w:val="single" w:color="DCD7E3" w:sz="4"/>
-              <w:left w:val="single" w:color="DCD7E3" w:sz="4"/>
-              <w:bottom w:val="single" w:color="DCD7E3" w:sz="4"/>
-              <w:right w:val="single" w:color="DCD7E3" w:sz="4"/>
+              <w:top w:val="single" w:color="999999" w:sz="4"/>
+              <w:left w:val="single" w:color="999999" w:sz="4"/>
+              <w:bottom w:val="single" w:color="999999" w:sz="4"/>
+              <w:right w:val="single" w:color="999999" w:sz="4"/>
             </w:tcBorders>
             <w:tcMar>
               <w:top w:type="dxa" w:w="35"/>
@@ -3017,10 +3046,10 @@
           <w:tcPr>
             <w:tcW w:type="dxa" w:w="5638"/>
             <w:tcBorders>
-              <w:top w:val="single" w:color="DCD7E3" w:sz="4"/>
-              <w:left w:val="single" w:color="DCD7E3" w:sz="4"/>
-              <w:bottom w:val="single" w:color="DCD7E3" w:sz="4"/>
-              <w:right w:val="single" w:color="DCD7E3" w:sz="4"/>
+              <w:top w:val="single" w:color="999999" w:sz="4"/>
+              <w:left w:val="single" w:color="999999" w:sz="4"/>
+              <w:bottom w:val="single" w:color="999999" w:sz="4"/>
+              <w:right w:val="single" w:color="999999" w:sz="4"/>
             </w:tcBorders>
             <w:tcMar>
               <w:top w:type="dxa" w:w="35"/>
@@ -3041,10 +3070,10 @@
           <w:tcPr>
             <w:tcW w:type="dxa" w:w="3000"/>
             <w:tcBorders>
-              <w:top w:val="single" w:color="DCD7E3" w:sz="4"/>
-              <w:left w:val="single" w:color="DCD7E3" w:sz="4"/>
-              <w:bottom w:val="single" w:color="DCD7E3" w:sz="4"/>
-              <w:right w:val="single" w:color="DCD7E3" w:sz="4"/>
+              <w:top w:val="single" w:color="999999" w:sz="4"/>
+              <w:left w:val="single" w:color="999999" w:sz="4"/>
+              <w:bottom w:val="single" w:color="999999" w:sz="4"/>
+              <w:right w:val="single" w:color="999999" w:sz="4"/>
             </w:tcBorders>
             <w:tcMar>
               <w:top w:type="dxa" w:w="35"/>
@@ -3063,10 +3092,10 @@
           <w:tcPr>
             <w:tcW w:type="dxa" w:w="1000"/>
             <w:tcBorders>
-              <w:top w:val="single" w:color="DCD7E3" w:sz="4"/>
-              <w:left w:val="single" w:color="DCD7E3" w:sz="4"/>
-              <w:bottom w:val="single" w:color="DCD7E3" w:sz="4"/>
-              <w:right w:val="single" w:color="DCD7E3" w:sz="4"/>
+              <w:top w:val="single" w:color="999999" w:sz="4"/>
+              <w:left w:val="single" w:color="999999" w:sz="4"/>
+              <w:bottom w:val="single" w:color="999999" w:sz="4"/>
+              <w:right w:val="single" w:color="999999" w:sz="4"/>
             </w:tcBorders>
             <w:tcMar>
               <w:top w:type="dxa" w:w="35"/>
@@ -3085,10 +3114,10 @@
           <w:tcPr>
             <w:tcW w:type="dxa" w:w="5638"/>
             <w:tcBorders>
-              <w:top w:val="single" w:color="DCD7E3" w:sz="4"/>
-              <w:left w:val="single" w:color="DCD7E3" w:sz="4"/>
-              <w:bottom w:val="single" w:color="DCD7E3" w:sz="4"/>
-              <w:right w:val="single" w:color="DCD7E3" w:sz="4"/>
+              <w:top w:val="single" w:color="999999" w:sz="4"/>
+              <w:left w:val="single" w:color="999999" w:sz="4"/>
+              <w:bottom w:val="single" w:color="999999" w:sz="4"/>
+              <w:right w:val="single" w:color="999999" w:sz="4"/>
             </w:tcBorders>
             <w:tcMar>
               <w:top w:type="dxa" w:w="35"/>
@@ -3108,6 +3137,7 @@
     <w:p>
       <w:pPr>
         <w:pStyle w:val="Heading2"/>
+        <w:keepNext/>
         <w:spacing w:after="80" w:before="200"/>
       </w:pPr>
       <w:r>
@@ -3197,6 +3227,7 @@
     <w:p>
       <w:pPr>
         <w:pStyle w:val="Heading2"/>
+        <w:keepNext/>
         <w:spacing w:after="80" w:before="200"/>
       </w:pPr>
       <w:r>
@@ -3630,7 +3661,7 @@
       <w:rFonts w:ascii="Arial" w:cs="Arial" w:eastAsia="Arial" w:hAnsi="Arial"/>
       <w:b/>
       <w:bCs/>
-      <w:color w:val="6F2FA0"/>
+      <w:color w:val="000000"/>
       <w:sz w:val="36"/>
       <w:szCs w:val="36"/>
     </w:rPr>
@@ -3647,7 +3678,7 @@
       <w:rFonts w:ascii="Arial" w:cs="Arial" w:eastAsia="Arial" w:hAnsi="Arial"/>
       <w:b/>
       <w:bCs/>
-      <w:color w:val="6F2FA0"/>
+      <w:color w:val="000000"/>
       <w:sz w:val="25"/>
       <w:szCs w:val="25"/>
     </w:rPr>

</xml_diff>